<commit_message>
Documento madre regenerado con enlaces de GitHub; números de issue en capítulos [IA: Claude]
Co-Authored-By: Claude Opus 5.5 <noreply@anthropic.com>
</commit_message>
<xml_diff>
--- a/00_DOCUMENTO_MADRE.docx
+++ b/00_DOCUMENTO_MADRE.docx
@@ -456,7 +456,7 @@
               <w:rPr>
                 <w:sz w:val="19"/>
               </w:rPr>
-              <w:t>2026-10-11 · Informe 00 — Línea de partida</w:t>
+              <w:t>2026-10-11 · Cambio de enfoque: documentos para personas</w:t>
             </w:r>
           </w:p>
         </w:tc>
@@ -528,16 +528,16 @@
         </w:tblBorders>
       </w:tblPr>
       <w:tblGrid>
-        <w:gridCol w:w="1134"/>
-        <w:gridCol w:w="3742"/>
+        <w:gridCol w:w="1191"/>
+        <w:gridCol w:w="3628"/>
         <w:gridCol w:w="907"/>
-        <w:gridCol w:w="2608"/>
-        <w:gridCol w:w="1020"/>
+        <w:gridCol w:w="2438"/>
+        <w:gridCol w:w="1247"/>
       </w:tblGrid>
       <w:tr>
         <w:tc>
           <w:tcPr>
-            <w:tcW w:type="dxa" w:w="1134"/>
+            <w:tcW w:type="dxa" w:w="1191"/>
             <w:shd w:val="clear" w:color="auto" w:fill="0B1F3A"/>
           </w:tcPr>
           <w:p>
@@ -558,7 +558,7 @@
         </w:tc>
         <w:tc>
           <w:tcPr>
-            <w:tcW w:type="dxa" w:w="3742"/>
+            <w:tcW w:type="dxa" w:w="3628"/>
             <w:shd w:val="clear" w:color="auto" w:fill="0B1F3A"/>
           </w:tcPr>
           <w:p>
@@ -600,7 +600,7 @@
         </w:tc>
         <w:tc>
           <w:tcPr>
-            <w:tcW w:type="dxa" w:w="2608"/>
+            <w:tcW w:type="dxa" w:w="2438"/>
             <w:shd w:val="clear" w:color="auto" w:fill="0B1F3A"/>
           </w:tcPr>
           <w:p>
@@ -621,7 +621,7 @@
         </w:tc>
         <w:tc>
           <w:tcPr>
-            <w:tcW w:type="dxa" w:w="1020"/>
+            <w:tcW w:type="dxa" w:w="1247"/>
             <w:shd w:val="clear" w:color="auto" w:fill="0B1F3A"/>
           </w:tcPr>
           <w:p>
@@ -644,28 +644,28 @@
       <w:tr>
         <w:tc>
           <w:tcPr>
-            <w:tcW w:type="dxa" w:w="1134"/>
-          </w:tcPr>
-          <w:p>
-            <w:pPr>
-              <w:spacing w:after="20"/>
-            </w:pPr>
-            <w:r>
-              <w:rPr>
-                <w:sz w:val="19"/>
-              </w:rPr>
-            </w:r>
-            <w:r>
-              <w:rPr>
-                <w:sz w:val="19"/>
-              </w:rPr>
-              <w:t>Mon 12-Oct</w:t>
-            </w:r>
-          </w:p>
-        </w:tc>
-        <w:tc>
-          <w:tcPr>
-            <w:tcW w:type="dxa" w:w="3742"/>
+            <w:tcW w:type="dxa" w:w="1191"/>
+          </w:tcPr>
+          <w:p>
+            <w:pPr>
+              <w:spacing w:after="20"/>
+            </w:pPr>
+            <w:r>
+              <w:rPr>
+                <w:sz w:val="19"/>
+              </w:rPr>
+            </w:r>
+            <w:r>
+              <w:rPr>
+                <w:sz w:val="19"/>
+              </w:rPr>
+              <w:t>lun 12-oct</w:t>
+            </w:r>
+          </w:p>
+        </w:tc>
+        <w:tc>
+          <w:tcPr>
+            <w:tcW w:type="dxa" w:w="3628"/>
           </w:tcPr>
           <w:p>
             <w:pPr>
@@ -707,7 +707,7 @@
         </w:tc>
         <w:tc>
           <w:tcPr>
-            <w:tcW w:type="dxa" w:w="2608"/>
+            <w:tcW w:type="dxa" w:w="2438"/>
           </w:tcPr>
           <w:p>
             <w:pPr>
@@ -728,7 +728,7 @@
         </w:tc>
         <w:tc>
           <w:tcPr>
-            <w:tcW w:type="dxa" w:w="1020"/>
+            <w:tcW w:type="dxa" w:w="1247"/>
           </w:tcPr>
           <w:p>
             <w:pPr>
@@ -751,7 +751,7 @@
       <w:tr>
         <w:tc>
           <w:tcPr>
-            <w:tcW w:type="dxa" w:w="1134"/>
+            <w:tcW w:type="dxa" w:w="1191"/>
             <w:shd w:val="clear" w:color="auto" w:fill="EEF2F7"/>
           </w:tcPr>
           <w:p>
@@ -767,13 +767,13 @@
               <w:rPr>
                 <w:sz w:val="19"/>
               </w:rPr>
-              <w:t>Mon 12-Oct</w:t>
-            </w:r>
-          </w:p>
-        </w:tc>
-        <w:tc>
-          <w:tcPr>
-            <w:tcW w:type="dxa" w:w="3742"/>
+              <w:t>lun 12-oct</w:t>
+            </w:r>
+          </w:p>
+        </w:tc>
+        <w:tc>
+          <w:tcPr>
+            <w:tcW w:type="dxa" w:w="3628"/>
             <w:shd w:val="clear" w:color="auto" w:fill="EEF2F7"/>
           </w:tcPr>
           <w:p>
@@ -817,7 +817,7 @@
         </w:tc>
         <w:tc>
           <w:tcPr>
-            <w:tcW w:type="dxa" w:w="2608"/>
+            <w:tcW w:type="dxa" w:w="2438"/>
             <w:shd w:val="clear" w:color="auto" w:fill="EEF2F7"/>
           </w:tcPr>
           <w:p>
@@ -839,7 +839,7 @@
         </w:tc>
         <w:tc>
           <w:tcPr>
-            <w:tcW w:type="dxa" w:w="1020"/>
+            <w:tcW w:type="dxa" w:w="1247"/>
             <w:shd w:val="clear" w:color="auto" w:fill="EEF2F7"/>
           </w:tcPr>
           <w:p>
@@ -863,28 +863,28 @@
       <w:tr>
         <w:tc>
           <w:tcPr>
-            <w:tcW w:type="dxa" w:w="1134"/>
-          </w:tcPr>
-          <w:p>
-            <w:pPr>
-              <w:spacing w:after="20"/>
-            </w:pPr>
-            <w:r>
-              <w:rPr>
-                <w:sz w:val="19"/>
-              </w:rPr>
-            </w:r>
-            <w:r>
-              <w:rPr>
-                <w:sz w:val="19"/>
-              </w:rPr>
-              <w:t>Mon 12-Oct</w:t>
-            </w:r>
-          </w:p>
-        </w:tc>
-        <w:tc>
-          <w:tcPr>
-            <w:tcW w:type="dxa" w:w="3742"/>
+            <w:tcW w:type="dxa" w:w="1191"/>
+          </w:tcPr>
+          <w:p>
+            <w:pPr>
+              <w:spacing w:after="20"/>
+            </w:pPr>
+            <w:r>
+              <w:rPr>
+                <w:sz w:val="19"/>
+              </w:rPr>
+            </w:r>
+            <w:r>
+              <w:rPr>
+                <w:sz w:val="19"/>
+              </w:rPr>
+              <w:t>lun 12-oct</w:t>
+            </w:r>
+          </w:p>
+        </w:tc>
+        <w:tc>
+          <w:tcPr>
+            <w:tcW w:type="dxa" w:w="3628"/>
           </w:tcPr>
           <w:p>
             <w:pPr>
@@ -926,7 +926,7 @@
         </w:tc>
         <w:tc>
           <w:tcPr>
-            <w:tcW w:type="dxa" w:w="2608"/>
+            <w:tcW w:type="dxa" w:w="2438"/>
           </w:tcPr>
           <w:p>
             <w:pPr>
@@ -947,7 +947,7 @@
         </w:tc>
         <w:tc>
           <w:tcPr>
-            <w:tcW w:type="dxa" w:w="1020"/>
+            <w:tcW w:type="dxa" w:w="1247"/>
           </w:tcPr>
           <w:p>
             <w:pPr>
@@ -970,7 +970,7 @@
       <w:tr>
         <w:tc>
           <w:tcPr>
-            <w:tcW w:type="dxa" w:w="1134"/>
+            <w:tcW w:type="dxa" w:w="1191"/>
             <w:shd w:val="clear" w:color="auto" w:fill="EEF2F7"/>
           </w:tcPr>
           <w:p>
@@ -986,13 +986,13 @@
               <w:rPr>
                 <w:sz w:val="19"/>
               </w:rPr>
-              <w:t>Mon 12-Oct</w:t>
-            </w:r>
-          </w:p>
-        </w:tc>
-        <w:tc>
-          <w:tcPr>
-            <w:tcW w:type="dxa" w:w="3742"/>
+              <w:t>lun 12-oct</w:t>
+            </w:r>
+          </w:p>
+        </w:tc>
+        <w:tc>
+          <w:tcPr>
+            <w:tcW w:type="dxa" w:w="3628"/>
             <w:shd w:val="clear" w:color="auto" w:fill="EEF2F7"/>
           </w:tcPr>
           <w:p>
@@ -1036,7 +1036,7 @@
         </w:tc>
         <w:tc>
           <w:tcPr>
-            <w:tcW w:type="dxa" w:w="2608"/>
+            <w:tcW w:type="dxa" w:w="2438"/>
             <w:shd w:val="clear" w:color="auto" w:fill="EEF2F7"/>
           </w:tcPr>
           <w:p>
@@ -1058,7 +1058,7 @@
         </w:tc>
         <w:tc>
           <w:tcPr>
-            <w:tcW w:type="dxa" w:w="1020"/>
+            <w:tcW w:type="dxa" w:w="1247"/>
             <w:shd w:val="clear" w:color="auto" w:fill="EEF2F7"/>
           </w:tcPr>
           <w:p>
@@ -1082,28 +1082,28 @@
       <w:tr>
         <w:tc>
           <w:tcPr>
-            <w:tcW w:type="dxa" w:w="1134"/>
-          </w:tcPr>
-          <w:p>
-            <w:pPr>
-              <w:spacing w:after="20"/>
-            </w:pPr>
-            <w:r>
-              <w:rPr>
-                <w:sz w:val="19"/>
-              </w:rPr>
-            </w:r>
-            <w:r>
-              <w:rPr>
-                <w:sz w:val="19"/>
-              </w:rPr>
-              <w:t>Mon 12-Oct</w:t>
-            </w:r>
-          </w:p>
-        </w:tc>
-        <w:tc>
-          <w:tcPr>
-            <w:tcW w:type="dxa" w:w="3742"/>
+            <w:tcW w:type="dxa" w:w="1191"/>
+          </w:tcPr>
+          <w:p>
+            <w:pPr>
+              <w:spacing w:after="20"/>
+            </w:pPr>
+            <w:r>
+              <w:rPr>
+                <w:sz w:val="19"/>
+              </w:rPr>
+            </w:r>
+            <w:r>
+              <w:rPr>
+                <w:sz w:val="19"/>
+              </w:rPr>
+              <w:t>lun 12-oct</w:t>
+            </w:r>
+          </w:p>
+        </w:tc>
+        <w:tc>
+          <w:tcPr>
+            <w:tcW w:type="dxa" w:w="3628"/>
           </w:tcPr>
           <w:p>
             <w:pPr>
@@ -1145,7 +1145,7 @@
         </w:tc>
         <w:tc>
           <w:tcPr>
-            <w:tcW w:type="dxa" w:w="2608"/>
+            <w:tcW w:type="dxa" w:w="2438"/>
           </w:tcPr>
           <w:p>
             <w:pPr>
@@ -1166,7 +1166,7 @@
         </w:tc>
         <w:tc>
           <w:tcPr>
-            <w:tcW w:type="dxa" w:w="1020"/>
+            <w:tcW w:type="dxa" w:w="1247"/>
           </w:tcPr>
           <w:p>
             <w:pPr>
@@ -1189,7 +1189,7 @@
       <w:tr>
         <w:tc>
           <w:tcPr>
-            <w:tcW w:type="dxa" w:w="1134"/>
+            <w:tcW w:type="dxa" w:w="1191"/>
             <w:shd w:val="clear" w:color="auto" w:fill="EEF2F7"/>
           </w:tcPr>
           <w:p>
@@ -1205,13 +1205,13 @@
               <w:rPr>
                 <w:sz w:val="19"/>
               </w:rPr>
-              <w:t>Tue 13-Oct</w:t>
-            </w:r>
-          </w:p>
-        </w:tc>
-        <w:tc>
-          <w:tcPr>
-            <w:tcW w:type="dxa" w:w="3742"/>
+              <w:t>mar 13-oct</w:t>
+            </w:r>
+          </w:p>
+        </w:tc>
+        <w:tc>
+          <w:tcPr>
+            <w:tcW w:type="dxa" w:w="3628"/>
             <w:shd w:val="clear" w:color="auto" w:fill="EEF2F7"/>
           </w:tcPr>
           <w:p>
@@ -1255,7 +1255,7 @@
         </w:tc>
         <w:tc>
           <w:tcPr>
-            <w:tcW w:type="dxa" w:w="2608"/>
+            <w:tcW w:type="dxa" w:w="2438"/>
             <w:shd w:val="clear" w:color="auto" w:fill="EEF2F7"/>
           </w:tcPr>
           <w:p>
@@ -1277,7 +1277,7 @@
         </w:tc>
         <w:tc>
           <w:tcPr>
-            <w:tcW w:type="dxa" w:w="1020"/>
+            <w:tcW w:type="dxa" w:w="1247"/>
             <w:shd w:val="clear" w:color="auto" w:fill="EEF2F7"/>
           </w:tcPr>
           <w:p>
@@ -1301,28 +1301,28 @@
       <w:tr>
         <w:tc>
           <w:tcPr>
-            <w:tcW w:type="dxa" w:w="1134"/>
-          </w:tcPr>
-          <w:p>
-            <w:pPr>
-              <w:spacing w:after="20"/>
-            </w:pPr>
-            <w:r>
-              <w:rPr>
-                <w:sz w:val="19"/>
-              </w:rPr>
-            </w:r>
-            <w:r>
-              <w:rPr>
-                <w:sz w:val="19"/>
-              </w:rPr>
-              <w:t>Tue 13-Oct</w:t>
-            </w:r>
-          </w:p>
-        </w:tc>
-        <w:tc>
-          <w:tcPr>
-            <w:tcW w:type="dxa" w:w="3742"/>
+            <w:tcW w:type="dxa" w:w="1191"/>
+          </w:tcPr>
+          <w:p>
+            <w:pPr>
+              <w:spacing w:after="20"/>
+            </w:pPr>
+            <w:r>
+              <w:rPr>
+                <w:sz w:val="19"/>
+              </w:rPr>
+            </w:r>
+            <w:r>
+              <w:rPr>
+                <w:sz w:val="19"/>
+              </w:rPr>
+              <w:t>mar 13-oct</w:t>
+            </w:r>
+          </w:p>
+        </w:tc>
+        <w:tc>
+          <w:tcPr>
+            <w:tcW w:type="dxa" w:w="3628"/>
           </w:tcPr>
           <w:p>
             <w:pPr>
@@ -1364,7 +1364,7 @@
         </w:tc>
         <w:tc>
           <w:tcPr>
-            <w:tcW w:type="dxa" w:w="2608"/>
+            <w:tcW w:type="dxa" w:w="2438"/>
           </w:tcPr>
           <w:p>
             <w:pPr>
@@ -1385,7 +1385,7 @@
         </w:tc>
         <w:tc>
           <w:tcPr>
-            <w:tcW w:type="dxa" w:w="1020"/>
+            <w:tcW w:type="dxa" w:w="1247"/>
           </w:tcPr>
           <w:p>
             <w:pPr>
@@ -1408,7 +1408,7 @@
       <w:tr>
         <w:tc>
           <w:tcPr>
-            <w:tcW w:type="dxa" w:w="1134"/>
+            <w:tcW w:type="dxa" w:w="1191"/>
             <w:shd w:val="clear" w:color="auto" w:fill="EEF2F7"/>
           </w:tcPr>
           <w:p>
@@ -1424,13 +1424,13 @@
               <w:rPr>
                 <w:sz w:val="19"/>
               </w:rPr>
-              <w:t>Tue 13-Oct</w:t>
-            </w:r>
-          </w:p>
-        </w:tc>
-        <w:tc>
-          <w:tcPr>
-            <w:tcW w:type="dxa" w:w="3742"/>
+              <w:t>mar 13-oct</w:t>
+            </w:r>
+          </w:p>
+        </w:tc>
+        <w:tc>
+          <w:tcPr>
+            <w:tcW w:type="dxa" w:w="3628"/>
             <w:shd w:val="clear" w:color="auto" w:fill="EEF2F7"/>
           </w:tcPr>
           <w:p>
@@ -1474,7 +1474,7 @@
         </w:tc>
         <w:tc>
           <w:tcPr>
-            <w:tcW w:type="dxa" w:w="2608"/>
+            <w:tcW w:type="dxa" w:w="2438"/>
             <w:shd w:val="clear" w:color="auto" w:fill="EEF2F7"/>
           </w:tcPr>
           <w:p>
@@ -1496,7 +1496,7 @@
         </w:tc>
         <w:tc>
           <w:tcPr>
-            <w:tcW w:type="dxa" w:w="1020"/>
+            <w:tcW w:type="dxa" w:w="1247"/>
             <w:shd w:val="clear" w:color="auto" w:fill="EEF2F7"/>
           </w:tcPr>
           <w:p>
@@ -1520,28 +1520,28 @@
       <w:tr>
         <w:tc>
           <w:tcPr>
-            <w:tcW w:type="dxa" w:w="1134"/>
-          </w:tcPr>
-          <w:p>
-            <w:pPr>
-              <w:spacing w:after="20"/>
-            </w:pPr>
-            <w:r>
-              <w:rPr>
-                <w:sz w:val="19"/>
-              </w:rPr>
-            </w:r>
-            <w:r>
-              <w:rPr>
-                <w:sz w:val="19"/>
-              </w:rPr>
-              <w:t>Tue 13-Oct</w:t>
-            </w:r>
-          </w:p>
-        </w:tc>
-        <w:tc>
-          <w:tcPr>
-            <w:tcW w:type="dxa" w:w="3742"/>
+            <w:tcW w:type="dxa" w:w="1191"/>
+          </w:tcPr>
+          <w:p>
+            <w:pPr>
+              <w:spacing w:after="20"/>
+            </w:pPr>
+            <w:r>
+              <w:rPr>
+                <w:sz w:val="19"/>
+              </w:rPr>
+            </w:r>
+            <w:r>
+              <w:rPr>
+                <w:sz w:val="19"/>
+              </w:rPr>
+              <w:t>mar 13-oct</w:t>
+            </w:r>
+          </w:p>
+        </w:tc>
+        <w:tc>
+          <w:tcPr>
+            <w:tcW w:type="dxa" w:w="3628"/>
           </w:tcPr>
           <w:p>
             <w:pPr>
@@ -1583,7 +1583,7 @@
         </w:tc>
         <w:tc>
           <w:tcPr>
-            <w:tcW w:type="dxa" w:w="2608"/>
+            <w:tcW w:type="dxa" w:w="2438"/>
           </w:tcPr>
           <w:p>
             <w:pPr>
@@ -1604,7 +1604,7 @@
         </w:tc>
         <w:tc>
           <w:tcPr>
-            <w:tcW w:type="dxa" w:w="1020"/>
+            <w:tcW w:type="dxa" w:w="1247"/>
           </w:tcPr>
           <w:p>
             <w:pPr>
@@ -1627,7 +1627,7 @@
       <w:tr>
         <w:tc>
           <w:tcPr>
-            <w:tcW w:type="dxa" w:w="1134"/>
+            <w:tcW w:type="dxa" w:w="1191"/>
             <w:shd w:val="clear" w:color="auto" w:fill="EEF2F7"/>
           </w:tcPr>
           <w:p>
@@ -1643,13 +1643,13 @@
               <w:rPr>
                 <w:sz w:val="19"/>
               </w:rPr>
-              <w:t>Wed 14-Oct</w:t>
-            </w:r>
-          </w:p>
-        </w:tc>
-        <w:tc>
-          <w:tcPr>
-            <w:tcW w:type="dxa" w:w="3742"/>
+              <w:t>mié 14-oct</w:t>
+            </w:r>
+          </w:p>
+        </w:tc>
+        <w:tc>
+          <w:tcPr>
+            <w:tcW w:type="dxa" w:w="3628"/>
             <w:shd w:val="clear" w:color="auto" w:fill="EEF2F7"/>
           </w:tcPr>
           <w:p>
@@ -1693,7 +1693,7 @@
         </w:tc>
         <w:tc>
           <w:tcPr>
-            <w:tcW w:type="dxa" w:w="2608"/>
+            <w:tcW w:type="dxa" w:w="2438"/>
             <w:shd w:val="clear" w:color="auto" w:fill="EEF2F7"/>
           </w:tcPr>
           <w:p>
@@ -1715,7 +1715,7 @@
         </w:tc>
         <w:tc>
           <w:tcPr>
-            <w:tcW w:type="dxa" w:w="1020"/>
+            <w:tcW w:type="dxa" w:w="1247"/>
             <w:shd w:val="clear" w:color="auto" w:fill="EEF2F7"/>
           </w:tcPr>
           <w:p>
@@ -1739,28 +1739,28 @@
       <w:tr>
         <w:tc>
           <w:tcPr>
-            <w:tcW w:type="dxa" w:w="1134"/>
-          </w:tcPr>
-          <w:p>
-            <w:pPr>
-              <w:spacing w:after="20"/>
-            </w:pPr>
-            <w:r>
-              <w:rPr>
-                <w:sz w:val="19"/>
-              </w:rPr>
-            </w:r>
-            <w:r>
-              <w:rPr>
-                <w:sz w:val="19"/>
-              </w:rPr>
-              <w:t>Wed 14-Oct</w:t>
-            </w:r>
-          </w:p>
-        </w:tc>
-        <w:tc>
-          <w:tcPr>
-            <w:tcW w:type="dxa" w:w="3742"/>
+            <w:tcW w:type="dxa" w:w="1191"/>
+          </w:tcPr>
+          <w:p>
+            <w:pPr>
+              <w:spacing w:after="20"/>
+            </w:pPr>
+            <w:r>
+              <w:rPr>
+                <w:sz w:val="19"/>
+              </w:rPr>
+            </w:r>
+            <w:r>
+              <w:rPr>
+                <w:sz w:val="19"/>
+              </w:rPr>
+              <w:t>mié 14-oct</w:t>
+            </w:r>
+          </w:p>
+        </w:tc>
+        <w:tc>
+          <w:tcPr>
+            <w:tcW w:type="dxa" w:w="3628"/>
           </w:tcPr>
           <w:p>
             <w:pPr>
@@ -1802,7 +1802,7 @@
         </w:tc>
         <w:tc>
           <w:tcPr>
-            <w:tcW w:type="dxa" w:w="2608"/>
+            <w:tcW w:type="dxa" w:w="2438"/>
           </w:tcPr>
           <w:p>
             <w:pPr>
@@ -1823,7 +1823,7 @@
         </w:tc>
         <w:tc>
           <w:tcPr>
-            <w:tcW w:type="dxa" w:w="1020"/>
+            <w:tcW w:type="dxa" w:w="1247"/>
           </w:tcPr>
           <w:p>
             <w:pPr>
@@ -1846,7 +1846,7 @@
       <w:tr>
         <w:tc>
           <w:tcPr>
-            <w:tcW w:type="dxa" w:w="1134"/>
+            <w:tcW w:type="dxa" w:w="1191"/>
             <w:shd w:val="clear" w:color="auto" w:fill="EEF2F7"/>
           </w:tcPr>
           <w:p>
@@ -1862,13 +1862,13 @@
               <w:rPr>
                 <w:sz w:val="19"/>
               </w:rPr>
-              <w:t>Wed 14-Oct</w:t>
-            </w:r>
-          </w:p>
-        </w:tc>
-        <w:tc>
-          <w:tcPr>
-            <w:tcW w:type="dxa" w:w="3742"/>
+              <w:t>mié 14-oct</w:t>
+            </w:r>
+          </w:p>
+        </w:tc>
+        <w:tc>
+          <w:tcPr>
+            <w:tcW w:type="dxa" w:w="3628"/>
             <w:shd w:val="clear" w:color="auto" w:fill="EEF2F7"/>
           </w:tcPr>
           <w:p>
@@ -1912,7 +1912,7 @@
         </w:tc>
         <w:tc>
           <w:tcPr>
-            <w:tcW w:type="dxa" w:w="2608"/>
+            <w:tcW w:type="dxa" w:w="2438"/>
             <w:shd w:val="clear" w:color="auto" w:fill="EEF2F7"/>
           </w:tcPr>
           <w:p>
@@ -1934,7 +1934,7 @@
         </w:tc>
         <w:tc>
           <w:tcPr>
-            <w:tcW w:type="dxa" w:w="1020"/>
+            <w:tcW w:type="dxa" w:w="1247"/>
             <w:shd w:val="clear" w:color="auto" w:fill="EEF2F7"/>
           </w:tcPr>
           <w:p>
@@ -1958,28 +1958,28 @@
       <w:tr>
         <w:tc>
           <w:tcPr>
-            <w:tcW w:type="dxa" w:w="1134"/>
-          </w:tcPr>
-          <w:p>
-            <w:pPr>
-              <w:spacing w:after="20"/>
-            </w:pPr>
-            <w:r>
-              <w:rPr>
-                <w:sz w:val="19"/>
-              </w:rPr>
-            </w:r>
-            <w:r>
-              <w:rPr>
-                <w:sz w:val="19"/>
-              </w:rPr>
-              <w:t>Wed 14-Oct</w:t>
-            </w:r>
-          </w:p>
-        </w:tc>
-        <w:tc>
-          <w:tcPr>
-            <w:tcW w:type="dxa" w:w="3742"/>
+            <w:tcW w:type="dxa" w:w="1191"/>
+          </w:tcPr>
+          <w:p>
+            <w:pPr>
+              <w:spacing w:after="20"/>
+            </w:pPr>
+            <w:r>
+              <w:rPr>
+                <w:sz w:val="19"/>
+              </w:rPr>
+            </w:r>
+            <w:r>
+              <w:rPr>
+                <w:sz w:val="19"/>
+              </w:rPr>
+              <w:t>mié 14-oct</w:t>
+            </w:r>
+          </w:p>
+        </w:tc>
+        <w:tc>
+          <w:tcPr>
+            <w:tcW w:type="dxa" w:w="3628"/>
           </w:tcPr>
           <w:p>
             <w:pPr>
@@ -2021,7 +2021,7 @@
         </w:tc>
         <w:tc>
           <w:tcPr>
-            <w:tcW w:type="dxa" w:w="2608"/>
+            <w:tcW w:type="dxa" w:w="2438"/>
           </w:tcPr>
           <w:p>
             <w:pPr>
@@ -2042,7 +2042,7 @@
         </w:tc>
         <w:tc>
           <w:tcPr>
-            <w:tcW w:type="dxa" w:w="1020"/>
+            <w:tcW w:type="dxa" w:w="1247"/>
           </w:tcPr>
           <w:p>
             <w:pPr>
@@ -2065,7 +2065,7 @@
       <w:tr>
         <w:tc>
           <w:tcPr>
-            <w:tcW w:type="dxa" w:w="1134"/>
+            <w:tcW w:type="dxa" w:w="1191"/>
             <w:shd w:val="clear" w:color="auto" w:fill="EEF2F7"/>
           </w:tcPr>
           <w:p>
@@ -2081,13 +2081,13 @@
               <w:rPr>
                 <w:sz w:val="19"/>
               </w:rPr>
-              <w:t>Wed 14-Oct</w:t>
-            </w:r>
-          </w:p>
-        </w:tc>
-        <w:tc>
-          <w:tcPr>
-            <w:tcW w:type="dxa" w:w="3742"/>
+              <w:t>mié 14-oct</w:t>
+            </w:r>
+          </w:p>
+        </w:tc>
+        <w:tc>
+          <w:tcPr>
+            <w:tcW w:type="dxa" w:w="3628"/>
             <w:shd w:val="clear" w:color="auto" w:fill="EEF2F7"/>
           </w:tcPr>
           <w:p>
@@ -2131,7 +2131,7 @@
         </w:tc>
         <w:tc>
           <w:tcPr>
-            <w:tcW w:type="dxa" w:w="2608"/>
+            <w:tcW w:type="dxa" w:w="2438"/>
             <w:shd w:val="clear" w:color="auto" w:fill="EEF2F7"/>
           </w:tcPr>
           <w:p>
@@ -2153,7 +2153,7 @@
         </w:tc>
         <w:tc>
           <w:tcPr>
-            <w:tcW w:type="dxa" w:w="1020"/>
+            <w:tcW w:type="dxa" w:w="1247"/>
             <w:shd w:val="clear" w:color="auto" w:fill="EEF2F7"/>
           </w:tcPr>
           <w:p>
@@ -2177,28 +2177,28 @@
       <w:tr>
         <w:tc>
           <w:tcPr>
-            <w:tcW w:type="dxa" w:w="1134"/>
-          </w:tcPr>
-          <w:p>
-            <w:pPr>
-              <w:spacing w:after="20"/>
-            </w:pPr>
-            <w:r>
-              <w:rPr>
-                <w:sz w:val="19"/>
-              </w:rPr>
-            </w:r>
-            <w:r>
-              <w:rPr>
-                <w:sz w:val="19"/>
-              </w:rPr>
-              <w:t>Thu 15-Oct</w:t>
-            </w:r>
-          </w:p>
-        </w:tc>
-        <w:tc>
-          <w:tcPr>
-            <w:tcW w:type="dxa" w:w="3742"/>
+            <w:tcW w:type="dxa" w:w="1191"/>
+          </w:tcPr>
+          <w:p>
+            <w:pPr>
+              <w:spacing w:after="20"/>
+            </w:pPr>
+            <w:r>
+              <w:rPr>
+                <w:sz w:val="19"/>
+              </w:rPr>
+            </w:r>
+            <w:r>
+              <w:rPr>
+                <w:sz w:val="19"/>
+              </w:rPr>
+              <w:t>jue 15-oct</w:t>
+            </w:r>
+          </w:p>
+        </w:tc>
+        <w:tc>
+          <w:tcPr>
+            <w:tcW w:type="dxa" w:w="3628"/>
           </w:tcPr>
           <w:p>
             <w:pPr>
@@ -2240,7 +2240,7 @@
         </w:tc>
         <w:tc>
           <w:tcPr>
-            <w:tcW w:type="dxa" w:w="2608"/>
+            <w:tcW w:type="dxa" w:w="2438"/>
           </w:tcPr>
           <w:p>
             <w:pPr>
@@ -2261,7 +2261,7 @@
         </w:tc>
         <w:tc>
           <w:tcPr>
-            <w:tcW w:type="dxa" w:w="1020"/>
+            <w:tcW w:type="dxa" w:w="1247"/>
           </w:tcPr>
           <w:p>
             <w:pPr>
@@ -2284,7 +2284,7 @@
       <w:tr>
         <w:tc>
           <w:tcPr>
-            <w:tcW w:type="dxa" w:w="1134"/>
+            <w:tcW w:type="dxa" w:w="1191"/>
             <w:shd w:val="clear" w:color="auto" w:fill="EEF2F7"/>
           </w:tcPr>
           <w:p>
@@ -2300,13 +2300,13 @@
               <w:rPr>
                 <w:sz w:val="19"/>
               </w:rPr>
-              <w:t>Thu 15-Oct</w:t>
-            </w:r>
-          </w:p>
-        </w:tc>
-        <w:tc>
-          <w:tcPr>
-            <w:tcW w:type="dxa" w:w="3742"/>
+              <w:t>jue 15-oct</w:t>
+            </w:r>
+          </w:p>
+        </w:tc>
+        <w:tc>
+          <w:tcPr>
+            <w:tcW w:type="dxa" w:w="3628"/>
             <w:shd w:val="clear" w:color="auto" w:fill="EEF2F7"/>
           </w:tcPr>
           <w:p>
@@ -2350,7 +2350,7 @@
         </w:tc>
         <w:tc>
           <w:tcPr>
-            <w:tcW w:type="dxa" w:w="2608"/>
+            <w:tcW w:type="dxa" w:w="2438"/>
             <w:shd w:val="clear" w:color="auto" w:fill="EEF2F7"/>
           </w:tcPr>
           <w:p>
@@ -2372,7 +2372,7 @@
         </w:tc>
         <w:tc>
           <w:tcPr>
-            <w:tcW w:type="dxa" w:w="1020"/>
+            <w:tcW w:type="dxa" w:w="1247"/>
             <w:shd w:val="clear" w:color="auto" w:fill="EEF2F7"/>
           </w:tcPr>
           <w:p>
@@ -2396,28 +2396,28 @@
       <w:tr>
         <w:tc>
           <w:tcPr>
-            <w:tcW w:type="dxa" w:w="1134"/>
-          </w:tcPr>
-          <w:p>
-            <w:pPr>
-              <w:spacing w:after="20"/>
-            </w:pPr>
-            <w:r>
-              <w:rPr>
-                <w:sz w:val="19"/>
-              </w:rPr>
-            </w:r>
-            <w:r>
-              <w:rPr>
-                <w:sz w:val="19"/>
-              </w:rPr>
-              <w:t>Fri 16-Oct</w:t>
-            </w:r>
-          </w:p>
-        </w:tc>
-        <w:tc>
-          <w:tcPr>
-            <w:tcW w:type="dxa" w:w="3742"/>
+            <w:tcW w:type="dxa" w:w="1191"/>
+          </w:tcPr>
+          <w:p>
+            <w:pPr>
+              <w:spacing w:after="20"/>
+            </w:pPr>
+            <w:r>
+              <w:rPr>
+                <w:sz w:val="19"/>
+              </w:rPr>
+            </w:r>
+            <w:r>
+              <w:rPr>
+                <w:sz w:val="19"/>
+              </w:rPr>
+              <w:t>vie 16-oct</w:t>
+            </w:r>
+          </w:p>
+        </w:tc>
+        <w:tc>
+          <w:tcPr>
+            <w:tcW w:type="dxa" w:w="3628"/>
           </w:tcPr>
           <w:p>
             <w:pPr>
@@ -2459,7 +2459,7 @@
         </w:tc>
         <w:tc>
           <w:tcPr>
-            <w:tcW w:type="dxa" w:w="2608"/>
+            <w:tcW w:type="dxa" w:w="2438"/>
           </w:tcPr>
           <w:p>
             <w:pPr>
@@ -2480,7 +2480,7 @@
         </w:tc>
         <w:tc>
           <w:tcPr>
-            <w:tcW w:type="dxa" w:w="1020"/>
+            <w:tcW w:type="dxa" w:w="1247"/>
           </w:tcPr>
           <w:p>
             <w:pPr>
@@ -2503,7 +2503,7 @@
       <w:tr>
         <w:tc>
           <w:tcPr>
-            <w:tcW w:type="dxa" w:w="1134"/>
+            <w:tcW w:type="dxa" w:w="1191"/>
             <w:shd w:val="clear" w:color="auto" w:fill="EEF2F7"/>
           </w:tcPr>
           <w:p>
@@ -2519,13 +2519,13 @@
               <w:rPr>
                 <w:sz w:val="19"/>
               </w:rPr>
-              <w:t>Fri 16-Oct</w:t>
-            </w:r>
-          </w:p>
-        </w:tc>
-        <w:tc>
-          <w:tcPr>
-            <w:tcW w:type="dxa" w:w="3742"/>
+              <w:t>vie 16-oct</w:t>
+            </w:r>
+          </w:p>
+        </w:tc>
+        <w:tc>
+          <w:tcPr>
+            <w:tcW w:type="dxa" w:w="3628"/>
             <w:shd w:val="clear" w:color="auto" w:fill="EEF2F7"/>
           </w:tcPr>
           <w:p>
@@ -2569,7 +2569,7 @@
         </w:tc>
         <w:tc>
           <w:tcPr>
-            <w:tcW w:type="dxa" w:w="2608"/>
+            <w:tcW w:type="dxa" w:w="2438"/>
             <w:shd w:val="clear" w:color="auto" w:fill="EEF2F7"/>
           </w:tcPr>
           <w:p>
@@ -2591,7 +2591,7 @@
         </w:tc>
         <w:tc>
           <w:tcPr>
-            <w:tcW w:type="dxa" w:w="1020"/>
+            <w:tcW w:type="dxa" w:w="1247"/>
             <w:shd w:val="clear" w:color="auto" w:fill="EEF2F7"/>
           </w:tcPr>
           <w:p>
@@ -2615,28 +2615,28 @@
       <w:tr>
         <w:tc>
           <w:tcPr>
-            <w:tcW w:type="dxa" w:w="1134"/>
-          </w:tcPr>
-          <w:p>
-            <w:pPr>
-              <w:spacing w:after="20"/>
-            </w:pPr>
-            <w:r>
-              <w:rPr>
-                <w:sz w:val="19"/>
-              </w:rPr>
-            </w:r>
-            <w:r>
-              <w:rPr>
-                <w:sz w:val="19"/>
-              </w:rPr>
-              <w:t>Sat 17-Oct</w:t>
-            </w:r>
-          </w:p>
-        </w:tc>
-        <w:tc>
-          <w:tcPr>
-            <w:tcW w:type="dxa" w:w="3742"/>
+            <w:tcW w:type="dxa" w:w="1191"/>
+          </w:tcPr>
+          <w:p>
+            <w:pPr>
+              <w:spacing w:after="20"/>
+            </w:pPr>
+            <w:r>
+              <w:rPr>
+                <w:sz w:val="19"/>
+              </w:rPr>
+            </w:r>
+            <w:r>
+              <w:rPr>
+                <w:sz w:val="19"/>
+              </w:rPr>
+              <w:t>sáb 17-oct</w:t>
+            </w:r>
+          </w:p>
+        </w:tc>
+        <w:tc>
+          <w:tcPr>
+            <w:tcW w:type="dxa" w:w="3628"/>
           </w:tcPr>
           <w:p>
             <w:pPr>
@@ -2678,7 +2678,7 @@
         </w:tc>
         <w:tc>
           <w:tcPr>
-            <w:tcW w:type="dxa" w:w="2608"/>
+            <w:tcW w:type="dxa" w:w="2438"/>
           </w:tcPr>
           <w:p>
             <w:pPr>
@@ -2699,7 +2699,7 @@
         </w:tc>
         <w:tc>
           <w:tcPr>
-            <w:tcW w:type="dxa" w:w="1020"/>
+            <w:tcW w:type="dxa" w:w="1247"/>
           </w:tcPr>
           <w:p>
             <w:pPr>
@@ -2722,7 +2722,7 @@
       <w:tr>
         <w:tc>
           <w:tcPr>
-            <w:tcW w:type="dxa" w:w="1134"/>
+            <w:tcW w:type="dxa" w:w="1191"/>
             <w:shd w:val="clear" w:color="auto" w:fill="EEF2F7"/>
           </w:tcPr>
           <w:p>
@@ -2738,13 +2738,13 @@
               <w:rPr>
                 <w:sz w:val="19"/>
               </w:rPr>
-              <w:t>Sat 17-Oct</w:t>
-            </w:r>
-          </w:p>
-        </w:tc>
-        <w:tc>
-          <w:tcPr>
-            <w:tcW w:type="dxa" w:w="3742"/>
+              <w:t>sáb 17-oct</w:t>
+            </w:r>
+          </w:p>
+        </w:tc>
+        <w:tc>
+          <w:tcPr>
+            <w:tcW w:type="dxa" w:w="3628"/>
             <w:shd w:val="clear" w:color="auto" w:fill="EEF2F7"/>
           </w:tcPr>
           <w:p>
@@ -2788,7 +2788,7 @@
         </w:tc>
         <w:tc>
           <w:tcPr>
-            <w:tcW w:type="dxa" w:w="2608"/>
+            <w:tcW w:type="dxa" w:w="2438"/>
             <w:shd w:val="clear" w:color="auto" w:fill="EEF2F7"/>
           </w:tcPr>
           <w:p>
@@ -2810,7 +2810,7 @@
         </w:tc>
         <w:tc>
           <w:tcPr>
-            <w:tcW w:type="dxa" w:w="1020"/>
+            <w:tcW w:type="dxa" w:w="1247"/>
             <w:shd w:val="clear" w:color="auto" w:fill="EEF2F7"/>
           </w:tcPr>
           <w:p>
@@ -2834,28 +2834,28 @@
       <w:tr>
         <w:tc>
           <w:tcPr>
-            <w:tcW w:type="dxa" w:w="1134"/>
-          </w:tcPr>
-          <w:p>
-            <w:pPr>
-              <w:spacing w:after="20"/>
-            </w:pPr>
-            <w:r>
-              <w:rPr>
-                <w:sz w:val="19"/>
-              </w:rPr>
-            </w:r>
-            <w:r>
-              <w:rPr>
-                <w:sz w:val="19"/>
-              </w:rPr>
-              <w:t>Sat 17-Oct</w:t>
-            </w:r>
-          </w:p>
-        </w:tc>
-        <w:tc>
-          <w:tcPr>
-            <w:tcW w:type="dxa" w:w="3742"/>
+            <w:tcW w:type="dxa" w:w="1191"/>
+          </w:tcPr>
+          <w:p>
+            <w:pPr>
+              <w:spacing w:after="20"/>
+            </w:pPr>
+            <w:r>
+              <w:rPr>
+                <w:sz w:val="19"/>
+              </w:rPr>
+            </w:r>
+            <w:r>
+              <w:rPr>
+                <w:sz w:val="19"/>
+              </w:rPr>
+              <w:t>sáb 17-oct</w:t>
+            </w:r>
+          </w:p>
+        </w:tc>
+        <w:tc>
+          <w:tcPr>
+            <w:tcW w:type="dxa" w:w="3628"/>
           </w:tcPr>
           <w:p>
             <w:pPr>
@@ -2897,7 +2897,7 @@
         </w:tc>
         <w:tc>
           <w:tcPr>
-            <w:tcW w:type="dxa" w:w="2608"/>
+            <w:tcW w:type="dxa" w:w="2438"/>
           </w:tcPr>
           <w:p>
             <w:pPr>
@@ -2918,7 +2918,7 @@
         </w:tc>
         <w:tc>
           <w:tcPr>
-            <w:tcW w:type="dxa" w:w="1020"/>
+            <w:tcW w:type="dxa" w:w="1247"/>
           </w:tcPr>
           <w:p>
             <w:pPr>
@@ -2941,7 +2941,7 @@
       <w:tr>
         <w:tc>
           <w:tcPr>
-            <w:tcW w:type="dxa" w:w="1134"/>
+            <w:tcW w:type="dxa" w:w="1191"/>
             <w:shd w:val="clear" w:color="auto" w:fill="EEF2F7"/>
           </w:tcPr>
           <w:p>
@@ -2957,13 +2957,13 @@
               <w:rPr>
                 <w:sz w:val="19"/>
               </w:rPr>
-              <w:t>Sat 17-Oct</w:t>
-            </w:r>
-          </w:p>
-        </w:tc>
-        <w:tc>
-          <w:tcPr>
-            <w:tcW w:type="dxa" w:w="3742"/>
+              <w:t>sáb 17-oct</w:t>
+            </w:r>
+          </w:p>
+        </w:tc>
+        <w:tc>
+          <w:tcPr>
+            <w:tcW w:type="dxa" w:w="3628"/>
             <w:shd w:val="clear" w:color="auto" w:fill="EEF2F7"/>
           </w:tcPr>
           <w:p>
@@ -3007,7 +3007,7 @@
         </w:tc>
         <w:tc>
           <w:tcPr>
-            <w:tcW w:type="dxa" w:w="2608"/>
+            <w:tcW w:type="dxa" w:w="2438"/>
             <w:shd w:val="clear" w:color="auto" w:fill="EEF2F7"/>
           </w:tcPr>
           <w:p>
@@ -3029,7 +3029,7 @@
         </w:tc>
         <w:tc>
           <w:tcPr>
-            <w:tcW w:type="dxa" w:w="1020"/>
+            <w:tcW w:type="dxa" w:w="1247"/>
             <w:shd w:val="clear" w:color="auto" w:fill="EEF2F7"/>
           </w:tcPr>
           <w:p>
@@ -3053,28 +3053,28 @@
       <w:tr>
         <w:tc>
           <w:tcPr>
-            <w:tcW w:type="dxa" w:w="1134"/>
-          </w:tcPr>
-          <w:p>
-            <w:pPr>
-              <w:spacing w:after="20"/>
-            </w:pPr>
-            <w:r>
-              <w:rPr>
-                <w:sz w:val="19"/>
-              </w:rPr>
-            </w:r>
-            <w:r>
-              <w:rPr>
-                <w:sz w:val="19"/>
-              </w:rPr>
-              <w:t>Sat 17-Oct</w:t>
-            </w:r>
-          </w:p>
-        </w:tc>
-        <w:tc>
-          <w:tcPr>
-            <w:tcW w:type="dxa" w:w="3742"/>
+            <w:tcW w:type="dxa" w:w="1191"/>
+          </w:tcPr>
+          <w:p>
+            <w:pPr>
+              <w:spacing w:after="20"/>
+            </w:pPr>
+            <w:r>
+              <w:rPr>
+                <w:sz w:val="19"/>
+              </w:rPr>
+            </w:r>
+            <w:r>
+              <w:rPr>
+                <w:sz w:val="19"/>
+              </w:rPr>
+              <w:t>sáb 17-oct</w:t>
+            </w:r>
+          </w:p>
+        </w:tc>
+        <w:tc>
+          <w:tcPr>
+            <w:tcW w:type="dxa" w:w="3628"/>
           </w:tcPr>
           <w:p>
             <w:pPr>
@@ -3116,7 +3116,7 @@
         </w:tc>
         <w:tc>
           <w:tcPr>
-            <w:tcW w:type="dxa" w:w="2608"/>
+            <w:tcW w:type="dxa" w:w="2438"/>
           </w:tcPr>
           <w:p>
             <w:pPr>
@@ -3137,7 +3137,7 @@
         </w:tc>
         <w:tc>
           <w:tcPr>
-            <w:tcW w:type="dxa" w:w="1020"/>
+            <w:tcW w:type="dxa" w:w="1247"/>
           </w:tcPr>
           <w:p>
             <w:pPr>
@@ -3160,7 +3160,7 @@
       <w:tr>
         <w:tc>
           <w:tcPr>
-            <w:tcW w:type="dxa" w:w="1134"/>
+            <w:tcW w:type="dxa" w:w="1191"/>
             <w:shd w:val="clear" w:color="auto" w:fill="EEF2F7"/>
           </w:tcPr>
           <w:p>
@@ -3176,13 +3176,13 @@
               <w:rPr>
                 <w:sz w:val="19"/>
               </w:rPr>
-              <w:t>Sun 18-Oct</w:t>
-            </w:r>
-          </w:p>
-        </w:tc>
-        <w:tc>
-          <w:tcPr>
-            <w:tcW w:type="dxa" w:w="3742"/>
+              <w:t>dom 18-oct</w:t>
+            </w:r>
+          </w:p>
+        </w:tc>
+        <w:tc>
+          <w:tcPr>
+            <w:tcW w:type="dxa" w:w="3628"/>
             <w:shd w:val="clear" w:color="auto" w:fill="EEF2F7"/>
           </w:tcPr>
           <w:p>
@@ -3226,7 +3226,7 @@
         </w:tc>
         <w:tc>
           <w:tcPr>
-            <w:tcW w:type="dxa" w:w="2608"/>
+            <w:tcW w:type="dxa" w:w="2438"/>
             <w:shd w:val="clear" w:color="auto" w:fill="EEF2F7"/>
           </w:tcPr>
           <w:p>
@@ -3248,7 +3248,7 @@
         </w:tc>
         <w:tc>
           <w:tcPr>
-            <w:tcW w:type="dxa" w:w="1020"/>
+            <w:tcW w:type="dxa" w:w="1247"/>
             <w:shd w:val="clear" w:color="auto" w:fill="EEF2F7"/>
           </w:tcPr>
           <w:p>
@@ -3272,28 +3272,28 @@
       <w:tr>
         <w:tc>
           <w:tcPr>
-            <w:tcW w:type="dxa" w:w="1134"/>
-          </w:tcPr>
-          <w:p>
-            <w:pPr>
-              <w:spacing w:after="20"/>
-            </w:pPr>
-            <w:r>
-              <w:rPr>
-                <w:sz w:val="19"/>
-              </w:rPr>
-            </w:r>
-            <w:r>
-              <w:rPr>
-                <w:sz w:val="19"/>
-              </w:rPr>
-              <w:t>Sun 18-Oct</w:t>
-            </w:r>
-          </w:p>
-        </w:tc>
-        <w:tc>
-          <w:tcPr>
-            <w:tcW w:type="dxa" w:w="3742"/>
+            <w:tcW w:type="dxa" w:w="1191"/>
+          </w:tcPr>
+          <w:p>
+            <w:pPr>
+              <w:spacing w:after="20"/>
+            </w:pPr>
+            <w:r>
+              <w:rPr>
+                <w:sz w:val="19"/>
+              </w:rPr>
+            </w:r>
+            <w:r>
+              <w:rPr>
+                <w:sz w:val="19"/>
+              </w:rPr>
+              <w:t>dom 18-oct</w:t>
+            </w:r>
+          </w:p>
+        </w:tc>
+        <w:tc>
+          <w:tcPr>
+            <w:tcW w:type="dxa" w:w="3628"/>
           </w:tcPr>
           <w:p>
             <w:pPr>
@@ -3335,7 +3335,7 @@
         </w:tc>
         <w:tc>
           <w:tcPr>
-            <w:tcW w:type="dxa" w:w="2608"/>
+            <w:tcW w:type="dxa" w:w="2438"/>
           </w:tcPr>
           <w:p>
             <w:pPr>
@@ -3356,7 +3356,7 @@
         </w:tc>
         <w:tc>
           <w:tcPr>
-            <w:tcW w:type="dxa" w:w="1020"/>
+            <w:tcW w:type="dxa" w:w="1247"/>
           </w:tcPr>
           <w:p>
             <w:pPr>
@@ -3379,7 +3379,7 @@
       <w:tr>
         <w:tc>
           <w:tcPr>
-            <w:tcW w:type="dxa" w:w="1134"/>
+            <w:tcW w:type="dxa" w:w="1191"/>
             <w:shd w:val="clear" w:color="auto" w:fill="EEF2F7"/>
           </w:tcPr>
           <w:p>
@@ -3395,13 +3395,13 @@
               <w:rPr>
                 <w:sz w:val="19"/>
               </w:rPr>
-              <w:t>Sun 18-Oct</w:t>
-            </w:r>
-          </w:p>
-        </w:tc>
-        <w:tc>
-          <w:tcPr>
-            <w:tcW w:type="dxa" w:w="3742"/>
+              <w:t>dom 18-oct</w:t>
+            </w:r>
+          </w:p>
+        </w:tc>
+        <w:tc>
+          <w:tcPr>
+            <w:tcW w:type="dxa" w:w="3628"/>
             <w:shd w:val="clear" w:color="auto" w:fill="EEF2F7"/>
           </w:tcPr>
           <w:p>
@@ -3445,7 +3445,7 @@
         </w:tc>
         <w:tc>
           <w:tcPr>
-            <w:tcW w:type="dxa" w:w="2608"/>
+            <w:tcW w:type="dxa" w:w="2438"/>
             <w:shd w:val="clear" w:color="auto" w:fill="EEF2F7"/>
           </w:tcPr>
           <w:p>
@@ -3467,7 +3467,7 @@
         </w:tc>
         <w:tc>
           <w:tcPr>
-            <w:tcW w:type="dxa" w:w="1020"/>
+            <w:tcW w:type="dxa" w:w="1247"/>
             <w:shd w:val="clear" w:color="auto" w:fill="EEF2F7"/>
           </w:tcPr>
           <w:p>
@@ -3491,28 +3491,28 @@
       <w:tr>
         <w:tc>
           <w:tcPr>
-            <w:tcW w:type="dxa" w:w="1134"/>
-          </w:tcPr>
-          <w:p>
-            <w:pPr>
-              <w:spacing w:after="20"/>
-            </w:pPr>
-            <w:r>
-              <w:rPr>
-                <w:sz w:val="19"/>
-              </w:rPr>
-            </w:r>
-            <w:r>
-              <w:rPr>
-                <w:sz w:val="19"/>
-              </w:rPr>
-              <w:t>Sun 18-Oct</w:t>
-            </w:r>
-          </w:p>
-        </w:tc>
-        <w:tc>
-          <w:tcPr>
-            <w:tcW w:type="dxa" w:w="3742"/>
+            <w:tcW w:type="dxa" w:w="1191"/>
+          </w:tcPr>
+          <w:p>
+            <w:pPr>
+              <w:spacing w:after="20"/>
+            </w:pPr>
+            <w:r>
+              <w:rPr>
+                <w:sz w:val="19"/>
+              </w:rPr>
+            </w:r>
+            <w:r>
+              <w:rPr>
+                <w:sz w:val="19"/>
+              </w:rPr>
+              <w:t>dom 18-oct</w:t>
+            </w:r>
+          </w:p>
+        </w:tc>
+        <w:tc>
+          <w:tcPr>
+            <w:tcW w:type="dxa" w:w="3628"/>
           </w:tcPr>
           <w:p>
             <w:pPr>
@@ -3554,7 +3554,7 @@
         </w:tc>
         <w:tc>
           <w:tcPr>
-            <w:tcW w:type="dxa" w:w="2608"/>
+            <w:tcW w:type="dxa" w:w="2438"/>
           </w:tcPr>
           <w:p>
             <w:pPr>
@@ -3575,7 +3575,7 @@
         </w:tc>
         <w:tc>
           <w:tcPr>
-            <w:tcW w:type="dxa" w:w="1020"/>
+            <w:tcW w:type="dxa" w:w="1247"/>
           </w:tcPr>
           <w:p>
             <w:pPr>
@@ -3613,11 +3613,11 @@
         <w:rPr>
           <w:b/>
         </w:rPr>
-        <w:t>El diseño firmado por la tutora presenta datos simulados como diagnóstico real.</w:t>
+        <w:t>El diseño que firmó la tutora presenta datos simulados como si fueran reales.</w:t>
       </w:r>
       <w:r>
         <w:rPr/>
-        <w:t xml:space="preserve"> Si no se aclara antes de la Revisión 1, es un riesgo de integridad académica.</w:t>
+        <w:t xml:space="preserve"> Hay que contárselo mañana, antes de la primera revisión formal.</w:t>
       </w:r>
     </w:p>
     <w:p>
@@ -3626,42 +3626,7 @@
       </w:pPr>
       <w:r>
         <w:rPr/>
-        <w:t xml:space="preserve">Las metas </w:t>
-      </w:r>
-      <w:r>
-        <w:rPr>
-          <w:b/>
-        </w:rPr>
-        <w:t>M1, M3, M4 y M6</w:t>
-      </w:r>
-      <w:r>
-        <w:rPr/>
-        <w:t xml:space="preserve"> quedan sin línea base hasta el campo del 15–16 oct. </w:t>
-      </w:r>
-      <w:r>
-        <w:rPr>
-          <w:b/>
-        </w:rPr>
-        <w:t>M2</w:t>
-      </w:r>
-      <w:r>
-        <w:rPr/>
-        <w:t xml:space="preserve"> (30–44 min) no tiene fuente: se mide con cronómetro.</w:t>
-      </w:r>
-    </w:p>
-    <w:p>
-      <w:pPr>
-        <w:pStyle w:val="ListBullet"/>
-      </w:pPr>
-      <w:r>
-        <w:rPr>
-          <w:b/>
-        </w:rPr>
-        <w:t>Giro del negocio sin confirmar:</w:t>
-      </w:r>
-      <w:r>
-        <w:rPr/>
-        <w:t xml:space="preserve"> el SRI dice vías; el instrumento simulado hablaba de inmuebles. Afecta el vocabulario de los instrumentos.</w:t>
+        <w:t>Las metas que dependen de la línea base (la medición del «antes») quedan sin dato hasta que Torvesa autorice el campo: responder en menos de 15 minutos, perder menos clientes antes del primer contacto, encontrar el historial de un cliente ajeno y la usabilidad del sistema.</w:t>
       </w:r>
     </w:p>
     <w:p>
@@ -3670,7 +3635,7 @@
       </w:pPr>
       <w:r>
         <w:rPr/>
-        <w:t>El campo depende de permisos de gerencia (cronometraje, muestra documental, lista de clientes) que todavía no están.</w:t>
+        <w:t>El dato «30–44 minutos por cotización» no tiene fuente: se medirá con cronómetro si Torvesa lo permite.</w:t>
       </w:r>
     </w:p>
     <w:p>
@@ -3679,7 +3644,7 @@
       </w:pPr>
       <w:r>
         <w:rPr/>
-        <w:t>El volumen de solicitudes durante la validación del diseño en operación experimental controlada (2 semanas, 33 clientes) puede ser bajo para las pruebas estadísticas.</w:t>
+        <w:t>No sabemos con certeza a qué se dedica Torvesa (en el SRI figura la construcción de vías; las encuestas simuladas hablaban de inmuebles).</w:t>
       </w:r>
     </w:p>
     <w:p>
@@ -3688,19 +3653,7 @@
       </w:pPr>
       <w:r>
         <w:rPr/>
-        <w:t xml:space="preserve">El tablero (Project) de GitHub falta: requiere </w:t>
-      </w:r>
-      <w:r>
-        <w:rPr>
-          <w:rFonts w:ascii="Consolas" w:hAnsi="Consolas" w:cs="Consolas" w:eastAsia="Consolas"/>
-          <w:color w:val="0B1F3A"/>
-          <w:sz w:val="19"/>
-        </w:rPr>
-        <w:t>gh auth refresh -s project</w:t>
-      </w:r>
-      <w:r>
-        <w:rPr/>
-        <w:t>.</w:t>
+        <w:t>El tablero de GitHub todavía no existe porque falta un permiso en tu sesión.</w:t>
       </w:r>
     </w:p>
     <w:p>
@@ -3718,17 +3671,19 @@
       <w:commentRangeStart w:id="0"/>
       <w:r>
         <w:rPr/>
-        <w:t xml:space="preserve">Escribir a la tutora </w:t>
+        <w:t>Mañana: conversar con la tutora usando la hoja de 5 puntos (</w:t>
       </w:r>
       <w:r>
         <w:rPr>
-          <w:b/>
+          <w:rFonts w:ascii="Consolas" w:hAnsi="Consolas" w:cs="Consolas" w:eastAsia="Consolas"/>
+          <w:color w:val="0B1F3A"/>
+          <w:sz w:val="19"/>
         </w:rPr>
-        <w:t>antes</w:t>
+        <w:t>08_Reuniones_Tutora/2026-10-12_Puntos_Tutora.pdf</w:t>
       </w:r>
       <w:r>
         <w:rPr/>
-        <w:t xml:space="preserve"> de la Revisión 1: datos simulados, D2, D5 (¿el 15-dic es fecha dura?) y D6.</w:t>
+        <w:t>) y escribir el acta ese mismo día.</w:t>
       </w:r>
       <w:commentRangeEnd w:id="0"/>
       <w:r>
@@ -3745,7 +3700,7 @@
       <w:commentRangeStart w:id="1"/>
       <w:r>
         <w:rPr/>
-        <w:t xml:space="preserve">Conseguir de gerencia, antes del jueves 15: autorización C1-C, permiso de cronometraje y lista de los 33 clientes (solo a </w:t>
+        <w:t xml:space="preserve">Mañana: enviar el correo a Torvesa (borrador en </w:t>
       </w:r>
       <w:r>
         <w:rPr>
@@ -3753,11 +3708,11 @@
           <w:color w:val="0B1F3A"/>
           <w:sz w:val="19"/>
         </w:rPr>
-        <w:t>_crudo/</w:t>
+        <w:t>11_Planificacion/2026-10-12_Correo_Torvesa_borrador.docx</w:t>
       </w:r>
       <w:r>
         <w:rPr/>
-        <w:t>).</w:t>
+        <w:t>), con respuesta hasta el miércoles 14.</w:t>
       </w:r>
       <w:commentRangeEnd w:id="1"/>
       <w:r>
@@ -3774,7 +3729,19 @@
       <w:commentRangeStart w:id="2"/>
       <w:r>
         <w:rPr/>
-        <w:t>Confirmar con Torvesa el giro real del negocio y si vende inmuebles.</w:t>
+        <w:t>Decidir si se borra la copia cancelada de la bóveda 1 (</w:t>
+      </w:r>
+      <w:r>
+        <w:rPr>
+          <w:rFonts w:ascii="Consolas" w:hAnsi="Consolas" w:cs="Consolas" w:eastAsia="Consolas"/>
+          <w:color w:val="0B1F3A"/>
+          <w:sz w:val="19"/>
+        </w:rPr>
+        <w:t>F:\Compartir_Diego_PENDIENTE</w:t>
+      </w:r>
+      <w:r>
+        <w:rPr/>
+        <w:t>, tiene datos de CRISFE).</w:t>
       </w:r>
       <w:commentRangeEnd w:id="2"/>
       <w:r>
@@ -3791,7 +3758,19 @@
       <w:commentRangeStart w:id="3"/>
       <w:r>
         <w:rPr/>
-        <w:t>Corregir los instrumentos v0.1 → v0.2 el miércoles 14 (cada cambio en un archivo nuevo).</w:t>
+        <w:t xml:space="preserve">Elegir cuál es el Informe Final y cuál es el pitch deck vigentes (hay varias versiones en </w:t>
+      </w:r>
+      <w:r>
+        <w:rPr>
+          <w:rFonts w:ascii="Consolas" w:hAnsi="Consolas" w:cs="Consolas" w:eastAsia="Consolas"/>
+          <w:color w:val="0B1F3A"/>
+          <w:sz w:val="19"/>
+        </w:rPr>
+        <w:t>10_Antecedentes_Propios</w:t>
+      </w:r>
+      <w:r>
+        <w:rPr/>
+        <w:t>).</w:t>
       </w:r>
       <w:commentRangeEnd w:id="3"/>
       <w:r>
@@ -3808,7 +3787,7 @@
       <w:commentRangeStart w:id="4"/>
       <w:r>
         <w:rPr/>
-        <w:t xml:space="preserve">Ejecutar </w:t>
+        <w:t xml:space="preserve">Repetir </w:t>
       </w:r>
       <w:r>
         <w:rPr>
@@ -3820,7 +3799,7 @@
       </w:r>
       <w:r>
         <w:rPr/>
-        <w:t xml:space="preserve"> para crear el tablero kanban.</w:t>
+        <w:t xml:space="preserve"> en PowerShell y completar el paso del navegador, para crear el tablero de GitHub.</w:t>
       </w:r>
       <w:commentRangeEnd w:id="4"/>
       <w:r>
@@ -3837,19 +3816,7 @@
       <w:commentRangeStart w:id="5"/>
       <w:r>
         <w:rPr/>
-        <w:t xml:space="preserve">Aprobar o ajustar la propuesta de reorganización del repo (renombrados con </w:t>
-      </w:r>
-      <w:r>
-        <w:rPr>
-          <w:rFonts w:ascii="Consolas" w:hAnsi="Consolas" w:cs="Consolas" w:eastAsia="Consolas"/>
-          <w:color w:val="0B1F3A"/>
-          <w:sz w:val="19"/>
-        </w:rPr>
-        <w:t>git mv</w:t>
-      </w:r>
-      <w:r>
-        <w:rPr/>
-        <w:t>).</w:t>
+        <w:t>Avisar a Diego que acepte la invitación de GitHub (vence el 18-oct).</w:t>
       </w:r>
       <w:commentRangeEnd w:id="5"/>
       <w:r>
@@ -4934,19 +4901,20 @@
         <w:rPr/>
         <w:t xml:space="preserve"> </w:t>
       </w:r>
-      <w:r>
-        <w:rPr>
-          <w:rFonts w:ascii="Consolas" w:hAnsi="Consolas" w:cs="Consolas" w:eastAsia="Consolas"/>
-          <w:color w:val="0B1F3A"/>
-          <w:sz w:val="19"/>
-        </w:rPr>
-        <w:t>Glosario</w:t>
-      </w:r>
+      <w:hyperlink r:id="rId27">
+        <w:r>
+          <w:rPr>
+            <w:color w:val="B87333"/>
+            <w:u w:val="single"/>
+          </w:rPr>
+          <w:t xml:space="preserve">Glosario</w:t>
+        </w:r>
+      </w:hyperlink>
       <w:r>
         <w:rPr/>
-        <w:t xml:space="preserve"> (solo en tu PC) · </w:t>
+        <w:t xml:space="preserve"> · </w:t>
       </w:r>
-      <w:hyperlink r:id="rId27">
+      <w:hyperlink r:id="rId28">
         <w:r>
           <w:rPr>
             <w:color w:val="B87333"/>
@@ -4959,54 +4927,54 @@
         <w:rPr/>
         <w:t xml:space="preserve"> · </w:t>
       </w:r>
-      <w:r>
-        <w:rPr>
-          <w:rFonts w:ascii="Consolas" w:hAnsi="Consolas" w:cs="Consolas" w:eastAsia="Consolas"/>
-          <w:color w:val="0B1F3A"/>
-          <w:sz w:val="19"/>
-        </w:rPr>
-        <w:t>Conceptos de negocio</w:t>
-      </w:r>
+      <w:hyperlink r:id="rId29">
+        <w:r>
+          <w:rPr>
+            <w:color w:val="B87333"/>
+            <w:u w:val="single"/>
+          </w:rPr>
+          <w:t xml:space="preserve">Conceptos de negocio</w:t>
+        </w:r>
+      </w:hyperlink>
       <w:r>
         <w:rPr/>
-        <w:t xml:space="preserve"> (solo en tu PC) · </w:t>
+        <w:t xml:space="preserve"> · </w:t>
       </w:r>
-      <w:r>
-        <w:rPr>
-          <w:rFonts w:ascii="Consolas" w:hAnsi="Consolas" w:cs="Consolas" w:eastAsia="Consolas"/>
-          <w:color w:val="0B1F3A"/>
-          <w:sz w:val="19"/>
-        </w:rPr>
-        <w:t>Cronograma (Excel)</w:t>
-      </w:r>
+      <w:hyperlink r:id="rId30">
+        <w:r>
+          <w:rPr>
+            <w:color w:val="B87333"/>
+            <w:u w:val="single"/>
+          </w:rPr>
+          <w:t xml:space="preserve">Cronograma (Excel)</w:t>
+        </w:r>
+      </w:hyperlink>
       <w:r>
         <w:rPr/>
-        <w:t xml:space="preserve"> (solo en tu PC) · </w:t>
+        <w:t xml:space="preserve"> · </w:t>
       </w:r>
-      <w:r>
-        <w:rPr>
-          <w:rFonts w:ascii="Consolas" w:hAnsi="Consolas" w:cs="Consolas" w:eastAsia="Consolas"/>
-          <w:color w:val="0B1F3A"/>
-          <w:sz w:val="19"/>
-        </w:rPr>
-        <w:t>Guía de búsqueda</w:t>
-      </w:r>
+      <w:hyperlink r:id="rId31">
+        <w:r>
+          <w:rPr>
+            <w:color w:val="B87333"/>
+            <w:u w:val="single"/>
+          </w:rPr>
+          <w:t xml:space="preserve">Guía de búsqueda</w:t>
+        </w:r>
+      </w:hyperlink>
       <w:r>
         <w:rPr/>
-        <w:t xml:space="preserve"> (solo en tu PC) · </w:t>
+        <w:t xml:space="preserve"> · </w:t>
       </w:r>
-      <w:r>
-        <w:rPr>
-          <w:rFonts w:ascii="Consolas" w:hAnsi="Consolas" w:cs="Consolas" w:eastAsia="Consolas"/>
-          <w:color w:val="0B1F3A"/>
-          <w:sz w:val="19"/>
-        </w:rPr>
-        <w:t>Auditoría</w:t>
-      </w:r>
-      <w:r>
-        <w:rPr/>
-        <w:t xml:space="preserve"> (solo en tu PC)</w:t>
-      </w:r>
+      <w:hyperlink r:id="rId32">
+        <w:r>
+          <w:rPr>
+            <w:color w:val="B87333"/>
+            <w:u w:val="single"/>
+          </w:rPr>
+          <w:t xml:space="preserve">Auditoría</w:t>
+        </w:r>
+      </w:hyperlink>
     </w:p>
     <w:p>
       <w:r>
@@ -5982,7 +5950,7 @@
               <w:rPr>
                 <w:sz w:val="19"/>
               </w:rPr>
-              <w:t>aún no existe — se crea en el sprint S7 ()</w:t>
+              <w:t>aún no existe — se crea en el sprint S7 (issue #66)</w:t>
             </w:r>
           </w:p>
         </w:tc>
@@ -6258,7 +6226,7 @@
               <w:rPr>
                 <w:sz w:val="19"/>
               </w:rPr>
-              <w:t>aún no existe — se crea en el sprint S4, S8 (issue #25)</w:t>
+              <w:t>aún no existe — se crea en el sprint S4, S8 (issue #25, issue #68)</w:t>
             </w:r>
           </w:p>
         </w:tc>
@@ -6903,20 +6871,15 @@
                 <w:sz w:val="19"/>
               </w:rPr>
             </w:r>
-            <w:r>
-              <w:rPr>
-                <w:rFonts w:ascii="Consolas" w:hAnsi="Consolas" w:cs="Consolas" w:eastAsia="Consolas"/>
-                <w:color w:val="0B1F3A"/>
-                <w:sz w:val="19"/>
-              </w:rPr>
-              <w:t>05_Datos_Campo/LineaBase_2026-10</w:t>
-            </w:r>
-            <w:r>
-              <w:rPr>
-                <w:sz w:val="19"/>
-              </w:rPr>
-              <w:t xml:space="preserve"> (solo en tu PC)</w:t>
-            </w:r>
+            <w:hyperlink r:id="rId33">
+              <w:r>
+                <w:rPr>
+                  <w:color w:val="B87333"/>
+                  <w:u w:val="single"/>
+                </w:rPr>
+                <w:t xml:space="preserve">05_Datos_Campo/LineaBase_2026-10</w:t>
+              </w:r>
+            </w:hyperlink>
           </w:p>
         </w:tc>
       </w:tr>
@@ -6979,20 +6942,15 @@
                 <w:sz w:val="19"/>
               </w:rPr>
             </w:r>
-            <w:r>
-              <w:rPr>
-                <w:rFonts w:ascii="Consolas" w:hAnsi="Consolas" w:cs="Consolas" w:eastAsia="Consolas"/>
-                <w:color w:val="0B1F3A"/>
-                <w:sz w:val="19"/>
-              </w:rPr>
-              <w:t>05_Datos_Campo/LineaBase_2026-10</w:t>
-            </w:r>
-            <w:r>
-              <w:rPr>
-                <w:sz w:val="19"/>
-              </w:rPr>
-              <w:t xml:space="preserve"> (solo en tu PC)</w:t>
-            </w:r>
+            <w:hyperlink r:id="rId33">
+              <w:r>
+                <w:rPr>
+                  <w:color w:val="B87333"/>
+                  <w:u w:val="single"/>
+                </w:rPr>
+                <w:t xml:space="preserve">05_Datos_Campo/LineaBase_2026-10</w:t>
+              </w:r>
+            </w:hyperlink>
           </w:p>
         </w:tc>
       </w:tr>
@@ -7052,20 +7010,15 @@
                 <w:sz w:val="19"/>
               </w:rPr>
             </w:r>
-            <w:r>
-              <w:rPr>
-                <w:rFonts w:ascii="Consolas" w:hAnsi="Consolas" w:cs="Consolas" w:eastAsia="Consolas"/>
-                <w:color w:val="0B1F3A"/>
-                <w:sz w:val="19"/>
-              </w:rPr>
-              <w:t>05_Datos_Campo/LineaBase_2026-10</w:t>
-            </w:r>
-            <w:r>
-              <w:rPr>
-                <w:sz w:val="19"/>
-              </w:rPr>
-              <w:t xml:space="preserve"> (solo en tu PC)</w:t>
-            </w:r>
+            <w:hyperlink r:id="rId33">
+              <w:r>
+                <w:rPr>
+                  <w:color w:val="B87333"/>
+                  <w:u w:val="single"/>
+                </w:rPr>
+                <w:t xml:space="preserve">05_Datos_Campo/LineaBase_2026-10</w:t>
+              </w:r>
+            </w:hyperlink>
           </w:p>
         </w:tc>
       </w:tr>
@@ -7128,20 +7081,15 @@
                 <w:sz w:val="19"/>
               </w:rPr>
             </w:r>
-            <w:r>
-              <w:rPr>
-                <w:rFonts w:ascii="Consolas" w:hAnsi="Consolas" w:cs="Consolas" w:eastAsia="Consolas"/>
-                <w:color w:val="0B1F3A"/>
-                <w:sz w:val="19"/>
-              </w:rPr>
-              <w:t>05_Datos_Campo/LineaBase_2026-10</w:t>
-            </w:r>
-            <w:r>
-              <w:rPr>
-                <w:sz w:val="19"/>
-              </w:rPr>
-              <w:t xml:space="preserve"> (solo en tu PC)</w:t>
-            </w:r>
+            <w:hyperlink r:id="rId33">
+              <w:r>
+                <w:rPr>
+                  <w:color w:val="B87333"/>
+                  <w:u w:val="single"/>
+                </w:rPr>
+                <w:t xml:space="preserve">05_Datos_Campo/LineaBase_2026-10</w:t>
+              </w:r>
+            </w:hyperlink>
           </w:p>
         </w:tc>
       </w:tr>
@@ -7309,7 +7257,7 @@
               <w:rPr/>
               <w:t xml:space="preserve">: no se usan. </w:t>
             </w:r>
-            <w:hyperlink r:id="rId28">
+            <w:hyperlink r:id="rId34">
               <w:r>
                 <w:rPr>
                   <w:color w:val="B87333"/>
@@ -7844,17 +7792,18 @@
         <w:rPr/>
         <w:t xml:space="preserve">Archivos: aún no existen — la carpeta es </w:t>
       </w:r>
-      <w:r>
-        <w:rPr>
-          <w:rFonts w:ascii="Consolas" w:hAnsi="Consolas" w:cs="Consolas" w:eastAsia="Consolas"/>
-          <w:color w:val="0B1F3A"/>
-          <w:sz w:val="19"/>
-        </w:rPr>
-        <w:t>06_Capitulos/Modelo_Negocio</w:t>
-      </w:r>
+      <w:hyperlink r:id="rId35">
+        <w:r>
+          <w:rPr>
+            <w:color w:val="B87333"/>
+            <w:u w:val="single"/>
+          </w:rPr>
+          <w:t xml:space="preserve">06_Capitulos/Modelo_Negocio</w:t>
+        </w:r>
+      </w:hyperlink>
       <w:r>
         <w:rPr/>
-        <w:t xml:space="preserve"> (solo en tu PC). El modelo irá en Excel con fórmulas vivas, formato condicional y notas al lado de cada supuesto.</w:t>
+        <w:t>. El modelo irá en Excel con fórmulas vivas, formato condicional y notas al lado de cada supuesto.</w:t>
       </w:r>
     </w:p>
     <w:p>
@@ -8442,17 +8391,18 @@
         <w:rPr/>
         <w:t xml:space="preserve"> datos simulados, fecha 15-dic, D2, D6 y duración de la validación — </w:t>
       </w:r>
-      <w:r>
-        <w:rPr>
-          <w:rFonts w:ascii="Consolas" w:hAnsi="Consolas" w:cs="Consolas" w:eastAsia="Consolas"/>
-          <w:color w:val="0B1F3A"/>
-          <w:sz w:val="19"/>
-        </w:rPr>
-        <w:t>hoja de puntos</w:t>
-      </w:r>
+      <w:hyperlink r:id="rId36">
+        <w:r>
+          <w:rPr>
+            <w:color w:val="B87333"/>
+            <w:u w:val="single"/>
+          </w:rPr>
+          <w:t xml:space="preserve">hoja de puntos</w:t>
+        </w:r>
+      </w:hyperlink>
       <w:r>
         <w:rPr/>
-        <w:t xml:space="preserve"> (solo en tu PC).</w:t>
+        <w:t>.</w:t>
       </w:r>
     </w:p>
     <w:p>
@@ -18299,7 +18249,7 @@
 
 <file path=word/comments.xml><?xml version="1.0" encoding="utf-8"?>
 <w:comments xmlns:a="http://schemas.openxmlformats.org/drawingml/2006/main" xmlns:pic="http://schemas.openxmlformats.org/drawingml/2006/picture" xmlns:r="http://schemas.openxmlformats.org/officeDocument/2006/relationships" xmlns:w="http://schemas.openxmlformats.org/wordprocessingml/2006/main" xmlns:wp="http://schemas.openxmlformats.org/drawingml/2006/wordprocessingDrawing" xmlns:mc="http://schemas.openxmlformats.org/markup-compatibility/2006" xmlns:a14="http://schemas.microsoft.com/office/drawing/2010/main" xmlns:w14="http://schemas.microsoft.com/office/word/2010/wordml" xmlns:wpc="http://schemas.microsoft.com/office/word/2010/wordprocessingCanvas">
-  <w:comment w:id="0" w:author="Claude" w:initials="CL" w:date="2026-10-12T02:04:57Z">
+  <w:comment w:id="0" w:author="Claude" w:initials="CL" w:date="2026-10-12T02:07:37Z">
     <w:p>
       <w:pPr>
         <w:pStyle w:val="CommentText"/>
@@ -18315,7 +18265,7 @@
       </w:r>
     </w:p>
   </w:comment>
-  <w:comment w:id="1" w:author="Claude" w:initials="CL" w:date="2026-10-12T02:04:57Z">
+  <w:comment w:id="1" w:author="Claude" w:initials="CL" w:date="2026-10-12T02:07:37Z">
     <w:p>
       <w:pPr>
         <w:pStyle w:val="CommentText"/>
@@ -18331,7 +18281,7 @@
       </w:r>
     </w:p>
   </w:comment>
-  <w:comment w:id="2" w:author="Claude" w:initials="CL" w:date="2026-10-12T02:04:57Z">
+  <w:comment w:id="2" w:author="Claude" w:initials="CL" w:date="2026-10-12T02:07:37Z">
     <w:p>
       <w:pPr>
         <w:pStyle w:val="CommentText"/>
@@ -18347,7 +18297,7 @@
       </w:r>
     </w:p>
   </w:comment>
-  <w:comment w:id="3" w:author="Claude" w:initials="CL" w:date="2026-10-12T02:04:57Z">
+  <w:comment w:id="3" w:author="Claude" w:initials="CL" w:date="2026-10-12T02:07:37Z">
     <w:p>
       <w:pPr>
         <w:pStyle w:val="CommentText"/>
@@ -18363,7 +18313,7 @@
       </w:r>
     </w:p>
   </w:comment>
-  <w:comment w:id="4" w:author="Claude" w:initials="CL" w:date="2026-10-12T02:04:57Z">
+  <w:comment w:id="4" w:author="Claude" w:initials="CL" w:date="2026-10-12T02:07:37Z">
     <w:p>
       <w:pPr>
         <w:pStyle w:val="CommentText"/>
@@ -18379,7 +18329,7 @@
       </w:r>
     </w:p>
   </w:comment>
-  <w:comment w:id="5" w:author="Claude" w:initials="CL" w:date="2026-10-12T02:04:57Z">
+  <w:comment w:id="5" w:author="Claude" w:initials="CL" w:date="2026-10-12T02:07:37Z">
     <w:p>
       <w:pPr>
         <w:pStyle w:val="CommentText"/>

</xml_diff>

<commit_message>
Decisiones: tablero descartado, subasta suiza fuera, duplicados a _historico [IA: Claude]
Co-Authored-By: Claude Opus 5.5 <noreply@anthropic.com>
</commit_message>
<xml_diff>
--- a/00_DOCUMENTO_MADRE.docx
+++ b/00_DOCUMENTO_MADRE.docx
@@ -3649,15 +3649,6 @@
     </w:p>
     <w:p>
       <w:pPr>
-        <w:pStyle w:val="ListBullet"/>
-      </w:pPr>
-      <w:r>
-        <w:rPr/>
-        <w:t>El tablero de GitHub todavía no existe porque falta un permiso en tu sesión.</w:t>
-      </w:r>
-    </w:p>
-    <w:p>
-      <w:pPr>
         <w:pStyle w:val="Heading2"/>
       </w:pPr>
       <w:r>
@@ -3729,7 +3720,7 @@
       <w:commentRangeStart w:id="2"/>
       <w:r>
         <w:rPr/>
-        <w:t>Decidir si se borra la copia cancelada de la bóveda 1 (</w:t>
+        <w:t xml:space="preserve">Borrar la carpeta vacía </w:t>
       </w:r>
       <w:r>
         <w:rPr>
@@ -3741,7 +3732,7 @@
       </w:r>
       <w:r>
         <w:rPr/>
-        <w:t>, tiene datos de CRISFE).</w:t>
+        <w:t xml:space="preserve"> (la herramienta no me deja borrar carpetas en la raíz de F:).</w:t>
       </w:r>
       <w:commentRangeEnd w:id="2"/>
       <w:r>
@@ -3787,19 +3778,7 @@
       <w:commentRangeStart w:id="4"/>
       <w:r>
         <w:rPr/>
-        <w:t xml:space="preserve">Repetir </w:t>
-      </w:r>
-      <w:r>
-        <w:rPr>
-          <w:rFonts w:ascii="Consolas" w:hAnsi="Consolas" w:cs="Consolas" w:eastAsia="Consolas"/>
-          <w:color w:val="0B1F3A"/>
-          <w:sz w:val="19"/>
-        </w:rPr>
-        <w:t>gh auth refresh -s project</w:t>
-      </w:r>
-      <w:r>
-        <w:rPr/>
-        <w:t xml:space="preserve"> en PowerShell y completar el paso del navegador, para crear el tablero de GitHub.</w:t>
+        <w:t>Avisar a Diego que acepte la invitación de GitHub (vence el 18-oct).</w:t>
       </w:r>
       <w:commentRangeEnd w:id="4"/>
       <w:r>
@@ -3807,23 +3786,6 @@
           <w:rStyle w:val="CommentReference"/>
         </w:rPr>
         <w:commentReference w:id="4"/>
-      </w:r>
-    </w:p>
-    <w:p>
-      <w:pPr>
-        <w:pStyle w:val="ListBullet"/>
-      </w:pPr>
-      <w:commentRangeStart w:id="5"/>
-      <w:r>
-        <w:rPr/>
-        <w:t>Avisar a Diego que acepte la invitación de GitHub (vence el 18-oct).</w:t>
-      </w:r>
-      <w:commentRangeEnd w:id="5"/>
-      <w:r>
-        <w:rPr>
-          <w:rStyle w:val="CommentReference"/>
-        </w:rPr>
-        <w:commentReference w:id="5"/>
       </w:r>
     </w:p>
     <w:p>
@@ -13676,7 +13638,7 @@
               <w:rPr>
                 <w:sz w:val="19"/>
               </w:rPr>
-              <w:t>El tablero de GitHub (pendiente de crear)</w:t>
+              <w:t>El tablero de GitHub se descartó (11-oct): el avance se ve en el Excel del cronograma</w:t>
             </w:r>
           </w:p>
         </w:tc>
@@ -17766,7 +17728,7 @@
               <w:rPr>
                 <w:sz w:val="19"/>
               </w:rPr>
-              <w:t>Issue = ficha de una tarea · Milestone = grupo de tareas de un sprint · Project = tablero Kanban</w:t>
+              <w:t>Issue = ficha de una tarea · Milestone = grupo de tareas de un sprint · Project = tablero Kanban (descartado; no se usa)</w:t>
             </w:r>
           </w:p>
         </w:tc>
@@ -18249,7 +18211,7 @@
 
 <file path=word/comments.xml><?xml version="1.0" encoding="utf-8"?>
 <w:comments xmlns:a="http://schemas.openxmlformats.org/drawingml/2006/main" xmlns:pic="http://schemas.openxmlformats.org/drawingml/2006/picture" xmlns:r="http://schemas.openxmlformats.org/officeDocument/2006/relationships" xmlns:w="http://schemas.openxmlformats.org/wordprocessingml/2006/main" xmlns:wp="http://schemas.openxmlformats.org/drawingml/2006/wordprocessingDrawing" xmlns:mc="http://schemas.openxmlformats.org/markup-compatibility/2006" xmlns:a14="http://schemas.microsoft.com/office/drawing/2010/main" xmlns:w14="http://schemas.microsoft.com/office/word/2010/wordml" xmlns:wpc="http://schemas.microsoft.com/office/word/2010/wordprocessingCanvas">
-  <w:comment w:id="0" w:author="Claude" w:initials="CL" w:date="2026-10-12T02:07:37Z">
+  <w:comment w:id="0" w:author="Claude" w:initials="CL" w:date="2026-10-12T02:16:44Z">
     <w:p>
       <w:pPr>
         <w:pStyle w:val="CommentText"/>
@@ -18265,7 +18227,7 @@
       </w:r>
     </w:p>
   </w:comment>
-  <w:comment w:id="1" w:author="Claude" w:initials="CL" w:date="2026-10-12T02:07:37Z">
+  <w:comment w:id="1" w:author="Claude" w:initials="CL" w:date="2026-10-12T02:16:44Z">
     <w:p>
       <w:pPr>
         <w:pStyle w:val="CommentText"/>
@@ -18281,7 +18243,7 @@
       </w:r>
     </w:p>
   </w:comment>
-  <w:comment w:id="2" w:author="Claude" w:initials="CL" w:date="2026-10-12T02:07:37Z">
+  <w:comment w:id="2" w:author="Claude" w:initials="CL" w:date="2026-10-12T02:16:44Z">
     <w:p>
       <w:pPr>
         <w:pStyle w:val="CommentText"/>
@@ -18297,7 +18259,7 @@
       </w:r>
     </w:p>
   </w:comment>
-  <w:comment w:id="3" w:author="Claude" w:initials="CL" w:date="2026-10-12T02:07:37Z">
+  <w:comment w:id="3" w:author="Claude" w:initials="CL" w:date="2026-10-12T02:16:44Z">
     <w:p>
       <w:pPr>
         <w:pStyle w:val="CommentText"/>
@@ -18313,23 +18275,7 @@
       </w:r>
     </w:p>
   </w:comment>
-  <w:comment w:id="4" w:author="Claude" w:initials="CL" w:date="2026-10-12T02:07:37Z">
-    <w:p>
-      <w:pPr>
-        <w:pStyle w:val="CommentText"/>
-      </w:pPr>
-      <w:r>
-        <w:rPr>
-          <w:rStyle w:val="CommentReference"/>
-        </w:rPr>
-        <w:annotationRef/>
-      </w:r>
-      <w:r>
-        <w:t>Víctor: pendiente de tu decisión o acción.</w:t>
-      </w:r>
-    </w:p>
-  </w:comment>
-  <w:comment w:id="5" w:author="Claude" w:initials="CL" w:date="2026-10-12T02:07:37Z">
+  <w:comment w:id="4" w:author="Claude" w:initials="CL" w:date="2026-10-12T02:16:44Z">
     <w:p>
       <w:pPr>
         <w:pStyle w:val="CommentText"/>

</xml_diff>

<commit_message>
Fase 1 día 1: 22 fuentes verificadas 2021+, base de fuentes, manual de redacción, marcadores y anexo Torvesa (#1) [IA: Claude]
- Búsqueda por APIs (235 candidatas, 176 descartadas) y búsqueda ampliada 2021+ con verificación por página
- 02_Fuentes/Base_Fuentes_2021-2026 (.md/.docx/.pdf) y reporte F1 del día con punto de retome
- MANUAL_TESIS: estructura UPS, APA 7, presentación de datos y declaración de IA; CLAUDE.md lo referencia y lee la app Bitácora Torvesa
- exportar_marcadores.py y Marcadores_Fuentes_2026-10-12.html para Chrome
- Anexo limpio del catálogo para Torvesa; registro de contribuciones al día

Co-Authored-By: Claude Opus 5.5 <noreply@anthropic.com>
</commit_message>
<xml_diff>
--- a/00_DOCUMENTO_MADRE.docx
+++ b/00_DOCUMENTO_MADRE.docx
@@ -62,7 +62,7 @@
                 <w:color w:val="CFD8E3"/>
                 <w:sz w:val="18"/>
               </w:rPr>
-              <w:t>Actualizado el 2026-10-11</w:t>
+              <w:t>Actualizado el 2026-10-12</w:t>
             </w:r>
           </w:p>
         </w:tc>
@@ -393,7 +393,7 @@
               <w:rPr>
                 <w:sz w:val="19"/>
               </w:rPr>
-              <w:t>Sprint 1 · 12–18 oct · Recopilar información (empieza el lunes)</w:t>
+              <w:t>Sprint 1 · 12–18 oct · Recopilar información</w:t>
             </w:r>
           </w:p>
         </w:tc>
@@ -435,7 +435,7 @@
               <w:rPr>
                 <w:sz w:val="19"/>
               </w:rPr>
-              <w:t>0 (0 verificadas)</w:t>
+              <w:t>262 (22 verificadas)</w:t>
             </w:r>
           </w:p>
         </w:tc>
@@ -5130,7 +5130,7 @@
               <w:rPr>
                 <w:sz w:val="19"/>
               </w:rPr>
-              <w:t xml:space="preserve">0 fichas en Problema, Contexto (0 verificadas) · </w:t>
+              <w:t xml:space="preserve">243 fichas en Problema, Contexto (11 verificadas) · </w:t>
             </w:r>
             <w:hyperlink r:id="rId16">
               <w:r>
@@ -5406,7 +5406,7 @@
               <w:rPr>
                 <w:sz w:val="19"/>
               </w:rPr>
-              <w:t xml:space="preserve">0 fichas en Evidencia_Datos, Tecnologia_IA, Normativa (0 verificadas) · </w:t>
+              <w:t xml:space="preserve">16 fichas en Evidencia_Datos, Tecnologia_IA, Normativa (11 verificadas) · </w:t>
             </w:r>
             <w:hyperlink r:id="rId16">
               <w:r>
@@ -5682,7 +5682,7 @@
               <w:rPr>
                 <w:sz w:val="19"/>
               </w:rPr>
-              <w:t xml:space="preserve">0 fichas en Metodologia (0 verificadas) · </w:t>
+              <w:t xml:space="preserve">3 fichas en Metodologia (0 verificadas) · </w:t>
             </w:r>
             <w:hyperlink r:id="rId16">
               <w:r>
@@ -5958,7 +5958,7 @@
               <w:rPr>
                 <w:sz w:val="19"/>
               </w:rPr>
-              <w:t xml:space="preserve">0 fichas en Problema (0 verificadas) · </w:t>
+              <w:t xml:space="preserve">190 fichas en Problema (7 verificadas) · </w:t>
             </w:r>
             <w:hyperlink r:id="rId16">
               <w:r>
@@ -6234,7 +6234,7 @@
               <w:rPr>
                 <w:sz w:val="19"/>
               </w:rPr>
-              <w:t xml:space="preserve">0 fichas en Tecnologia_IA, Casos_Estudio, Costos_Viabilidad, Normativa (0 verificadas) · </w:t>
+              <w:t xml:space="preserve">11 fichas en Tecnologia_IA, Casos_Estudio, Costos_Viabilidad, Normativa (8 verificadas) · </w:t>
             </w:r>
             <w:hyperlink r:id="rId16">
               <w:r>
@@ -6510,7 +6510,7 @@
               <w:rPr>
                 <w:sz w:val="19"/>
               </w:rPr>
-              <w:t xml:space="preserve">0 fichas en Evidencia_Datos (0 verificadas) · </w:t>
+              <w:t xml:space="preserve">5 fichas en Evidencia_Datos (3 verificadas) · </w:t>
             </w:r>
             <w:hyperlink r:id="rId16">
               <w:r>
@@ -6627,12 +6627,494 @@
         <w:t>5. Fuentes</w:t>
       </w:r>
     </w:p>
-    <w:p>
-      <w:r>
-        <w:rPr/>
-        <w:t>Todavía no hay fuentes en la base: la fase de fuentes empieza el lunes 12-oct.</w:t>
-      </w:r>
-    </w:p>
+    <w:tbl>
+      <w:tblPr>
+        <w:tblStyle w:val="TableGrid"/>
+        <w:tblW w:type="auto" w:w="0"/>
+        <w:jc w:val="center"/>
+        <w:tblLayout w:type="fixed"/>
+        <w:tblLook w:firstColumn="1" w:firstRow="1" w:lastColumn="0" w:lastRow="0" w:noHBand="0" w:noVBand="1" w:val="04A0"/>
+        <w:tblLayout w:type="fixed"/>
+        <w:tblBorders>
+          <w:top w:val="single" w:sz="4" w:color="B87333"/>
+          <w:left w:val="single" w:sz="4" w:color="B87333"/>
+          <w:bottom w:val="single" w:sz="4" w:color="B87333"/>
+          <w:right w:val="single" w:sz="4" w:color="B87333"/>
+          <w:insideH w:val="single" w:sz="4" w:color="C9A27E"/>
+          <w:insideV w:val="single" w:sz="4" w:color="C9A27E"/>
+        </w:tblBorders>
+      </w:tblPr>
+      <w:tblGrid>
+        <w:gridCol w:w="3402"/>
+        <w:gridCol w:w="1701"/>
+        <w:gridCol w:w="1701"/>
+      </w:tblGrid>
+      <w:tr>
+        <w:tc>
+          <w:tcPr>
+            <w:tcW w:type="dxa" w:w="3402"/>
+            <w:shd w:val="clear" w:color="auto" w:fill="0B1F3A"/>
+          </w:tcPr>
+          <w:p>
+            <w:pPr>
+              <w:spacing w:after="20"/>
+            </w:pPr>
+            <w:r/>
+            <w:r>
+              <w:rPr>
+                <w:rFonts w:ascii="Poppins" w:hAnsi="Poppins" w:cs="Poppins" w:eastAsia="Poppins"/>
+                <w:b/>
+                <w:color w:val="FFFFFF"/>
+                <w:sz w:val="19"/>
+              </w:rPr>
+              <w:t>Categoría</w:t>
+            </w:r>
+          </w:p>
+        </w:tc>
+        <w:tc>
+          <w:tcPr>
+            <w:tcW w:type="dxa" w:w="1701"/>
+            <w:shd w:val="clear" w:color="auto" w:fill="0B1F3A"/>
+          </w:tcPr>
+          <w:p>
+            <w:pPr>
+              <w:spacing w:after="20"/>
+            </w:pPr>
+            <w:r/>
+            <w:r>
+              <w:rPr>
+                <w:rFonts w:ascii="Poppins" w:hAnsi="Poppins" w:cs="Poppins" w:eastAsia="Poppins"/>
+                <w:b/>
+                <w:color w:val="FFFFFF"/>
+                <w:sz w:val="19"/>
+              </w:rPr>
+              <w:t>Fichas</w:t>
+            </w:r>
+          </w:p>
+        </w:tc>
+        <w:tc>
+          <w:tcPr>
+            <w:tcW w:type="dxa" w:w="1701"/>
+            <w:shd w:val="clear" w:color="auto" w:fill="0B1F3A"/>
+          </w:tcPr>
+          <w:p>
+            <w:pPr>
+              <w:spacing w:after="20"/>
+            </w:pPr>
+            <w:r/>
+            <w:r>
+              <w:rPr>
+                <w:rFonts w:ascii="Poppins" w:hAnsi="Poppins" w:cs="Poppins" w:eastAsia="Poppins"/>
+                <w:b/>
+                <w:color w:val="FFFFFF"/>
+                <w:sz w:val="19"/>
+              </w:rPr>
+              <w:t>Verificadas</w:t>
+            </w:r>
+          </w:p>
+        </w:tc>
+      </w:tr>
+      <w:tr>
+        <w:tc>
+          <w:tcPr>
+            <w:tcW w:type="dxa" w:w="3402"/>
+          </w:tcPr>
+          <w:p>
+            <w:pPr>
+              <w:spacing w:after="20"/>
+            </w:pPr>
+            <w:r>
+              <w:rPr>
+                <w:sz w:val="19"/>
+              </w:rPr>
+            </w:r>
+            <w:r>
+              <w:rPr>
+                <w:sz w:val="19"/>
+              </w:rPr>
+              <w:t>Contexto</w:t>
+            </w:r>
+          </w:p>
+        </w:tc>
+        <w:tc>
+          <w:tcPr>
+            <w:tcW w:type="dxa" w:w="1701"/>
+          </w:tcPr>
+          <w:p>
+            <w:pPr>
+              <w:spacing w:after="20"/>
+            </w:pPr>
+            <w:r>
+              <w:rPr>
+                <w:sz w:val="19"/>
+              </w:rPr>
+            </w:r>
+            <w:r>
+              <w:rPr>
+                <w:sz w:val="19"/>
+              </w:rPr>
+              <w:t>53</w:t>
+            </w:r>
+          </w:p>
+        </w:tc>
+        <w:tc>
+          <w:tcPr>
+            <w:tcW w:type="dxa" w:w="1701"/>
+          </w:tcPr>
+          <w:p>
+            <w:pPr>
+              <w:spacing w:after="20"/>
+            </w:pPr>
+            <w:r>
+              <w:rPr>
+                <w:sz w:val="19"/>
+              </w:rPr>
+            </w:r>
+            <w:r>
+              <w:rPr>
+                <w:sz w:val="19"/>
+              </w:rPr>
+              <w:t>4</w:t>
+            </w:r>
+          </w:p>
+        </w:tc>
+      </w:tr>
+      <w:tr>
+        <w:tc>
+          <w:tcPr>
+            <w:tcW w:type="dxa" w:w="3402"/>
+            <w:shd w:val="clear" w:color="auto" w:fill="EEF2F7"/>
+          </w:tcPr>
+          <w:p>
+            <w:pPr>
+              <w:spacing w:after="20"/>
+            </w:pPr>
+            <w:r>
+              <w:rPr>
+                <w:sz w:val="19"/>
+              </w:rPr>
+            </w:r>
+            <w:r>
+              <w:rPr>
+                <w:sz w:val="19"/>
+              </w:rPr>
+              <w:t>Evidencia_Datos</w:t>
+            </w:r>
+          </w:p>
+        </w:tc>
+        <w:tc>
+          <w:tcPr>
+            <w:tcW w:type="dxa" w:w="1701"/>
+            <w:shd w:val="clear" w:color="auto" w:fill="EEF2F7"/>
+          </w:tcPr>
+          <w:p>
+            <w:pPr>
+              <w:spacing w:after="20"/>
+            </w:pPr>
+            <w:r>
+              <w:rPr>
+                <w:sz w:val="19"/>
+              </w:rPr>
+            </w:r>
+            <w:r>
+              <w:rPr>
+                <w:sz w:val="19"/>
+              </w:rPr>
+              <w:t>5</w:t>
+            </w:r>
+          </w:p>
+        </w:tc>
+        <w:tc>
+          <w:tcPr>
+            <w:tcW w:type="dxa" w:w="1701"/>
+            <w:shd w:val="clear" w:color="auto" w:fill="EEF2F7"/>
+          </w:tcPr>
+          <w:p>
+            <w:pPr>
+              <w:spacing w:after="20"/>
+            </w:pPr>
+            <w:r>
+              <w:rPr>
+                <w:sz w:val="19"/>
+              </w:rPr>
+            </w:r>
+            <w:r>
+              <w:rPr>
+                <w:sz w:val="19"/>
+              </w:rPr>
+              <w:t>3</w:t>
+            </w:r>
+          </w:p>
+        </w:tc>
+      </w:tr>
+      <w:tr>
+        <w:tc>
+          <w:tcPr>
+            <w:tcW w:type="dxa" w:w="3402"/>
+          </w:tcPr>
+          <w:p>
+            <w:pPr>
+              <w:spacing w:after="20"/>
+            </w:pPr>
+            <w:r>
+              <w:rPr>
+                <w:sz w:val="19"/>
+              </w:rPr>
+            </w:r>
+            <w:r>
+              <w:rPr>
+                <w:sz w:val="19"/>
+              </w:rPr>
+              <w:t>Metodologia</w:t>
+            </w:r>
+          </w:p>
+        </w:tc>
+        <w:tc>
+          <w:tcPr>
+            <w:tcW w:type="dxa" w:w="1701"/>
+          </w:tcPr>
+          <w:p>
+            <w:pPr>
+              <w:spacing w:after="20"/>
+            </w:pPr>
+            <w:r>
+              <w:rPr>
+                <w:sz w:val="19"/>
+              </w:rPr>
+            </w:r>
+            <w:r>
+              <w:rPr>
+                <w:sz w:val="19"/>
+              </w:rPr>
+              <w:t>3</w:t>
+            </w:r>
+          </w:p>
+        </w:tc>
+        <w:tc>
+          <w:tcPr>
+            <w:tcW w:type="dxa" w:w="1701"/>
+          </w:tcPr>
+          <w:p>
+            <w:pPr>
+              <w:spacing w:after="20"/>
+            </w:pPr>
+            <w:r>
+              <w:rPr>
+                <w:sz w:val="19"/>
+              </w:rPr>
+            </w:r>
+            <w:r>
+              <w:rPr>
+                <w:sz w:val="19"/>
+              </w:rPr>
+              <w:t>0</w:t>
+            </w:r>
+          </w:p>
+        </w:tc>
+      </w:tr>
+      <w:tr>
+        <w:tc>
+          <w:tcPr>
+            <w:tcW w:type="dxa" w:w="3402"/>
+            <w:shd w:val="clear" w:color="auto" w:fill="EEF2F7"/>
+          </w:tcPr>
+          <w:p>
+            <w:pPr>
+              <w:spacing w:after="20"/>
+            </w:pPr>
+            <w:r>
+              <w:rPr>
+                <w:sz w:val="19"/>
+              </w:rPr>
+            </w:r>
+            <w:r>
+              <w:rPr>
+                <w:sz w:val="19"/>
+              </w:rPr>
+              <w:t>Normativa</w:t>
+            </w:r>
+          </w:p>
+        </w:tc>
+        <w:tc>
+          <w:tcPr>
+            <w:tcW w:type="dxa" w:w="1701"/>
+            <w:shd w:val="clear" w:color="auto" w:fill="EEF2F7"/>
+          </w:tcPr>
+          <w:p>
+            <w:pPr>
+              <w:spacing w:after="20"/>
+            </w:pPr>
+            <w:r>
+              <w:rPr>
+                <w:sz w:val="19"/>
+              </w:rPr>
+            </w:r>
+            <w:r>
+              <w:rPr>
+                <w:sz w:val="19"/>
+              </w:rPr>
+              <w:t>3</w:t>
+            </w:r>
+          </w:p>
+        </w:tc>
+        <w:tc>
+          <w:tcPr>
+            <w:tcW w:type="dxa" w:w="1701"/>
+            <w:shd w:val="clear" w:color="auto" w:fill="EEF2F7"/>
+          </w:tcPr>
+          <w:p>
+            <w:pPr>
+              <w:spacing w:after="20"/>
+            </w:pPr>
+            <w:r>
+              <w:rPr>
+                <w:sz w:val="19"/>
+              </w:rPr>
+            </w:r>
+            <w:r>
+              <w:rPr>
+                <w:sz w:val="19"/>
+              </w:rPr>
+              <w:t>1</w:t>
+            </w:r>
+          </w:p>
+        </w:tc>
+      </w:tr>
+      <w:tr>
+        <w:tc>
+          <w:tcPr>
+            <w:tcW w:type="dxa" w:w="3402"/>
+          </w:tcPr>
+          <w:p>
+            <w:pPr>
+              <w:spacing w:after="20"/>
+            </w:pPr>
+            <w:r>
+              <w:rPr>
+                <w:sz w:val="19"/>
+              </w:rPr>
+            </w:r>
+            <w:r>
+              <w:rPr>
+                <w:sz w:val="19"/>
+              </w:rPr>
+              <w:t>Problema</w:t>
+            </w:r>
+          </w:p>
+        </w:tc>
+        <w:tc>
+          <w:tcPr>
+            <w:tcW w:type="dxa" w:w="1701"/>
+          </w:tcPr>
+          <w:p>
+            <w:pPr>
+              <w:spacing w:after="20"/>
+            </w:pPr>
+            <w:r>
+              <w:rPr>
+                <w:sz w:val="19"/>
+              </w:rPr>
+            </w:r>
+            <w:r>
+              <w:rPr>
+                <w:sz w:val="19"/>
+              </w:rPr>
+              <w:t>190</w:t>
+            </w:r>
+          </w:p>
+        </w:tc>
+        <w:tc>
+          <w:tcPr>
+            <w:tcW w:type="dxa" w:w="1701"/>
+          </w:tcPr>
+          <w:p>
+            <w:pPr>
+              <w:spacing w:after="20"/>
+            </w:pPr>
+            <w:r>
+              <w:rPr>
+                <w:sz w:val="19"/>
+              </w:rPr>
+            </w:r>
+            <w:r>
+              <w:rPr>
+                <w:sz w:val="19"/>
+              </w:rPr>
+              <w:t>7</w:t>
+            </w:r>
+          </w:p>
+        </w:tc>
+      </w:tr>
+      <w:tr>
+        <w:tc>
+          <w:tcPr>
+            <w:tcW w:type="dxa" w:w="3402"/>
+            <w:shd w:val="clear" w:color="auto" w:fill="EEF2F7"/>
+          </w:tcPr>
+          <w:p>
+            <w:pPr>
+              <w:spacing w:after="20"/>
+            </w:pPr>
+            <w:r>
+              <w:rPr>
+                <w:sz w:val="19"/>
+              </w:rPr>
+            </w:r>
+            <w:r>
+              <w:rPr>
+                <w:sz w:val="19"/>
+              </w:rPr>
+              <w:t>Tecnologia_IA</w:t>
+            </w:r>
+          </w:p>
+        </w:tc>
+        <w:tc>
+          <w:tcPr>
+            <w:tcW w:type="dxa" w:w="1701"/>
+            <w:shd w:val="clear" w:color="auto" w:fill="EEF2F7"/>
+          </w:tcPr>
+          <w:p>
+            <w:pPr>
+              <w:spacing w:after="20"/>
+            </w:pPr>
+            <w:r>
+              <w:rPr>
+                <w:sz w:val="19"/>
+              </w:rPr>
+            </w:r>
+            <w:r>
+              <w:rPr>
+                <w:sz w:val="19"/>
+              </w:rPr>
+              <w:t>8</w:t>
+            </w:r>
+          </w:p>
+        </w:tc>
+        <w:tc>
+          <w:tcPr>
+            <w:tcW w:type="dxa" w:w="1701"/>
+            <w:shd w:val="clear" w:color="auto" w:fill="EEF2F7"/>
+          </w:tcPr>
+          <w:p>
+            <w:pPr>
+              <w:spacing w:after="20"/>
+            </w:pPr>
+            <w:r>
+              <w:rPr>
+                <w:sz w:val="19"/>
+              </w:rPr>
+            </w:r>
+            <w:r>
+              <w:rPr>
+                <w:sz w:val="19"/>
+              </w:rPr>
+              <w:t>7</w:t>
+            </w:r>
+          </w:p>
+        </w:tc>
+      </w:tr>
+    </w:tbl>
+    <w:p/>
     <w:p>
       <w:r>
         <w:rPr>
@@ -6676,7 +7158,7 @@
       </w:r>
       <w:r>
         <w:rPr/>
-        <w:t xml:space="preserve"> (aún no existe). Solo se cita lo «verificado» (abierto, con página).</w:t>
+        <w:t xml:space="preserve"> (solo en tu PC). Solo se cita lo «verificado» (abierto, con página).</w:t>
       </w:r>
     </w:p>
     <w:p>
@@ -18211,7 +18693,7 @@
 
 <file path=word/comments.xml><?xml version="1.0" encoding="utf-8"?>
 <w:comments xmlns:a="http://schemas.openxmlformats.org/drawingml/2006/main" xmlns:pic="http://schemas.openxmlformats.org/drawingml/2006/picture" xmlns:r="http://schemas.openxmlformats.org/officeDocument/2006/relationships" xmlns:w="http://schemas.openxmlformats.org/wordprocessingml/2006/main" xmlns:wp="http://schemas.openxmlformats.org/drawingml/2006/wordprocessingDrawing" xmlns:mc="http://schemas.openxmlformats.org/markup-compatibility/2006" xmlns:a14="http://schemas.microsoft.com/office/drawing/2010/main" xmlns:w14="http://schemas.microsoft.com/office/word/2010/wordml" xmlns:wpc="http://schemas.microsoft.com/office/word/2010/wordprocessingCanvas">
-  <w:comment w:id="0" w:author="Claude" w:initials="CL" w:date="2026-10-12T02:16:44Z">
+  <w:comment w:id="0" w:author="Claude" w:initials="CL" w:date="2026-10-12T16:08:14Z">
     <w:p>
       <w:pPr>
         <w:pStyle w:val="CommentText"/>
@@ -18227,7 +18709,7 @@
       </w:r>
     </w:p>
   </w:comment>
-  <w:comment w:id="1" w:author="Claude" w:initials="CL" w:date="2026-10-12T02:16:44Z">
+  <w:comment w:id="1" w:author="Claude" w:initials="CL" w:date="2026-10-12T16:08:14Z">
     <w:p>
       <w:pPr>
         <w:pStyle w:val="CommentText"/>
@@ -18243,7 +18725,7 @@
       </w:r>
     </w:p>
   </w:comment>
-  <w:comment w:id="2" w:author="Claude" w:initials="CL" w:date="2026-10-12T02:16:44Z">
+  <w:comment w:id="2" w:author="Claude" w:initials="CL" w:date="2026-10-12T16:08:14Z">
     <w:p>
       <w:pPr>
         <w:pStyle w:val="CommentText"/>
@@ -18259,7 +18741,7 @@
       </w:r>
     </w:p>
   </w:comment>
-  <w:comment w:id="3" w:author="Claude" w:initials="CL" w:date="2026-10-12T02:16:44Z">
+  <w:comment w:id="3" w:author="Claude" w:initials="CL" w:date="2026-10-12T16:08:14Z">
     <w:p>
       <w:pPr>
         <w:pStyle w:val="CommentText"/>
@@ -18275,7 +18757,7 @@
       </w:r>
     </w:p>
   </w:comment>
-  <w:comment w:id="4" w:author="Claude" w:initials="CL" w:date="2026-10-12T02:16:44Z">
+  <w:comment w:id="4" w:author="Claude" w:initials="CL" w:date="2026-10-12T16:08:14Z">
     <w:p>
       <w:pPr>
         <w:pStyle w:val="CommentText"/>

</xml_diff>

<commit_message>
Corte de la fase 1: 8 fuentes verificadas (Scrum, DSR, mixto, DT, SUS en español, LOPDP y Reglamento), matriz afirmación–fuente–estado v0.1, C1 v0.2, I1 v0.2, IA_DIEGO.md con bloques dobles, cronograma S1/S2 y antecedentes vigentes (#1 #2 #3 #4) [IA: Claude]
Co-Authored-By: Claude Opus 5.5 <noreply@anthropic.com>
</commit_message>
<xml_diff>
--- a/00_DOCUMENTO_MADRE.docx
+++ b/00_DOCUMENTO_MADRE.docx
@@ -62,7 +62,7 @@
                 <w:color w:val="CFD8E3"/>
                 <w:sz w:val="18"/>
               </w:rPr>
-              <w:t>Actualizado el 2026-10-12</w:t>
+              <w:t>Actualizado el 2026-10-18</w:t>
             </w:r>
           </w:p>
         </w:tc>
@@ -414,7 +414,7 @@
               <w:rPr>
                 <w:sz w:val="19"/>
               </w:rPr>
-              <w:t>0 de 166 tareas hechas (0 %)</w:t>
+              <w:t>7 de 166 tareas hechas (4 %)</w:t>
             </w:r>
           </w:p>
         </w:tc>
@@ -435,7 +435,7 @@
               <w:rPr>
                 <w:sz w:val="19"/>
               </w:rPr>
-              <w:t>262 (22 verificadas)</w:t>
+              <w:t>539 (30 verificadas)</w:t>
             </w:r>
           </w:p>
         </w:tc>
@@ -456,7 +456,7 @@
               <w:rPr>
                 <w:sz w:val="19"/>
               </w:rPr>
-              <w:t>2026-10-11 · Cambio de enfoque: documentos para personas</w:t>
+              <w:t>2026-10-18 · Revisión del sprint 1 (12–18 oct)</w:t>
             </w:r>
           </w:p>
         </w:tc>
@@ -743,7 +743,7 @@
               <w:rPr>
                 <w:sz w:val="19"/>
               </w:rPr>
-              <w:t>Pendiente</w:t>
+              <w:t>Hecho</w:t>
             </w:r>
           </w:p>
         </w:tc>
@@ -855,7 +855,7 @@
               <w:rPr>
                 <w:sz w:val="19"/>
               </w:rPr>
-              <w:t>Pendiente</w:t>
+              <w:t>Movido</w:t>
             </w:r>
           </w:p>
         </w:tc>
@@ -962,7 +962,7 @@
               <w:rPr>
                 <w:sz w:val="19"/>
               </w:rPr>
-              <w:t>Pendiente</w:t>
+              <w:t>Movido</w:t>
             </w:r>
           </w:p>
         </w:tc>
@@ -1074,7 +1074,7 @@
               <w:rPr>
                 <w:sz w:val="19"/>
               </w:rPr>
-              <w:t>Pendiente</w:t>
+              <w:t>En curso</w:t>
             </w:r>
           </w:p>
         </w:tc>
@@ -1181,7 +1181,7 @@
               <w:rPr>
                 <w:sz w:val="19"/>
               </w:rPr>
-              <w:t>Pendiente</w:t>
+              <w:t>Movido</w:t>
             </w:r>
           </w:p>
         </w:tc>
@@ -1293,7 +1293,7 @@
               <w:rPr>
                 <w:sz w:val="19"/>
               </w:rPr>
-              <w:t>Pendiente</w:t>
+              <w:t>En curso</w:t>
             </w:r>
           </w:p>
         </w:tc>
@@ -1400,7 +1400,7 @@
               <w:rPr>
                 <w:sz w:val="19"/>
               </w:rPr>
-              <w:t>Pendiente</w:t>
+              <w:t>Hecho</w:t>
             </w:r>
           </w:p>
         </w:tc>
@@ -1512,7 +1512,7 @@
               <w:rPr>
                 <w:sz w:val="19"/>
               </w:rPr>
-              <w:t>Pendiente</w:t>
+              <w:t>Movido</w:t>
             </w:r>
           </w:p>
         </w:tc>
@@ -1619,7 +1619,7 @@
               <w:rPr>
                 <w:sz w:val="19"/>
               </w:rPr>
-              <w:t>Pendiente</w:t>
+              <w:t>Movido</w:t>
             </w:r>
           </w:p>
         </w:tc>
@@ -1731,7 +1731,7 @@
               <w:rPr>
                 <w:sz w:val="19"/>
               </w:rPr>
-              <w:t>Pendiente</w:t>
+              <w:t>Movido</w:t>
             </w:r>
           </w:p>
         </w:tc>
@@ -1838,7 +1838,7 @@
               <w:rPr>
                 <w:sz w:val="19"/>
               </w:rPr>
-              <w:t>Pendiente</w:t>
+              <w:t>Hecho</w:t>
             </w:r>
           </w:p>
         </w:tc>
@@ -1950,7 +1950,7 @@
               <w:rPr>
                 <w:sz w:val="19"/>
               </w:rPr>
-              <w:t>Pendiente</w:t>
+              <w:t>Hecho</w:t>
             </w:r>
           </w:p>
         </w:tc>
@@ -2057,7 +2057,7 @@
               <w:rPr>
                 <w:sz w:val="19"/>
               </w:rPr>
-              <w:t>Pendiente</w:t>
+              <w:t>Movido</w:t>
             </w:r>
           </w:p>
         </w:tc>
@@ -2169,7 +2169,7 @@
               <w:rPr>
                 <w:sz w:val="19"/>
               </w:rPr>
-              <w:t>Pendiente</w:t>
+              <w:t>Movido</w:t>
             </w:r>
           </w:p>
         </w:tc>
@@ -2276,7 +2276,7 @@
               <w:rPr>
                 <w:sz w:val="19"/>
               </w:rPr>
-              <w:t>Pendiente</w:t>
+              <w:t>Movido</w:t>
             </w:r>
           </w:p>
         </w:tc>
@@ -2388,7 +2388,7 @@
               <w:rPr>
                 <w:sz w:val="19"/>
               </w:rPr>
-              <w:t>Pendiente</w:t>
+              <w:t>Movido</w:t>
             </w:r>
           </w:p>
         </w:tc>
@@ -2495,7 +2495,7 @@
               <w:rPr>
                 <w:sz w:val="19"/>
               </w:rPr>
-              <w:t>Pendiente</w:t>
+              <w:t>Movido</w:t>
             </w:r>
           </w:p>
         </w:tc>
@@ -2607,7 +2607,7 @@
               <w:rPr>
                 <w:sz w:val="19"/>
               </w:rPr>
-              <w:t>Pendiente</w:t>
+              <w:t>Movido</w:t>
             </w:r>
           </w:p>
         </w:tc>
@@ -2714,7 +2714,7 @@
               <w:rPr>
                 <w:sz w:val="19"/>
               </w:rPr>
-              <w:t>Pendiente</w:t>
+              <w:t>Hecho</w:t>
             </w:r>
           </w:p>
         </w:tc>
@@ -2826,7 +2826,7 @@
               <w:rPr>
                 <w:sz w:val="19"/>
               </w:rPr>
-              <w:t>Pendiente</w:t>
+              <w:t>Hecho</w:t>
             </w:r>
           </w:p>
         </w:tc>
@@ -2933,7 +2933,7 @@
               <w:rPr>
                 <w:sz w:val="19"/>
               </w:rPr>
-              <w:t>Pendiente</w:t>
+              <w:t>En curso</w:t>
             </w:r>
           </w:p>
         </w:tc>
@@ -3045,7 +3045,7 @@
               <w:rPr>
                 <w:sz w:val="19"/>
               </w:rPr>
-              <w:t>Pendiente</w:t>
+              <w:t>Movido</w:t>
             </w:r>
           </w:p>
         </w:tc>
@@ -3152,7 +3152,7 @@
               <w:rPr>
                 <w:sz w:val="19"/>
               </w:rPr>
-              <w:t>Pendiente</w:t>
+              <w:t>Movido</w:t>
             </w:r>
           </w:p>
         </w:tc>
@@ -3264,7 +3264,7 @@
               <w:rPr>
                 <w:sz w:val="19"/>
               </w:rPr>
-              <w:t>Pendiente</w:t>
+              <w:t>Movido</w:t>
             </w:r>
           </w:p>
         </w:tc>
@@ -3371,7 +3371,7 @@
               <w:rPr>
                 <w:sz w:val="19"/>
               </w:rPr>
-              <w:t>Pendiente</w:t>
+              <w:t>Hecho</w:t>
             </w:r>
           </w:p>
         </w:tc>
@@ -3483,7 +3483,7 @@
               <w:rPr>
                 <w:sz w:val="19"/>
               </w:rPr>
-              <w:t>Pendiente</w:t>
+              <w:t>Movido</w:t>
             </w:r>
           </w:p>
         </w:tc>
@@ -3590,7 +3590,7 @@
               <w:rPr>
                 <w:sz w:val="19"/>
               </w:rPr>
-              <w:t>Pendiente</w:t>
+              <w:t>En curso</w:t>
             </w:r>
           </w:p>
         </w:tc>
@@ -3613,11 +3613,11 @@
         <w:rPr>
           <w:b/>
         </w:rPr>
-        <w:t>El diseño que firmó la tutora presenta datos simulados como si fueran reales.</w:t>
+        <w:t>El campo depende de Torvesa:</w:t>
       </w:r>
       <w:r>
         <w:rPr/>
-        <w:t xml:space="preserve"> Hay que contárselo mañana, antes de la primera revisión formal.</w:t>
+        <w:t xml:space="preserve"> sin línea base no hay análisis de datos (S2-T02, S2-T04) ni proceso AS-IS completo.</w:t>
       </w:r>
     </w:p>
     <w:p>
@@ -3626,7 +3626,7 @@
       </w:pPr>
       <w:r>
         <w:rPr/>
-        <w:t>Las metas que dependen de la línea base (la medición del «antes») quedan sin dato hasta que Torvesa autorice el campo: responder en menos de 15 minutos, perder menos clientes antes del primer contacto, encontrar el historial de un cliente ajeno y la usabilidad del sistema.</w:t>
+        <w:t>19 de 42 filas de la matriz siguen sin fuente; el capítulo 2 (CRM, A21–A27) es lo más urgente para Víctor.</w:t>
       </w:r>
     </w:p>
     <w:p>
@@ -3635,16 +3635,7 @@
       </w:pPr>
       <w:r>
         <w:rPr/>
-        <w:t>El dato «30–44 minutos por cotización» no tiene fuente: se medirá con cronómetro si Torvesa lo permite.</w:t>
-      </w:r>
-    </w:p>
-    <w:p>
-      <w:pPr>
-        <w:pStyle w:val="ListBullet"/>
-      </w:pPr>
-      <w:r>
-        <w:rPr/>
-        <w:t>No sabemos con certeza a qué se dedica Torvesa (en el SRI figura la construcción de vías; las encuestas simuladas hablaban de inmuebles).</w:t>
+        <w:t>La fecha de entrega (D5: 15-dic o enero) sigue sin confirmar.</w:t>
       </w:r>
     </w:p>
     <w:p>
@@ -3662,7 +3653,7 @@
       <w:commentRangeStart w:id="0"/>
       <w:r>
         <w:rPr/>
-        <w:t>Mañana: conversar con la tutora usando la hoja de 5 puntos (</w:t>
+        <w:t xml:space="preserve">Bajar a mano los PDF de la lista de </w:t>
       </w:r>
       <w:r>
         <w:rPr>
@@ -3670,11 +3661,11 @@
           <w:color w:val="0B1F3A"/>
           <w:sz w:val="19"/>
         </w:rPr>
-        <w:t>08_Reuniones_Tutora/2026-10-12_Puntos_Tutora.pdf</w:t>
+        <w:t>F1_reporte_2026-10-18.md</w:t>
       </w:r>
       <w:r>
         <w:rPr/>
-        <w:t>) y escribir el acta ese mismo día.</w:t>
+        <w:t>.</w:t>
       </w:r>
       <w:commentRangeEnd w:id="0"/>
       <w:r>
@@ -3691,7 +3682,7 @@
       <w:commentRangeStart w:id="1"/>
       <w:r>
         <w:rPr/>
-        <w:t xml:space="preserve">Mañana: enviar el correo a Torvesa (borrador en </w:t>
+        <w:t xml:space="preserve">Revisar la matriz, C1 v0.2, I1 v0.2, el resumen del problema y </w:t>
       </w:r>
       <w:r>
         <w:rPr>
@@ -3699,11 +3690,11 @@
           <w:color w:val="0B1F3A"/>
           <w:sz w:val="19"/>
         </w:rPr>
-        <w:t>11_Planificacion/2026-10-12_Correo_Torvesa_borrador.docx</w:t>
+        <w:t>IA_DIEGO.md</w:t>
       </w:r>
       <w:r>
         <w:rPr/>
-        <w:t>), con respuesta hasta el miércoles 14.</w:t>
+        <w:t>.</w:t>
       </w:r>
       <w:commentRangeEnd w:id="1"/>
       <w:r>
@@ -3720,19 +3711,7 @@
       <w:commentRangeStart w:id="2"/>
       <w:r>
         <w:rPr/>
-        <w:t xml:space="preserve">Borrar la carpeta vacía </w:t>
-      </w:r>
-      <w:r>
-        <w:rPr>
-          <w:rFonts w:ascii="Consolas" w:hAnsi="Consolas" w:cs="Consolas" w:eastAsia="Consolas"/>
-          <w:color w:val="0B1F3A"/>
-          <w:sz w:val="19"/>
-        </w:rPr>
-        <w:t>F:\Compartir_Diego_PENDIENTE</w:t>
-      </w:r>
-      <w:r>
-        <w:rPr/>
-        <w:t xml:space="preserve"> (la herramienta no me deja borrar carpetas en la raíz de F:).</w:t>
+        <w:t>Confirmar con la tutora la fecha de entrega (D5).</w:t>
       </w:r>
       <w:commentRangeEnd w:id="2"/>
       <w:r>
@@ -3749,19 +3728,7 @@
       <w:commentRangeStart w:id="3"/>
       <w:r>
         <w:rPr/>
-        <w:t xml:space="preserve">Elegir cuál es el Informe Final y cuál es el pitch deck vigentes (hay varias versiones en </w:t>
-      </w:r>
-      <w:r>
-        <w:rPr>
-          <w:rFonts w:ascii="Consolas" w:hAnsi="Consolas" w:cs="Consolas" w:eastAsia="Consolas"/>
-          <w:color w:val="0B1F3A"/>
-          <w:sz w:val="19"/>
-        </w:rPr>
-        <w:t>10_Antecedentes_Propios</w:t>
-      </w:r>
-      <w:r>
-        <w:rPr/>
-        <w:t>).</w:t>
+        <w:t>Llamada de 20 min con Diego: «explícame lo tuyo».</w:t>
       </w:r>
       <w:commentRangeEnd w:id="3"/>
       <w:r>
@@ -3769,23 +3736,6 @@
           <w:rStyle w:val="CommentReference"/>
         </w:rPr>
         <w:commentReference w:id="3"/>
-      </w:r>
-    </w:p>
-    <w:p>
-      <w:pPr>
-        <w:pStyle w:val="ListBullet"/>
-      </w:pPr>
-      <w:commentRangeStart w:id="4"/>
-      <w:r>
-        <w:rPr/>
-        <w:t>Avisar a Diego que acepte la invitación de GitHub (vence el 18-oct).</w:t>
-      </w:r>
-      <w:commentRangeEnd w:id="4"/>
-      <w:r>
-        <w:rPr>
-          <w:rStyle w:val="CommentReference"/>
-        </w:rPr>
-        <w:commentReference w:id="4"/>
       </w:r>
     </w:p>
     <w:p>
@@ -5406,7 +5356,7 @@
               <w:rPr>
                 <w:sz w:val="19"/>
               </w:rPr>
-              <w:t xml:space="preserve">16 fichas en Evidencia_Datos, Tecnologia_IA, Normativa (11 verificadas) · </w:t>
+              <w:t xml:space="preserve">55 fichas en Evidencia_Datos, Tecnologia_IA, Normativa (13 verificadas) · </w:t>
             </w:r>
             <w:hyperlink r:id="rId16">
               <w:r>
@@ -5682,7 +5632,7 @@
               <w:rPr>
                 <w:sz w:val="19"/>
               </w:rPr>
-              <w:t xml:space="preserve">3 fichas en Metodologia (0 verificadas) · </w:t>
+              <w:t xml:space="preserve">241 fichas en Metodologia (6 verificadas) · </w:t>
             </w:r>
             <w:hyperlink r:id="rId16">
               <w:r>
@@ -6234,7 +6184,7 @@
               <w:rPr>
                 <w:sz w:val="19"/>
               </w:rPr>
-              <w:t xml:space="preserve">11 fichas en Tecnologia_IA, Casos_Estudio, Costos_Viabilidad, Normativa (8 verificadas) · </w:t>
+              <w:t xml:space="preserve">50 fichas en Tecnologia_IA, Casos_Estudio, Costos_Viabilidad, Normativa (10 verificadas) · </w:t>
             </w:r>
             <w:hyperlink r:id="rId16">
               <w:r>
@@ -6886,7 +6836,7 @@
               <w:rPr>
                 <w:sz w:val="19"/>
               </w:rPr>
-              <w:t>3</w:t>
+              <w:t>241</w:t>
             </w:r>
           </w:p>
         </w:tc>
@@ -6907,7 +6857,7 @@
               <w:rPr>
                 <w:sz w:val="19"/>
               </w:rPr>
-              <w:t>0</w:t>
+              <w:t>6</w:t>
             </w:r>
           </w:p>
         </w:tc>
@@ -6953,7 +6903,7 @@
               <w:rPr>
                 <w:sz w:val="19"/>
               </w:rPr>
-              <w:t>3</w:t>
+              <w:t>42</w:t>
             </w:r>
           </w:p>
         </w:tc>
@@ -6975,7 +6925,7 @@
               <w:rPr>
                 <w:sz w:val="19"/>
               </w:rPr>
-              <w:t>1</w:t>
+              <w:t>3</w:t>
             </w:r>
           </w:p>
         </w:tc>
@@ -7148,17 +7098,18 @@
         <w:rPr/>
         <w:t xml:space="preserve"> </w:t>
       </w:r>
-      <w:r>
-        <w:rPr>
-          <w:rFonts w:ascii="Consolas" w:hAnsi="Consolas" w:cs="Consolas" w:eastAsia="Consolas"/>
-          <w:color w:val="0B1F3A"/>
-          <w:sz w:val="19"/>
-        </w:rPr>
-        <w:t>fuentes.csv</w:t>
-      </w:r>
+      <w:hyperlink r:id="rId33">
+        <w:r>
+          <w:rPr>
+            <w:color w:val="B87333"/>
+            <w:u w:val="single"/>
+          </w:rPr>
+          <w:t xml:space="preserve">fuentes.csv</w:t>
+        </w:r>
+      </w:hyperlink>
       <w:r>
         <w:rPr/>
-        <w:t xml:space="preserve"> (solo en tu PC). Solo se cita lo «verificado» (abierto, con página).</w:t>
+        <w:t>. Solo se cita lo «verificado» (abierto, con página).</w:t>
       </w:r>
     </w:p>
     <w:p>
@@ -7315,7 +7266,7 @@
                 <w:sz w:val="19"/>
               </w:rPr>
             </w:r>
-            <w:hyperlink r:id="rId33">
+            <w:hyperlink r:id="rId34">
               <w:r>
                 <w:rPr>
                   <w:color w:val="B87333"/>
@@ -7386,7 +7337,7 @@
                 <w:sz w:val="19"/>
               </w:rPr>
             </w:r>
-            <w:hyperlink r:id="rId33">
+            <w:hyperlink r:id="rId34">
               <w:r>
                 <w:rPr>
                   <w:color w:val="B87333"/>
@@ -7454,7 +7405,7 @@
                 <w:sz w:val="19"/>
               </w:rPr>
             </w:r>
-            <w:hyperlink r:id="rId33">
+            <w:hyperlink r:id="rId34">
               <w:r>
                 <w:rPr>
                   <w:color w:val="B87333"/>
@@ -7525,7 +7476,7 @@
                 <w:sz w:val="19"/>
               </w:rPr>
             </w:r>
-            <w:hyperlink r:id="rId33">
+            <w:hyperlink r:id="rId34">
               <w:r>
                 <w:rPr>
                   <w:color w:val="B87333"/>
@@ -7701,7 +7652,7 @@
               <w:rPr/>
               <w:t xml:space="preserve">: no se usan. </w:t>
             </w:r>
-            <w:hyperlink r:id="rId34">
+            <w:hyperlink r:id="rId35">
               <w:r>
                 <w:rPr>
                   <w:color w:val="B87333"/>
@@ -8236,7 +8187,7 @@
         <w:rPr/>
         <w:t xml:space="preserve">Archivos: aún no existen — la carpeta es </w:t>
       </w:r>
-      <w:hyperlink r:id="rId35">
+      <w:hyperlink r:id="rId36">
         <w:r>
           <w:rPr>
             <w:color w:val="B87333"/>
@@ -8476,7 +8427,7 @@
               <w:rPr>
                 <w:sz w:val="19"/>
               </w:rPr>
-              <w:t>Falta el OK de la tutora</w:t>
+              <w:t>Tomada (tutora sin objeciones, 12-oct; falta el acta)</w:t>
             </w:r>
           </w:p>
         </w:tc>
@@ -8742,7 +8693,7 @@
               <w:rPr>
                 <w:sz w:val="19"/>
               </w:rPr>
-              <w:t>Falta el OK de la tutora</w:t>
+              <w:t>Tomada (tutora sin objeciones, 12-oct; falta el acta)</w:t>
             </w:r>
           </w:p>
         </w:tc>
@@ -8835,7 +8786,7 @@
         <w:rPr/>
         <w:t xml:space="preserve"> datos simulados, fecha 15-dic, D2, D6 y duración de la validación — </w:t>
       </w:r>
-      <w:hyperlink r:id="rId36">
+      <w:hyperlink r:id="rId37">
         <w:r>
           <w:rPr>
             <w:color w:val="B87333"/>
@@ -18693,7 +18644,7 @@
 
 <file path=word/comments.xml><?xml version="1.0" encoding="utf-8"?>
 <w:comments xmlns:a="http://schemas.openxmlformats.org/drawingml/2006/main" xmlns:pic="http://schemas.openxmlformats.org/drawingml/2006/picture" xmlns:r="http://schemas.openxmlformats.org/officeDocument/2006/relationships" xmlns:w="http://schemas.openxmlformats.org/wordprocessingml/2006/main" xmlns:wp="http://schemas.openxmlformats.org/drawingml/2006/wordprocessingDrawing" xmlns:mc="http://schemas.openxmlformats.org/markup-compatibility/2006" xmlns:a14="http://schemas.microsoft.com/office/drawing/2010/main" xmlns:w14="http://schemas.microsoft.com/office/word/2010/wordml" xmlns:wpc="http://schemas.microsoft.com/office/word/2010/wordprocessingCanvas">
-  <w:comment w:id="0" w:author="Claude" w:initials="CL" w:date="2026-10-12T16:08:14Z">
+  <w:comment w:id="0" w:author="Claude" w:initials="CL" w:date="2026-10-18T20:32:40Z">
     <w:p>
       <w:pPr>
         <w:pStyle w:val="CommentText"/>
@@ -18709,7 +18660,7 @@
       </w:r>
     </w:p>
   </w:comment>
-  <w:comment w:id="1" w:author="Claude" w:initials="CL" w:date="2026-10-12T16:08:14Z">
+  <w:comment w:id="1" w:author="Claude" w:initials="CL" w:date="2026-10-18T20:32:40Z">
     <w:p>
       <w:pPr>
         <w:pStyle w:val="CommentText"/>
@@ -18725,7 +18676,7 @@
       </w:r>
     </w:p>
   </w:comment>
-  <w:comment w:id="2" w:author="Claude" w:initials="CL" w:date="2026-10-12T16:08:14Z">
+  <w:comment w:id="2" w:author="Claude" w:initials="CL" w:date="2026-10-18T20:32:40Z">
     <w:p>
       <w:pPr>
         <w:pStyle w:val="CommentText"/>
@@ -18741,23 +18692,7 @@
       </w:r>
     </w:p>
   </w:comment>
-  <w:comment w:id="3" w:author="Claude" w:initials="CL" w:date="2026-10-12T16:08:14Z">
-    <w:p>
-      <w:pPr>
-        <w:pStyle w:val="CommentText"/>
-      </w:pPr>
-      <w:r>
-        <w:rPr>
-          <w:rStyle w:val="CommentReference"/>
-        </w:rPr>
-        <w:annotationRef/>
-      </w:r>
-      <w:r>
-        <w:t>Víctor: pendiente de tu decisión o acción.</w:t>
-      </w:r>
-    </w:p>
-  </w:comment>
-  <w:comment w:id="4" w:author="Claude" w:initials="CL" w:date="2026-10-12T16:08:14Z">
+  <w:comment w:id="3" w:author="Claude" w:initials="CL" w:date="2026-10-18T20:32:40Z">
     <w:p>
       <w:pPr>
         <w:pStyle w:val="CommentText"/>

</xml_diff>

<commit_message>
D5 tomada: fecha límite el 4-ene-2027 (documento final listo para revisión); ejemplos de tesis UPS con cédulas fuera del repo [IA: Claude]
Co-Authored-By: Claude Opus 5.5 <noreply@anthropic.com>
</commit_message>
<xml_diff>
--- a/00_DOCUMENTO_MADRE.docx
+++ b/00_DOCUMENTO_MADRE.docx
@@ -8604,7 +8604,7 @@
               <w:rPr>
                 <w:sz w:val="19"/>
               </w:rPr>
-              <w:t>Entrega en enero (escenario B), salvo que la tutora confirme el 15-dic como fecha obligatoria (escenario A)</w:t>
+              <w:t>Entrega en enero (escenario B): el documento final completo, listo para revisión, el lunes 4-ene-2027</w:t>
             </w:r>
           </w:p>
         </w:tc>
@@ -8625,7 +8625,7 @@
               <w:rPr>
                 <w:sz w:val="19"/>
               </w:rPr>
-              <w:t>Falta la respuesta de la tutora</w:t>
+              <w:t>Tomada (Víctor, 18-oct)</w:t>
             </w:r>
           </w:p>
         </w:tc>
@@ -18644,7 +18644,7 @@
 
 <file path=word/comments.xml><?xml version="1.0" encoding="utf-8"?>
 <w:comments xmlns:a="http://schemas.openxmlformats.org/drawingml/2006/main" xmlns:pic="http://schemas.openxmlformats.org/drawingml/2006/picture" xmlns:r="http://schemas.openxmlformats.org/officeDocument/2006/relationships" xmlns:w="http://schemas.openxmlformats.org/wordprocessingml/2006/main" xmlns:wp="http://schemas.openxmlformats.org/drawingml/2006/wordprocessingDrawing" xmlns:mc="http://schemas.openxmlformats.org/markup-compatibility/2006" xmlns:a14="http://schemas.microsoft.com/office/drawing/2010/main" xmlns:w14="http://schemas.microsoft.com/office/word/2010/wordml" xmlns:wpc="http://schemas.microsoft.com/office/word/2010/wordprocessingCanvas">
-  <w:comment w:id="0" w:author="Claude" w:initials="CL" w:date="2026-10-18T20:32:40Z">
+  <w:comment w:id="0" w:author="Claude" w:initials="CL" w:date="2026-10-18T21:09:12Z">
     <w:p>
       <w:pPr>
         <w:pStyle w:val="CommentText"/>
@@ -18660,7 +18660,7 @@
       </w:r>
     </w:p>
   </w:comment>
-  <w:comment w:id="1" w:author="Claude" w:initials="CL" w:date="2026-10-18T20:32:40Z">
+  <w:comment w:id="1" w:author="Claude" w:initials="CL" w:date="2026-10-18T21:09:12Z">
     <w:p>
       <w:pPr>
         <w:pStyle w:val="CommentText"/>
@@ -18676,7 +18676,7 @@
       </w:r>
     </w:p>
   </w:comment>
-  <w:comment w:id="2" w:author="Claude" w:initials="CL" w:date="2026-10-18T20:32:40Z">
+  <w:comment w:id="2" w:author="Claude" w:initials="CL" w:date="2026-10-18T21:09:12Z">
     <w:p>
       <w:pPr>
         <w:pStyle w:val="CommentText"/>
@@ -18692,7 +18692,7 @@
       </w:r>
     </w:p>
   </w:comment>
-  <w:comment w:id="3" w:author="Claude" w:initials="CL" w:date="2026-10-18T20:32:40Z">
+  <w:comment w:id="3" w:author="Claude" w:initials="CL" w:date="2026-10-18T21:09:12Z">
     <w:p>
       <w:pPr>
         <w:pStyle w:val="CommentText"/>

</xml_diff>

<commit_message>
Informe de avance 2026-10-18 (automático)
</commit_message>
<xml_diff>
--- a/00_DOCUMENTO_MADRE.docx
+++ b/00_DOCUMENTO_MADRE.docx
@@ -18644,7 +18644,7 @@
 
 <file path=word/comments.xml><?xml version="1.0" encoding="utf-8"?>
 <w:comments xmlns:a="http://schemas.openxmlformats.org/drawingml/2006/main" xmlns:pic="http://schemas.openxmlformats.org/drawingml/2006/picture" xmlns:r="http://schemas.openxmlformats.org/officeDocument/2006/relationships" xmlns:w="http://schemas.openxmlformats.org/wordprocessingml/2006/main" xmlns:wp="http://schemas.openxmlformats.org/drawingml/2006/wordprocessingDrawing" xmlns:mc="http://schemas.openxmlformats.org/markup-compatibility/2006" xmlns:a14="http://schemas.microsoft.com/office/drawing/2010/main" xmlns:w14="http://schemas.microsoft.com/office/word/2010/wordml" xmlns:wpc="http://schemas.microsoft.com/office/word/2010/wordprocessingCanvas">
-  <w:comment w:id="0" w:author="Claude" w:initials="CL" w:date="2026-10-18T21:09:12Z">
+  <w:comment w:id="0" w:author="Claude" w:initials="CL" w:date="2026-10-19T02:00:28Z">
     <w:p>
       <w:pPr>
         <w:pStyle w:val="CommentText"/>
@@ -18660,7 +18660,7 @@
       </w:r>
     </w:p>
   </w:comment>
-  <w:comment w:id="1" w:author="Claude" w:initials="CL" w:date="2026-10-18T21:09:12Z">
+  <w:comment w:id="1" w:author="Claude" w:initials="CL" w:date="2026-10-19T02:00:28Z">
     <w:p>
       <w:pPr>
         <w:pStyle w:val="CommentText"/>
@@ -18676,7 +18676,7 @@
       </w:r>
     </w:p>
   </w:comment>
-  <w:comment w:id="2" w:author="Claude" w:initials="CL" w:date="2026-10-18T21:09:12Z">
+  <w:comment w:id="2" w:author="Claude" w:initials="CL" w:date="2026-10-19T02:00:28Z">
     <w:p>
       <w:pPr>
         <w:pStyle w:val="CommentText"/>
@@ -18692,7 +18692,7 @@
       </w:r>
     </w:p>
   </w:comment>
-  <w:comment w:id="3" w:author="Claude" w:initials="CL" w:date="2026-10-18T21:09:12Z">
+  <w:comment w:id="3" w:author="Claude" w:initials="CL" w:date="2026-10-19T02:00:28Z">
     <w:p>
       <w:pPr>
         <w:pStyle w:val="CommentText"/>

</xml_diff>

<commit_message>
Sprint 2 adelantado: caps. I (2 partes), II y III y lienzo en v0.1 con control de cambios, 7 fuentes verificadas (37), matriz v0.2, resumen del cap. I para Diego, cronograma y app actualizados (#13 #14 #15 #58) [IA: Claude]
Co-Authored-By: Claude Opus 5.5 <noreply@anthropic.com>
</commit_message>
<xml_diff>
--- a/00_DOCUMENTO_MADRE.docx
+++ b/00_DOCUMENTO_MADRE.docx
@@ -62,7 +62,7 @@
                 <w:color w:val="CFD8E3"/>
                 <w:sz w:val="18"/>
               </w:rPr>
-              <w:t>Actualizado el 2026-10-18</w:t>
+              <w:t>Actualizado el 2026-10-19</w:t>
             </w:r>
           </w:p>
         </w:tc>
@@ -393,7 +393,7 @@
               <w:rPr>
                 <w:sz w:val="19"/>
               </w:rPr>
-              <w:t>Sprint 1 · 12–18 oct · Recopilar información</w:t>
+              <w:t>Sprint 2 · 19–25 oct · Redactar capítulos</w:t>
             </w:r>
           </w:p>
         </w:tc>
@@ -414,7 +414,7 @@
               <w:rPr>
                 <w:sz w:val="19"/>
               </w:rPr>
-              <w:t>7 de 166 tareas hechas (4 %)</w:t>
+              <w:t>8 de 166 tareas hechas (5 %)</w:t>
             </w:r>
           </w:p>
         </w:tc>
@@ -435,7 +435,7 @@
               <w:rPr>
                 <w:sz w:val="19"/>
               </w:rPr>
-              <w:t>539 (30 verificadas)</w:t>
+              <w:t>544 (37 verificadas)</w:t>
             </w:r>
           </w:p>
         </w:tc>
@@ -456,7 +456,7 @@
               <w:rPr>
                 <w:sz w:val="19"/>
               </w:rPr>
-              <w:t>2026-10-18 · Revisión del sprint 1 (12–18 oct)</w:t>
+              <w:t>2026-10-19 · Sprint 2, día 1 (lunes)</w:t>
             </w:r>
           </w:p>
         </w:tc>
@@ -507,7 +507,7 @@
         <w:pStyle w:val="Heading2"/>
       </w:pPr>
       <w:r>
-        <w:t>Esta semana · Buscar fuentes, hablar con la tutora y con Torvesa, preparar el campo</w:t>
+        <w:t>Esta semana · Primeros borradores de los capítulos 1–3; Diego analiza los datos y dibuja el proceso actual</w:t>
       </w:r>
     </w:p>
     <w:tbl>
@@ -659,7 +659,7 @@
               <w:rPr>
                 <w:sz w:val="19"/>
               </w:rPr>
-              <w:t>lun 12-oct</w:t>
+              <w:t>lun 19-oct</w:t>
             </w:r>
           </w:p>
         </w:tc>
@@ -680,7 +680,7 @@
               <w:rPr>
                 <w:sz w:val="19"/>
               </w:rPr>
-              <w:t>Conversar con la tutora sobre los 5 cambios, para tener su aprobación</w:t>
+              <w:t>Escribir el capítulo 1, parte 1 (problema y evidencias), para tener el primer borrador</w:t>
             </w:r>
           </w:p>
         </w:tc>
@@ -722,7 +722,7 @@
               <w:rPr>
                 <w:sz w:val="19"/>
               </w:rPr>
-              <w:t>UPS Quito, en persona · llevar 08_Reuniones_Tutora/2026-10-12_Puntos_Tutora.pdf</w:t>
+              <w:t>06_Capitulos/</w:t>
             </w:r>
           </w:p>
         </w:tc>
@@ -743,7 +743,7 @@
               <w:rPr>
                 <w:sz w:val="19"/>
               </w:rPr>
-              <w:t>Hecho</w:t>
+              <w:t>En curso</w:t>
             </w:r>
           </w:p>
         </w:tc>
@@ -767,7 +767,7 @@
               <w:rPr>
                 <w:sz w:val="19"/>
               </w:rPr>
-              <w:t>lun 12-oct</w:t>
+              <w:t>lun 19-oct</w:t>
             </w:r>
           </w:p>
         </w:tc>
@@ -789,7 +789,7 @@
               <w:rPr>
                 <w:sz w:val="19"/>
               </w:rPr>
-              <w:t>Escribir el acta de la conversación, para que quede por escrito lo que decidió</w:t>
+              <w:t>Analizar los datos de campo (tablas y gráficos simples), para calcular la línea base</w:t>
             </w:r>
           </w:p>
         </w:tc>
@@ -811,7 +811,7 @@
               <w:rPr>
                 <w:sz w:val="19"/>
               </w:rPr>
-              <w:t>Víctor</w:t>
+              <w:t>Diego</w:t>
             </w:r>
           </w:p>
         </w:tc>
@@ -833,7 +833,7 @@
               <w:rPr>
                 <w:sz w:val="19"/>
               </w:rPr>
-              <w:t>08_Reuniones_Tutora/</w:t>
+              <w:t>05_Datos_Campo/LineaBase_2026-10/</w:t>
             </w:r>
           </w:p>
         </w:tc>
@@ -855,7 +855,7 @@
               <w:rPr>
                 <w:sz w:val="19"/>
               </w:rPr>
-              <w:t>Movido</w:t>
+              <w:t>Pendiente</w:t>
             </w:r>
           </w:p>
         </w:tc>
@@ -878,7 +878,7 @@
               <w:rPr>
                 <w:sz w:val="19"/>
               </w:rPr>
-              <w:t>lun 12-oct</w:t>
+              <w:t>mar 20-oct</w:t>
             </w:r>
           </w:p>
         </w:tc>
@@ -899,7 +899,7 @@
               <w:rPr>
                 <w:sz w:val="19"/>
               </w:rPr>
-              <w:t>Enviar el correo a Torvesa (giro, nota de respaldo, catálogo, permisos), para trabajar con datos oficiales</w:t>
+              <w:t>Escribir el capítulo 1, parte 2 (justificación y objetivos)</w:t>
             </w:r>
           </w:p>
         </w:tc>
@@ -941,7 +941,7 @@
               <w:rPr>
                 <w:sz w:val="19"/>
               </w:rPr>
-              <w:t>Correo electrónico · borrador en 11_Planificacion/2026-10-12_Correo_Torvesa_borrador.docx</w:t>
+              <w:t>06_Capitulos/</w:t>
             </w:r>
           </w:p>
         </w:tc>
@@ -962,7 +962,7 @@
               <w:rPr>
                 <w:sz w:val="19"/>
               </w:rPr>
-              <w:t>Movido</w:t>
+              <w:t>En curso</w:t>
             </w:r>
           </w:p>
         </w:tc>
@@ -986,7 +986,7 @@
               <w:rPr>
                 <w:sz w:val="19"/>
               </w:rPr>
-              <w:t>lun 12-oct</w:t>
+              <w:t>mar 20-oct</w:t>
             </w:r>
           </w:p>
         </w:tc>
@@ -1008,7 +1008,7 @@
               <w:rPr>
                 <w:sz w:val="19"/>
               </w:rPr>
-              <w:t>Aceptar la invitación de GitHub y clonar el repo, para trabajar en la bóveda compartida</w:t>
+              <w:t>Terminar el análisis de datos y escribir lo que muestran, en lenguaje simple</w:t>
             </w:r>
           </w:p>
         </w:tc>
@@ -1052,7 +1052,7 @@
               <w:rPr>
                 <w:sz w:val="19"/>
               </w:rPr>
-              <w:t>PC de Diego · pasos en GUIA_DIEGO.pdf (raíz)</w:t>
+              <w:t>05_Datos_Campo/LineaBase_2026-10/</w:t>
             </w:r>
           </w:p>
         </w:tc>
@@ -1074,7 +1074,7 @@
               <w:rPr>
                 <w:sz w:val="19"/>
               </w:rPr>
-              <w:t>En curso</w:t>
+              <w:t>Pendiente</w:t>
             </w:r>
           </w:p>
         </w:tc>
@@ -1097,7 +1097,7 @@
               <w:rPr>
                 <w:sz w:val="19"/>
               </w:rPr>
-              <w:t>lun 12-oct</w:t>
+              <w:t>mié 21-oct</w:t>
             </w:r>
           </w:p>
         </w:tc>
@@ -1118,7 +1118,7 @@
               <w:rPr>
                 <w:sz w:val="19"/>
               </w:rPr>
-              <w:t>Levantar el buscador RAG en su PC, para consultar la bóveda</w:t>
+              <w:t>Escribir el capítulo 2, parte 1 (CRM, tiempo de respuesta, gestión del conocimiento)</w:t>
             </w:r>
           </w:p>
         </w:tc>
@@ -1139,7 +1139,7 @@
               <w:rPr>
                 <w:sz w:val="19"/>
               </w:rPr>
-              <w:t>Diego</w:t>
+              <w:t>Víctor</w:t>
             </w:r>
           </w:p>
         </w:tc>
@@ -1160,7 +1160,7 @@
               <w:rPr>
                 <w:sz w:val="19"/>
               </w:rPr>
-              <w:t>PC de Diego · pasos en RAG_README.md (raíz)</w:t>
+              <w:t>06_Capitulos/</w:t>
             </w:r>
           </w:p>
         </w:tc>
@@ -1181,7 +1181,7 @@
               <w:rPr>
                 <w:sz w:val="19"/>
               </w:rPr>
-              <w:t>Movido</w:t>
+              <w:t>En curso</w:t>
             </w:r>
           </w:p>
         </w:tc>
@@ -1205,7 +1205,7 @@
               <w:rPr>
                 <w:sz w:val="19"/>
               </w:rPr>
-              <w:t>mar 13-oct</w:t>
+              <w:t>mié 21-oct</w:t>
             </w:r>
           </w:p>
         </w:tc>
@@ -1227,7 +1227,7 @@
               <w:rPr>
                 <w:sz w:val="19"/>
               </w:rPr>
-              <w:t>Buscar y verificar fuentes sobre el tiempo de respuesta a clientes (Oldroyd y estudios 2023+), para respaldar el problema (A9, A10)</w:t>
+              <w:t>Dibujar el proceso actual (AS-IS) en BPMN con lo dicho en las entrevistas</w:t>
             </w:r>
           </w:p>
         </w:tc>
@@ -1249,7 +1249,7 @@
               <w:rPr>
                 <w:sz w:val="19"/>
               </w:rPr>
-              <w:t>Víctor</w:t>
+              <w:t>Diego</w:t>
             </w:r>
           </w:p>
         </w:tc>
@@ -1271,7 +1271,7 @@
               <w:rPr>
                 <w:sz w:val="19"/>
               </w:rPr>
-              <w:t>02_Fuentes/Problema/ · con 99_Scripts/busqueda/</w:t>
+              <w:t>07_Flujos_Diseno/</w:t>
             </w:r>
           </w:p>
         </w:tc>
@@ -1293,7 +1293,7 @@
               <w:rPr>
                 <w:sz w:val="19"/>
               </w:rPr>
-              <w:t>En curso</w:t>
+              <w:t>Pendiente</w:t>
             </w:r>
           </w:p>
         </w:tc>
@@ -1316,7 +1316,7 @@
               <w:rPr>
                 <w:sz w:val="19"/>
               </w:rPr>
-              <w:t>mar 13-oct</w:t>
+              <w:t>jue 22-oct</w:t>
             </w:r>
           </w:p>
         </w:tc>
@@ -1337,7 +1337,7 @@
               <w:rPr>
                 <w:sz w:val="19"/>
               </w:rPr>
-              <w:t>Buscar fuentes sobre la digitalización de la construcción, para respaldar el contexto (A5, A6)</w:t>
+              <w:t>Escribir el capítulo 2, parte 2 (IA, RAG, normativa)</w:t>
             </w:r>
           </w:p>
         </w:tc>
@@ -1379,7 +1379,7 @@
               <w:rPr>
                 <w:sz w:val="19"/>
               </w:rPr>
-              <w:t>02_Fuentes/Problema/</w:t>
+              <w:t>06_Capitulos/</w:t>
             </w:r>
           </w:p>
         </w:tc>
@@ -1400,7 +1400,7 @@
               <w:rPr>
                 <w:sz w:val="19"/>
               </w:rPr>
-              <w:t>Hecho</w:t>
+              <w:t>En curso</w:t>
             </w:r>
           </w:p>
         </w:tc>
@@ -1424,7 +1424,7 @@
               <w:rPr>
                 <w:sz w:val="19"/>
               </w:rPr>
-              <w:t>mar 13-oct</w:t>
+              <w:t>jue 22-oct</w:t>
             </w:r>
           </w:p>
         </w:tc>
@@ -1446,7 +1446,7 @@
               <w:rPr>
                 <w:sz w:val="19"/>
               </w:rPr>
-              <w:t>Investigar cómo consolidar bóvedas de conocimiento, para diseñar la bóveda del sistema</w:t>
+              <w:t>Terminar el proceso actual (AS-IS) y marcar dónde se pierde tiempo</w:t>
             </w:r>
           </w:p>
         </w:tc>
@@ -1490,7 +1490,7 @@
               <w:rPr>
                 <w:sz w:val="19"/>
               </w:rPr>
-              <w:t>02_Fuentes/Tecnologia_IA/ · con 99_Scripts/busqueda/</w:t>
+              <w:t>07_Flujos_Diseno/</w:t>
             </w:r>
           </w:p>
         </w:tc>
@@ -1512,7 +1512,7 @@
               <w:rPr>
                 <w:sz w:val="19"/>
               </w:rPr>
-              <w:t>Movido</w:t>
+              <w:t>Pendiente</w:t>
             </w:r>
           </w:p>
         </w:tc>
@@ -1535,7 +1535,7 @@
               <w:rPr>
                 <w:sz w:val="19"/>
               </w:rPr>
-              <w:t>mar 13-oct</w:t>
+              <w:t>vie 23-oct</w:t>
             </w:r>
           </w:p>
         </w:tc>
@@ -1556,7 +1556,7 @@
               <w:rPr>
                 <w:sz w:val="19"/>
               </w:rPr>
-              <w:t>Leer el Documento madre y el Glosario, para entender el proyecto completo</w:t>
+              <w:t>Buscar fuentes de adopción de IA y automatización comercial 2023–2026, para el marco teórico</w:t>
             </w:r>
           </w:p>
         </w:tc>
@@ -1577,7 +1577,7 @@
               <w:rPr>
                 <w:sz w:val="19"/>
               </w:rPr>
-              <w:t>Diego</w:t>
+              <w:t>Víctor</w:t>
             </w:r>
           </w:p>
         </w:tc>
@@ -1598,7 +1598,7 @@
               <w:rPr>
                 <w:sz w:val="19"/>
               </w:rPr>
-              <w:t>00_DOCUMENTO_MADRE.pdf y Glosario.pdf (raíz)</w:t>
+              <w:t>02_Fuentes/Tecnologia_IA/</w:t>
             </w:r>
           </w:p>
         </w:tc>
@@ -1619,7 +1619,7 @@
               <w:rPr>
                 <w:sz w:val="19"/>
               </w:rPr>
-              <w:t>Movido</w:t>
+              <w:t>Hecho</w:t>
             </w:r>
           </w:p>
         </w:tc>
@@ -1643,7 +1643,7 @@
               <w:rPr>
                 <w:sz w:val="19"/>
               </w:rPr>
-              <w:t>mié 14-oct</w:t>
+              <w:t>vie 23-oct</w:t>
             </w:r>
           </w:p>
         </w:tc>
@@ -1665,7 +1665,7 @@
               <w:rPr>
                 <w:sz w:val="19"/>
               </w:rPr>
-              <w:t>Revisar la respuesta de Torvesa y ajustar el campo del jueves y viernes, para saber qué se puede aplicar</w:t>
+              <w:t>Armar el lienzo del modelo de negocio y la propuesta de valor (primer borrador)</w:t>
             </w:r>
           </w:p>
         </w:tc>
@@ -1709,7 +1709,7 @@
               <w:rPr>
                 <w:sz w:val="19"/>
               </w:rPr>
-              <w:t>Correo · 11_Planificacion/Cronograma_Tesis.xlsx</w:t>
+              <w:t>06_Capitulos/Modelo_Negocio/</w:t>
             </w:r>
           </w:p>
         </w:tc>
@@ -1731,7 +1731,7 @@
               <w:rPr>
                 <w:sz w:val="19"/>
               </w:rPr>
-              <w:t>Movido</w:t>
+              <w:t>En curso</w:t>
             </w:r>
           </w:p>
         </w:tc>
@@ -1754,7 +1754,7 @@
               <w:rPr>
                 <w:sz w:val="19"/>
               </w:rPr>
-              <w:t>mié 14-oct</w:t>
+              <w:t>vie 23-oct</w:t>
             </w:r>
           </w:p>
         </w:tc>
@@ -1775,7 +1775,7 @@
               <w:rPr>
                 <w:sz w:val="19"/>
               </w:rPr>
-              <w:t>Corregir los instrumentos a la versión 0.2, para aplicarlos en Torvesa</w:t>
+              <w:t>Hacer el inventario de herramientas candidatas, con criterios de comparación</w:t>
             </w:r>
           </w:p>
         </w:tc>
@@ -1796,7 +1796,7 @@
               <w:rPr>
                 <w:sz w:val="19"/>
               </w:rPr>
-              <w:t>Víctor</w:t>
+              <w:t>Diego</w:t>
             </w:r>
           </w:p>
         </w:tc>
@@ -1817,7 +1817,7 @@
               <w:rPr>
                 <w:sz w:val="19"/>
               </w:rPr>
-              <w:t>04_Instrumentos/</w:t>
+              <w:t>07_Flujos_Diseno/</w:t>
             </w:r>
           </w:p>
         </w:tc>
@@ -1838,7 +1838,7 @@
               <w:rPr>
                 <w:sz w:val="19"/>
               </w:rPr>
-              <w:t>Hecho</w:t>
+              <w:t>Pendiente</w:t>
             </w:r>
           </w:p>
         </w:tc>
@@ -1862,7 +1862,7 @@
               <w:rPr>
                 <w:sz w:val="19"/>
               </w:rPr>
-              <w:t>mié 14-oct</w:t>
+              <w:t>sáb 24-oct</w:t>
             </w:r>
           </w:p>
         </w:tc>
@@ -1884,7 +1884,7 @@
               <w:rPr>
                 <w:sz w:val="19"/>
               </w:rPr>
-              <w:t>Hacer el corte de fuentes: armar la matriz afirmación–fuente–estado, para decidir qué entra al capítulo 1</w:t>
+              <w:t>Escribir el capítulo 3, parte 1 (enfoque, DSR y población)</w:t>
             </w:r>
           </w:p>
         </w:tc>
@@ -1928,7 +1928,7 @@
               <w:rPr>
                 <w:sz w:val="19"/>
               </w:rPr>
-              <w:t>03_Matriz_Objetivos/</w:t>
+              <w:t>06_Capitulos/</w:t>
             </w:r>
           </w:p>
         </w:tc>
@@ -1950,7 +1950,7 @@
               <w:rPr>
                 <w:sz w:val="19"/>
               </w:rPr>
-              <w:t>Hecho</w:t>
+              <w:t>En curso</w:t>
             </w:r>
           </w:p>
         </w:tc>
@@ -1973,7 +1973,7 @@
               <w:rPr>
                 <w:sz w:val="19"/>
               </w:rPr>
-              <w:t>mié 14-oct</w:t>
+              <w:t>sáb 24-oct</w:t>
             </w:r>
           </w:p>
         </w:tc>
@@ -1994,7 +1994,7 @@
               <w:rPr>
                 <w:sz w:val="19"/>
               </w:rPr>
-              <w:t>Investigar arquitecturas RAG para negocio, para proponer cómo el asistente consultará la bóveda</w:t>
+              <w:t>Escribir un resumen de 1 página para Diego del capítulo 1</w:t>
             </w:r>
           </w:p>
         </w:tc>
@@ -2015,7 +2015,7 @@
               <w:rPr>
                 <w:sz w:val="19"/>
               </w:rPr>
-              <w:t>Diego</w:t>
+              <w:t>Víctor</w:t>
             </w:r>
           </w:p>
         </w:tc>
@@ -2036,7 +2036,7 @@
               <w:rPr>
                 <w:sz w:val="19"/>
               </w:rPr>
-              <w:t>02_Fuentes/Tecnologia_IA/</w:t>
+              <w:t>06_Capitulos/</w:t>
             </w:r>
           </w:p>
         </w:tc>
@@ -2057,7 +2057,7 @@
               <w:rPr>
                 <w:sz w:val="19"/>
               </w:rPr>
-              <w:t>Movido</w:t>
+              <w:t>En curso</w:t>
             </w:r>
           </w:p>
         </w:tc>
@@ -2081,7 +2081,7 @@
               <w:rPr>
                 <w:sz w:val="19"/>
               </w:rPr>
-              <w:t>mié 14-oct</w:t>
+              <w:t>sáb 24-oct</w:t>
             </w:r>
           </w:p>
         </w:tc>
@@ -2103,7 +2103,7 @@
               <w:rPr>
                 <w:sz w:val="19"/>
               </w:rPr>
-              <w:t>Escribir un resumen de 1 página para Víctor sobre bóvedas y RAG, para compartir lo aprendido</w:t>
+              <w:t>Terminar el inventario de herramientas con precios y criterios</w:t>
             </w:r>
           </w:p>
         </w:tc>
@@ -2147,7 +2147,7 @@
               <w:rPr>
                 <w:sz w:val="19"/>
               </w:rPr>
-              <w:t>02_Fuentes/Tecnologia_IA/</w:t>
+              <w:t>07_Flujos_Diseno/</w:t>
             </w:r>
           </w:p>
         </w:tc>
@@ -2169,7 +2169,7 @@
               <w:rPr>
                 <w:sz w:val="19"/>
               </w:rPr>
-              <w:t>Movido</w:t>
+              <w:t>Pendiente</w:t>
             </w:r>
           </w:p>
         </w:tc>
@@ -2192,7 +2192,7 @@
               <w:rPr>
                 <w:sz w:val="19"/>
               </w:rPr>
-              <w:t>jue 15-oct</w:t>
+              <w:t>sáb 24-oct</w:t>
             </w:r>
           </w:p>
         </w:tc>
@@ -2213,7 +2213,7 @@
               <w:rPr>
                 <w:sz w:val="19"/>
               </w:rPr>
-              <w:t>Aplicar la encuesta a colaboradores y 2 entrevistas en Torvesa (si autorizó), para la línea base real</w:t>
+              <w:t>Escribir un resumen de 1 página para Víctor del proceso actual</w:t>
             </w:r>
           </w:p>
         </w:tc>
@@ -2234,7 +2234,7 @@
               <w:rPr>
                 <w:sz w:val="19"/>
               </w:rPr>
-              <w:t>Víctor</w:t>
+              <w:t>Diego</w:t>
             </w:r>
           </w:p>
         </w:tc>
@@ -2255,7 +2255,7 @@
               <w:rPr>
                 <w:sz w:val="19"/>
               </w:rPr>
-              <w:t>Torvesa (oficina, Quito) · registro en 05_Datos_Campo/LineaBase_2026-10/</w:t>
+              <w:t>07_Flujos_Diseno/</w:t>
             </w:r>
           </w:p>
         </w:tc>
@@ -2276,7 +2276,7 @@
               <w:rPr>
                 <w:sz w:val="19"/>
               </w:rPr>
-              <w:t>Movido</w:t>
+              <w:t>Pendiente</w:t>
             </w:r>
           </w:p>
         </w:tc>
@@ -2300,7 +2300,7 @@
               <w:rPr>
                 <w:sz w:val="19"/>
               </w:rPr>
-              <w:t>jue 15-oct</w:t>
+              <w:t>dom 25-oct</w:t>
             </w:r>
           </w:p>
         </w:tc>
@@ -2322,7 +2322,7 @@
               <w:rPr>
                 <w:sz w:val="19"/>
               </w:rPr>
-              <w:t>Cronometrar las cotizaciones del día en Torvesa (si autorizó), para medir el tiempo real (meta M2)</w:t>
+              <w:t>Escribir el capítulo 3, parte 2 (instrumentos, análisis y ética)</w:t>
             </w:r>
           </w:p>
         </w:tc>
@@ -2344,7 +2344,7 @@
               <w:rPr>
                 <w:sz w:val="19"/>
               </w:rPr>
-              <w:t>Diego</w:t>
+              <w:t>Víctor</w:t>
             </w:r>
           </w:p>
         </w:tc>
@@ -2366,7 +2366,7 @@
               <w:rPr>
                 <w:sz w:val="19"/>
               </w:rPr>
-              <w:t>Torvesa (oficina, Quito)</w:t>
+              <w:t>06_Capitulos/</w:t>
             </w:r>
           </w:p>
         </w:tc>
@@ -2388,7 +2388,7 @@
               <w:rPr>
                 <w:sz w:val="19"/>
               </w:rPr>
-              <w:t>Movido</w:t>
+              <w:t>En curso</w:t>
             </w:r>
           </w:p>
         </w:tc>
@@ -2411,7 +2411,7 @@
               <w:rPr>
                 <w:sz w:val="19"/>
               </w:rPr>
-              <w:t>vie 16-oct</w:t>
+              <w:t>dom 25-oct</w:t>
             </w:r>
           </w:p>
         </w:tc>
@@ -2432,7 +2432,7 @@
               <w:rPr>
                 <w:sz w:val="19"/>
               </w:rPr>
-              <w:t>Llamar a los clientes para la encuesta corta (si autorizó), para conocer su experiencia</w:t>
+              <w:t>Preparar las gráficas de datos para la Revisión 1</w:t>
             </w:r>
           </w:p>
         </w:tc>
@@ -2453,7 +2453,7 @@
               <w:rPr>
                 <w:sz w:val="19"/>
               </w:rPr>
-              <w:t>Víctor</w:t>
+              <w:t>Diego</w:t>
             </w:r>
           </w:p>
         </w:tc>
@@ -2474,7 +2474,7 @@
               <w:rPr>
                 <w:sz w:val="19"/>
               </w:rPr>
-              <w:t>Teléfono · lista solo en 05_Datos_Campo/_crudo/ (privada)</w:t>
+              <w:t>05_Datos_Campo/LineaBase_2026-10/</w:t>
             </w:r>
           </w:p>
         </w:tc>
@@ -2495,7 +2495,7 @@
               <w:rPr>
                 <w:sz w:val="19"/>
               </w:rPr>
-              <w:t>Movido</w:t>
+              <w:t>Pendiente</w:t>
             </w:r>
           </w:p>
         </w:tc>
@@ -2519,7 +2519,7 @@
               <w:rPr>
                 <w:sz w:val="19"/>
               </w:rPr>
-              <w:t>vie 16-oct</w:t>
+              <w:t>dom 25-oct</w:t>
             </w:r>
           </w:p>
         </w:tc>
@@ -2541,7 +2541,7 @@
               <w:rPr>
                 <w:sz w:val="19"/>
               </w:rPr>
-              <w:t>Revisar solicitudes y cotizaciones de los últimos 3 meses (solo fechas y horas), para medir el tiempo de respuesta (meta M1)</w:t>
+              <w:t>Revisar el sprint (qué hicimos, qué no, qué aprendimos), hacer 20 min de «explícame lo tuyo» y planificar el siguiente</w:t>
             </w:r>
           </w:p>
         </w:tc>
@@ -2563,7 +2563,7 @@
               <w:rPr>
                 <w:sz w:val="19"/>
               </w:rPr>
-              <w:t>Diego</w:t>
+              <w:t>Ambos</w:t>
             </w:r>
           </w:p>
         </w:tc>
@@ -2585,7 +2585,7 @@
               <w:rPr>
                 <w:sz w:val="19"/>
               </w:rPr>
-              <w:t>Torvesa (oficina, Quito)</w:t>
+              <w:t>Llamada Víctor–Diego · 11_Planificacion/Bitacora_Semanal.md y 11_Planificacion/Cronograma_Tesis.xlsx</w:t>
             </w:r>
           </w:p>
         </w:tc>
@@ -2607,1037 +2607,13 @@
               <w:rPr>
                 <w:sz w:val="19"/>
               </w:rPr>
-              <w:t>Movido</w:t>
-            </w:r>
-          </w:p>
-        </w:tc>
-      </w:tr>
-      <w:tr>
-        <w:tc>
-          <w:tcPr>
-            <w:tcW w:type="dxa" w:w="1191"/>
-          </w:tcPr>
-          <w:p>
-            <w:pPr>
-              <w:spacing w:after="20"/>
-            </w:pPr>
-            <w:r>
-              <w:rPr>
-                <w:sz w:val="19"/>
-              </w:rPr>
-            </w:r>
-            <w:r>
-              <w:rPr>
-                <w:sz w:val="19"/>
-              </w:rPr>
-              <w:t>sáb 17-oct</w:t>
-            </w:r>
-          </w:p>
-        </w:tc>
-        <w:tc>
-          <w:tcPr>
-            <w:tcW w:type="dxa" w:w="3628"/>
-          </w:tcPr>
-          <w:p>
-            <w:pPr>
-              <w:spacing w:after="20"/>
-            </w:pPr>
-            <w:r>
-              <w:rPr>
-                <w:sz w:val="19"/>
-              </w:rPr>
-            </w:r>
-            <w:r>
-              <w:rPr>
-                <w:sz w:val="19"/>
-              </w:rPr>
-              <w:t>Buscar el texto oficial de la ley de datos (LOPDP) y agregar sus artículos al consentimiento, para cumplir la ley</w:t>
-            </w:r>
-          </w:p>
-        </w:tc>
-        <w:tc>
-          <w:tcPr>
-            <w:tcW w:type="dxa" w:w="907"/>
-          </w:tcPr>
-          <w:p>
-            <w:pPr>
-              <w:spacing w:after="20"/>
-            </w:pPr>
-            <w:r>
-              <w:rPr>
-                <w:sz w:val="19"/>
-              </w:rPr>
-            </w:r>
-            <w:r>
-              <w:rPr>
-                <w:sz w:val="19"/>
-              </w:rPr>
-              <w:t>Víctor</w:t>
-            </w:r>
-          </w:p>
-        </w:tc>
-        <w:tc>
-          <w:tcPr>
-            <w:tcW w:type="dxa" w:w="2438"/>
-          </w:tcPr>
-          <w:p>
-            <w:pPr>
-              <w:spacing w:after="20"/>
-            </w:pPr>
-            <w:r>
-              <w:rPr>
-                <w:sz w:val="19"/>
-              </w:rPr>
-            </w:r>
-            <w:r>
-              <w:rPr>
-                <w:sz w:val="19"/>
-              </w:rPr>
-              <w:t>02_Fuentes/Normativa/ y 04_Instrumentos/</w:t>
-            </w:r>
-          </w:p>
-        </w:tc>
-        <w:tc>
-          <w:tcPr>
-            <w:tcW w:type="dxa" w:w="1247"/>
-          </w:tcPr>
-          <w:p>
-            <w:pPr>
-              <w:spacing w:after="20"/>
-            </w:pPr>
-            <w:r>
-              <w:rPr>
-                <w:sz w:val="19"/>
-              </w:rPr>
-            </w:r>
-            <w:r>
-              <w:rPr>
-                <w:sz w:val="19"/>
-              </w:rPr>
-              <w:t>Hecho</w:t>
-            </w:r>
-          </w:p>
-        </w:tc>
-      </w:tr>
-      <w:tr>
-        <w:tc>
-          <w:tcPr>
-            <w:tcW w:type="dxa" w:w="1191"/>
-            <w:shd w:val="clear" w:color="auto" w:fill="EEF2F7"/>
-          </w:tcPr>
-          <w:p>
-            <w:pPr>
-              <w:spacing w:after="20"/>
-            </w:pPr>
-            <w:r>
-              <w:rPr>
-                <w:sz w:val="19"/>
-              </w:rPr>
-            </w:r>
-            <w:r>
-              <w:rPr>
-                <w:sz w:val="19"/>
-              </w:rPr>
-              <w:t>sáb 17-oct</w:t>
-            </w:r>
-          </w:p>
-        </w:tc>
-        <w:tc>
-          <w:tcPr>
-            <w:tcW w:type="dxa" w:w="3628"/>
-            <w:shd w:val="clear" w:color="auto" w:fill="EEF2F7"/>
-          </w:tcPr>
-          <w:p>
-            <w:pPr>
-              <w:spacing w:after="20"/>
-            </w:pPr>
-            <w:r>
-              <w:rPr>
-                <w:sz w:val="19"/>
-              </w:rPr>
-            </w:r>
-            <w:r>
-              <w:rPr>
-                <w:sz w:val="19"/>
-              </w:rPr>
-              <w:t>Buscar la versión validada en español de la escala SUS, para medir la usabilidad correctamente</w:t>
-            </w:r>
-          </w:p>
-        </w:tc>
-        <w:tc>
-          <w:tcPr>
-            <w:tcW w:type="dxa" w:w="907"/>
-            <w:shd w:val="clear" w:color="auto" w:fill="EEF2F7"/>
-          </w:tcPr>
-          <w:p>
-            <w:pPr>
-              <w:spacing w:after="20"/>
-            </w:pPr>
-            <w:r>
-              <w:rPr>
-                <w:sz w:val="19"/>
-              </w:rPr>
-            </w:r>
-            <w:r>
-              <w:rPr>
-                <w:sz w:val="19"/>
-              </w:rPr>
-              <w:t>Víctor</w:t>
-            </w:r>
-          </w:p>
-        </w:tc>
-        <w:tc>
-          <w:tcPr>
-            <w:tcW w:type="dxa" w:w="2438"/>
-            <w:shd w:val="clear" w:color="auto" w:fill="EEF2F7"/>
-          </w:tcPr>
-          <w:p>
-            <w:pPr>
-              <w:spacing w:after="20"/>
-            </w:pPr>
-            <w:r>
-              <w:rPr>
-                <w:sz w:val="19"/>
-              </w:rPr>
-            </w:r>
-            <w:r>
-              <w:rPr>
-                <w:sz w:val="19"/>
-              </w:rPr>
-              <w:t>02_Fuentes/Metodologia/</w:t>
-            </w:r>
-          </w:p>
-        </w:tc>
-        <w:tc>
-          <w:tcPr>
-            <w:tcW w:type="dxa" w:w="1247"/>
-            <w:shd w:val="clear" w:color="auto" w:fill="EEF2F7"/>
-          </w:tcPr>
-          <w:p>
-            <w:pPr>
-              <w:spacing w:after="20"/>
-            </w:pPr>
-            <w:r>
-              <w:rPr>
-                <w:sz w:val="19"/>
-              </w:rPr>
-            </w:r>
-            <w:r>
-              <w:rPr>
-                <w:sz w:val="19"/>
-              </w:rPr>
-              <w:t>Hecho</w:t>
-            </w:r>
-          </w:p>
-        </w:tc>
-      </w:tr>
-      <w:tr>
-        <w:tc>
-          <w:tcPr>
-            <w:tcW w:type="dxa" w:w="1191"/>
-          </w:tcPr>
-          <w:p>
-            <w:pPr>
-              <w:spacing w:after="20"/>
-            </w:pPr>
-            <w:r>
-              <w:rPr>
-                <w:sz w:val="19"/>
-              </w:rPr>
-            </w:r>
-            <w:r>
-              <w:rPr>
-                <w:sz w:val="19"/>
-              </w:rPr>
-              <w:t>sáb 17-oct</w:t>
-            </w:r>
-          </w:p>
-        </w:tc>
-        <w:tc>
-          <w:tcPr>
-            <w:tcW w:type="dxa" w:w="3628"/>
-          </w:tcPr>
-          <w:p>
-            <w:pPr>
-              <w:spacing w:after="20"/>
-            </w:pPr>
-            <w:r>
-              <w:rPr>
-                <w:sz w:val="19"/>
-              </w:rPr>
-            </w:r>
-            <w:r>
-              <w:rPr>
-                <w:sz w:val="19"/>
-              </w:rPr>
-              <w:t>Buscar fuentes de metodología (DSR, Design Thinking, Scrum, censo), para justificar el método</w:t>
-            </w:r>
-          </w:p>
-        </w:tc>
-        <w:tc>
-          <w:tcPr>
-            <w:tcW w:type="dxa" w:w="907"/>
-          </w:tcPr>
-          <w:p>
-            <w:pPr>
-              <w:spacing w:after="20"/>
-            </w:pPr>
-            <w:r>
-              <w:rPr>
-                <w:sz w:val="19"/>
-              </w:rPr>
-            </w:r>
-            <w:r>
-              <w:rPr>
-                <w:sz w:val="19"/>
-              </w:rPr>
-              <w:t>Víctor</w:t>
-            </w:r>
-          </w:p>
-        </w:tc>
-        <w:tc>
-          <w:tcPr>
-            <w:tcW w:type="dxa" w:w="2438"/>
-          </w:tcPr>
-          <w:p>
-            <w:pPr>
-              <w:spacing w:after="20"/>
-            </w:pPr>
-            <w:r>
-              <w:rPr>
-                <w:sz w:val="19"/>
-              </w:rPr>
-            </w:r>
-            <w:r>
-              <w:rPr>
-                <w:sz w:val="19"/>
-              </w:rPr>
-              <w:t>02_Fuentes/Metodologia/</w:t>
-            </w:r>
-          </w:p>
-        </w:tc>
-        <w:tc>
-          <w:tcPr>
-            <w:tcW w:type="dxa" w:w="1247"/>
-          </w:tcPr>
-          <w:p>
-            <w:pPr>
-              <w:spacing w:after="20"/>
-            </w:pPr>
-            <w:r>
-              <w:rPr>
-                <w:sz w:val="19"/>
-              </w:rPr>
-            </w:r>
-            <w:r>
-              <w:rPr>
-                <w:sz w:val="19"/>
-              </w:rPr>
-              <w:t>En curso</w:t>
-            </w:r>
-          </w:p>
-        </w:tc>
-      </w:tr>
-      <w:tr>
-        <w:tc>
-          <w:tcPr>
-            <w:tcW w:type="dxa" w:w="1191"/>
-            <w:shd w:val="clear" w:color="auto" w:fill="EEF2F7"/>
-          </w:tcPr>
-          <w:p>
-            <w:pPr>
-              <w:spacing w:after="20"/>
-            </w:pPr>
-            <w:r>
-              <w:rPr>
-                <w:sz w:val="19"/>
-              </w:rPr>
-            </w:r>
-            <w:r>
-              <w:rPr>
-                <w:sz w:val="19"/>
-              </w:rPr>
-              <w:t>sáb 17-oct</w:t>
-            </w:r>
-          </w:p>
-        </w:tc>
-        <w:tc>
-          <w:tcPr>
-            <w:tcW w:type="dxa" w:w="3628"/>
-            <w:shd w:val="clear" w:color="auto" w:fill="EEF2F7"/>
-          </w:tcPr>
-          <w:p>
-            <w:pPr>
-              <w:spacing w:after="20"/>
-            </w:pPr>
-            <w:r>
-              <w:rPr>
-                <w:sz w:val="19"/>
-              </w:rPr>
-            </w:r>
-            <w:r>
-              <w:rPr>
-                <w:sz w:val="19"/>
-              </w:rPr>
-              <w:t>Investigar flujos de información y diseño de procesos (BPMN), para dibujar el proceso de Torvesa</w:t>
-            </w:r>
-          </w:p>
-        </w:tc>
-        <w:tc>
-          <w:tcPr>
-            <w:tcW w:type="dxa" w:w="907"/>
-            <w:shd w:val="clear" w:color="auto" w:fill="EEF2F7"/>
-          </w:tcPr>
-          <w:p>
-            <w:pPr>
-              <w:spacing w:after="20"/>
-            </w:pPr>
-            <w:r>
-              <w:rPr>
-                <w:sz w:val="19"/>
-              </w:rPr>
-            </w:r>
-            <w:r>
-              <w:rPr>
-                <w:sz w:val="19"/>
-              </w:rPr>
-              <w:t>Diego</w:t>
-            </w:r>
-          </w:p>
-        </w:tc>
-        <w:tc>
-          <w:tcPr>
-            <w:tcW w:type="dxa" w:w="2438"/>
-            <w:shd w:val="clear" w:color="auto" w:fill="EEF2F7"/>
-          </w:tcPr>
-          <w:p>
-            <w:pPr>
-              <w:spacing w:after="20"/>
-            </w:pPr>
-            <w:r>
-              <w:rPr>
-                <w:sz w:val="19"/>
-              </w:rPr>
-            </w:r>
-            <w:r>
-              <w:rPr>
-                <w:sz w:val="19"/>
-              </w:rPr>
-              <w:t>02_Fuentes/Metodologia/</w:t>
-            </w:r>
-          </w:p>
-        </w:tc>
-        <w:tc>
-          <w:tcPr>
-            <w:tcW w:type="dxa" w:w="1247"/>
-            <w:shd w:val="clear" w:color="auto" w:fill="EEF2F7"/>
-          </w:tcPr>
-          <w:p>
-            <w:pPr>
-              <w:spacing w:after="20"/>
-            </w:pPr>
-            <w:r>
-              <w:rPr>
-                <w:sz w:val="19"/>
-              </w:rPr>
-            </w:r>
-            <w:r>
-              <w:rPr>
-                <w:sz w:val="19"/>
-              </w:rPr>
-              <w:t>Movido</w:t>
-            </w:r>
-          </w:p>
-        </w:tc>
-      </w:tr>
-      <w:tr>
-        <w:tc>
-          <w:tcPr>
-            <w:tcW w:type="dxa" w:w="1191"/>
-          </w:tcPr>
-          <w:p>
-            <w:pPr>
-              <w:spacing w:after="20"/>
-            </w:pPr>
-            <w:r>
-              <w:rPr>
-                <w:sz w:val="19"/>
-              </w:rPr>
-            </w:r>
-            <w:r>
-              <w:rPr>
-                <w:sz w:val="19"/>
-              </w:rPr>
-              <w:t>sáb 17-oct</w:t>
-            </w:r>
-          </w:p>
-        </w:tc>
-        <w:tc>
-          <w:tcPr>
-            <w:tcW w:type="dxa" w:w="3628"/>
-          </w:tcPr>
-          <w:p>
-            <w:pPr>
-              <w:spacing w:after="20"/>
-            </w:pPr>
-            <w:r>
-              <w:rPr>
-                <w:sz w:val="19"/>
-              </w:rPr>
-            </w:r>
-            <w:r>
-              <w:rPr>
-                <w:sz w:val="19"/>
-              </w:rPr>
-              <w:t>Investigar CRMs móviles y herramientas existentes con sus precios, para comparar y calcular costos</w:t>
-            </w:r>
-          </w:p>
-        </w:tc>
-        <w:tc>
-          <w:tcPr>
-            <w:tcW w:type="dxa" w:w="907"/>
-          </w:tcPr>
-          <w:p>
-            <w:pPr>
-              <w:spacing w:after="20"/>
-            </w:pPr>
-            <w:r>
-              <w:rPr>
-                <w:sz w:val="19"/>
-              </w:rPr>
-            </w:r>
-            <w:r>
-              <w:rPr>
-                <w:sz w:val="19"/>
-              </w:rPr>
-              <w:t>Diego</w:t>
-            </w:r>
-          </w:p>
-        </w:tc>
-        <w:tc>
-          <w:tcPr>
-            <w:tcW w:type="dxa" w:w="2438"/>
-          </w:tcPr>
-          <w:p>
-            <w:pPr>
-              <w:spacing w:after="20"/>
-            </w:pPr>
-            <w:r>
-              <w:rPr>
-                <w:sz w:val="19"/>
-              </w:rPr>
-            </w:r>
-            <w:r>
-              <w:rPr>
-                <w:sz w:val="19"/>
-              </w:rPr>
-              <w:t>02_Fuentes/Casos_Estudio/ y 02_Fuentes/Costos_Viabilidad/</w:t>
-            </w:r>
-          </w:p>
-        </w:tc>
-        <w:tc>
-          <w:tcPr>
-            <w:tcW w:type="dxa" w:w="1247"/>
-          </w:tcPr>
-          <w:p>
-            <w:pPr>
-              <w:spacing w:after="20"/>
-            </w:pPr>
-            <w:r>
-              <w:rPr>
-                <w:sz w:val="19"/>
-              </w:rPr>
-            </w:r>
-            <w:r>
-              <w:rPr>
-                <w:sz w:val="19"/>
-              </w:rPr>
-              <w:t>Movido</w:t>
-            </w:r>
-          </w:p>
-        </w:tc>
-      </w:tr>
-      <w:tr>
-        <w:tc>
-          <w:tcPr>
-            <w:tcW w:type="dxa" w:w="1191"/>
-            <w:shd w:val="clear" w:color="auto" w:fill="EEF2F7"/>
-          </w:tcPr>
-          <w:p>
-            <w:pPr>
-              <w:spacing w:after="20"/>
-            </w:pPr>
-            <w:r>
-              <w:rPr>
-                <w:sz w:val="19"/>
-              </w:rPr>
-            </w:r>
-            <w:r>
-              <w:rPr>
-                <w:sz w:val="19"/>
-              </w:rPr>
-              <w:t>dom 18-oct</w:t>
-            </w:r>
-          </w:p>
-        </w:tc>
-        <w:tc>
-          <w:tcPr>
-            <w:tcW w:type="dxa" w:w="3628"/>
-            <w:shd w:val="clear" w:color="auto" w:fill="EEF2F7"/>
-          </w:tcPr>
-          <w:p>
-            <w:pPr>
-              <w:spacing w:after="20"/>
-            </w:pPr>
-            <w:r>
-              <w:rPr>
-                <w:sz w:val="19"/>
-              </w:rPr>
-            </w:r>
-            <w:r>
-              <w:rPr>
-                <w:sz w:val="19"/>
-              </w:rPr>
-              <w:t>Tabular y anonimizar los datos de campo, para que estén listos y sean confiables</w:t>
-            </w:r>
-          </w:p>
-        </w:tc>
-        <w:tc>
-          <w:tcPr>
-            <w:tcW w:type="dxa" w:w="907"/>
-            <w:shd w:val="clear" w:color="auto" w:fill="EEF2F7"/>
-          </w:tcPr>
-          <w:p>
-            <w:pPr>
-              <w:spacing w:after="20"/>
-            </w:pPr>
-            <w:r>
-              <w:rPr>
-                <w:sz w:val="19"/>
-              </w:rPr>
-            </w:r>
-            <w:r>
-              <w:rPr>
-                <w:sz w:val="19"/>
-              </w:rPr>
-              <w:t>Ambos</w:t>
-            </w:r>
-          </w:p>
-        </w:tc>
-        <w:tc>
-          <w:tcPr>
-            <w:tcW w:type="dxa" w:w="2438"/>
-            <w:shd w:val="clear" w:color="auto" w:fill="EEF2F7"/>
-          </w:tcPr>
-          <w:p>
-            <w:pPr>
-              <w:spacing w:after="20"/>
-            </w:pPr>
-            <w:r>
-              <w:rPr>
-                <w:sz w:val="19"/>
-              </w:rPr>
-            </w:r>
-            <w:r>
-              <w:rPr>
-                <w:sz w:val="19"/>
-              </w:rPr>
-              <w:t>05_Datos_Campo/LineaBase_2026-10/</w:t>
-            </w:r>
-          </w:p>
-        </w:tc>
-        <w:tc>
-          <w:tcPr>
-            <w:tcW w:type="dxa" w:w="1247"/>
-            <w:shd w:val="clear" w:color="auto" w:fill="EEF2F7"/>
-          </w:tcPr>
-          <w:p>
-            <w:pPr>
-              <w:spacing w:after="20"/>
-            </w:pPr>
-            <w:r>
-              <w:rPr>
-                <w:sz w:val="19"/>
-              </w:rPr>
-            </w:r>
-            <w:r>
-              <w:rPr>
-                <w:sz w:val="19"/>
-              </w:rPr>
-              <w:t>Movido</w:t>
-            </w:r>
-          </w:p>
-        </w:tc>
-      </w:tr>
-      <w:tr>
-        <w:tc>
-          <w:tcPr>
-            <w:tcW w:type="dxa" w:w="1191"/>
-          </w:tcPr>
-          <w:p>
-            <w:pPr>
-              <w:spacing w:after="20"/>
-            </w:pPr>
-            <w:r>
-              <w:rPr>
-                <w:sz w:val="19"/>
-              </w:rPr>
-            </w:r>
-            <w:r>
-              <w:rPr>
-                <w:sz w:val="19"/>
-              </w:rPr>
-              <w:t>dom 18-oct</w:t>
-            </w:r>
-          </w:p>
-        </w:tc>
-        <w:tc>
-          <w:tcPr>
-            <w:tcW w:type="dxa" w:w="3628"/>
-          </w:tcPr>
-          <w:p>
-            <w:pPr>
-              <w:spacing w:after="20"/>
-            </w:pPr>
-            <w:r>
-              <w:rPr>
-                <w:sz w:val="19"/>
-              </w:rPr>
-            </w:r>
-            <w:r>
-              <w:rPr>
-                <w:sz w:val="19"/>
-              </w:rPr>
-              <w:t>Escribir un resumen de 1 página para Diego sobre el problema y sus fuentes</w:t>
-            </w:r>
-          </w:p>
-        </w:tc>
-        <w:tc>
-          <w:tcPr>
-            <w:tcW w:type="dxa" w:w="907"/>
-          </w:tcPr>
-          <w:p>
-            <w:pPr>
-              <w:spacing w:after="20"/>
-            </w:pPr>
-            <w:r>
-              <w:rPr>
-                <w:sz w:val="19"/>
-              </w:rPr>
-            </w:r>
-            <w:r>
-              <w:rPr>
-                <w:sz w:val="19"/>
-              </w:rPr>
-              <w:t>Víctor</w:t>
-            </w:r>
-          </w:p>
-        </w:tc>
-        <w:tc>
-          <w:tcPr>
-            <w:tcW w:type="dxa" w:w="2438"/>
-          </w:tcPr>
-          <w:p>
-            <w:pPr>
-              <w:spacing w:after="20"/>
-            </w:pPr>
-            <w:r>
-              <w:rPr>
-                <w:sz w:val="19"/>
-              </w:rPr>
-            </w:r>
-            <w:r>
-              <w:rPr>
-                <w:sz w:val="19"/>
-              </w:rPr>
-              <w:t>02_Fuentes/Problema/</w:t>
-            </w:r>
-          </w:p>
-        </w:tc>
-        <w:tc>
-          <w:tcPr>
-            <w:tcW w:type="dxa" w:w="1247"/>
-          </w:tcPr>
-          <w:p>
-            <w:pPr>
-              <w:spacing w:after="20"/>
-            </w:pPr>
-            <w:r>
-              <w:rPr>
-                <w:sz w:val="19"/>
-              </w:rPr>
-            </w:r>
-            <w:r>
-              <w:rPr>
-                <w:sz w:val="19"/>
-              </w:rPr>
-              <w:t>Hecho</w:t>
-            </w:r>
-          </w:p>
-        </w:tc>
-      </w:tr>
-      <w:tr>
-        <w:tc>
-          <w:tcPr>
-            <w:tcW w:type="dxa" w:w="1191"/>
-            <w:shd w:val="clear" w:color="auto" w:fill="EEF2F7"/>
-          </w:tcPr>
-          <w:p>
-            <w:pPr>
-              <w:spacing w:after="20"/>
-            </w:pPr>
-            <w:r>
-              <w:rPr>
-                <w:sz w:val="19"/>
-              </w:rPr>
-            </w:r>
-            <w:r>
-              <w:rPr>
-                <w:sz w:val="19"/>
-              </w:rPr>
-              <w:t>dom 18-oct</w:t>
-            </w:r>
-          </w:p>
-        </w:tc>
-        <w:tc>
-          <w:tcPr>
-            <w:tcW w:type="dxa" w:w="3628"/>
-            <w:shd w:val="clear" w:color="auto" w:fill="EEF2F7"/>
-          </w:tcPr>
-          <w:p>
-            <w:pPr>
-              <w:spacing w:after="20"/>
-            </w:pPr>
-            <w:r>
-              <w:rPr>
-                <w:sz w:val="19"/>
-              </w:rPr>
-            </w:r>
-            <w:r>
-              <w:rPr>
-                <w:sz w:val="19"/>
-              </w:rPr>
-              <w:t>Escribir un resumen de 1 página para Víctor sobre CRMs y flujos</w:t>
-            </w:r>
-          </w:p>
-        </w:tc>
-        <w:tc>
-          <w:tcPr>
-            <w:tcW w:type="dxa" w:w="907"/>
-            <w:shd w:val="clear" w:color="auto" w:fill="EEF2F7"/>
-          </w:tcPr>
-          <w:p>
-            <w:pPr>
-              <w:spacing w:after="20"/>
-            </w:pPr>
-            <w:r>
-              <w:rPr>
-                <w:sz w:val="19"/>
-              </w:rPr>
-            </w:r>
-            <w:r>
-              <w:rPr>
-                <w:sz w:val="19"/>
-              </w:rPr>
-              <w:t>Diego</w:t>
-            </w:r>
-          </w:p>
-        </w:tc>
-        <w:tc>
-          <w:tcPr>
-            <w:tcW w:type="dxa" w:w="2438"/>
-            <w:shd w:val="clear" w:color="auto" w:fill="EEF2F7"/>
-          </w:tcPr>
-          <w:p>
-            <w:pPr>
-              <w:spacing w:after="20"/>
-            </w:pPr>
-            <w:r>
-              <w:rPr>
-                <w:sz w:val="19"/>
-              </w:rPr>
-            </w:r>
-            <w:r>
-              <w:rPr>
-                <w:sz w:val="19"/>
-              </w:rPr>
-              <w:t>02_Fuentes/Casos_Estudio/</w:t>
-            </w:r>
-          </w:p>
-        </w:tc>
-        <w:tc>
-          <w:tcPr>
-            <w:tcW w:type="dxa" w:w="1247"/>
-            <w:shd w:val="clear" w:color="auto" w:fill="EEF2F7"/>
-          </w:tcPr>
-          <w:p>
-            <w:pPr>
-              <w:spacing w:after="20"/>
-            </w:pPr>
-            <w:r>
-              <w:rPr>
-                <w:sz w:val="19"/>
-              </w:rPr>
-            </w:r>
-            <w:r>
-              <w:rPr>
-                <w:sz w:val="19"/>
-              </w:rPr>
-              <w:t>Movido</w:t>
-            </w:r>
-          </w:p>
-        </w:tc>
-      </w:tr>
-      <w:tr>
-        <w:tc>
-          <w:tcPr>
-            <w:tcW w:type="dxa" w:w="1191"/>
-          </w:tcPr>
-          <w:p>
-            <w:pPr>
-              <w:spacing w:after="20"/>
-            </w:pPr>
-            <w:r>
-              <w:rPr>
-                <w:sz w:val="19"/>
-              </w:rPr>
-            </w:r>
-            <w:r>
-              <w:rPr>
-                <w:sz w:val="19"/>
-              </w:rPr>
-              <w:t>dom 18-oct</w:t>
-            </w:r>
-          </w:p>
-        </w:tc>
-        <w:tc>
-          <w:tcPr>
-            <w:tcW w:type="dxa" w:w="3628"/>
-          </w:tcPr>
-          <w:p>
-            <w:pPr>
-              <w:spacing w:after="20"/>
-            </w:pPr>
-            <w:r>
-              <w:rPr>
-                <w:sz w:val="19"/>
-              </w:rPr>
-            </w:r>
-            <w:r>
-              <w:rPr>
-                <w:sz w:val="19"/>
-              </w:rPr>
-              <w:t>Revisar el sprint (qué hicimos, qué no, qué aprendimos), hacer 20 min de «explícame lo tuyo» y planificar el siguiente</w:t>
-            </w:r>
-          </w:p>
-        </w:tc>
-        <w:tc>
-          <w:tcPr>
-            <w:tcW w:type="dxa" w:w="907"/>
-          </w:tcPr>
-          <w:p>
-            <w:pPr>
-              <w:spacing w:after="20"/>
-            </w:pPr>
-            <w:r>
-              <w:rPr>
-                <w:sz w:val="19"/>
-              </w:rPr>
-            </w:r>
-            <w:r>
-              <w:rPr>
-                <w:sz w:val="19"/>
-              </w:rPr>
-              <w:t>Ambos</w:t>
-            </w:r>
-          </w:p>
-        </w:tc>
-        <w:tc>
-          <w:tcPr>
-            <w:tcW w:type="dxa" w:w="2438"/>
-          </w:tcPr>
-          <w:p>
-            <w:pPr>
-              <w:spacing w:after="20"/>
-            </w:pPr>
-            <w:r>
-              <w:rPr>
-                <w:sz w:val="19"/>
-              </w:rPr>
-            </w:r>
-            <w:r>
-              <w:rPr>
-                <w:sz w:val="19"/>
-              </w:rPr>
-              <w:t>Llamada Víctor–Diego · 11_Planificacion/Bitacora_Semanal.md y 11_Planificacion/Cronograma_Tesis.xlsx</w:t>
-            </w:r>
-          </w:p>
-        </w:tc>
-        <w:tc>
-          <w:tcPr>
-            <w:tcW w:type="dxa" w:w="1247"/>
-          </w:tcPr>
-          <w:p>
-            <w:pPr>
-              <w:spacing w:after="20"/>
-            </w:pPr>
-            <w:r>
-              <w:rPr>
-                <w:sz w:val="19"/>
-              </w:rPr>
-            </w:r>
-            <w:r>
-              <w:rPr>
-                <w:sz w:val="19"/>
-              </w:rPr>
-              <w:t>En curso</w:t>
+              <w:t>Pendiente</w:t>
             </w:r>
           </w:p>
         </w:tc>
       </w:tr>
     </w:tbl>
     <w:p/>
-    <w:p>
-      <w:pPr>
-        <w:pStyle w:val="Heading2"/>
-      </w:pPr>
-      <w:r>
-        <w:t>Alertas</w:t>
-      </w:r>
-    </w:p>
-    <w:p>
-      <w:pPr>
-        <w:pStyle w:val="ListBullet"/>
-      </w:pPr>
-      <w:r>
-        <w:rPr>
-          <w:b/>
-        </w:rPr>
-        <w:t>El campo depende de Torvesa:</w:t>
-      </w:r>
-      <w:r>
-        <w:rPr/>
-        <w:t xml:space="preserve"> sin línea base no hay análisis de datos (S2-T02, S2-T04) ni proceso AS-IS completo.</w:t>
-      </w:r>
-    </w:p>
-    <w:p>
-      <w:pPr>
-        <w:pStyle w:val="ListBullet"/>
-      </w:pPr>
-      <w:r>
-        <w:rPr/>
-        <w:t>19 de 42 filas de la matriz siguen sin fuente; el capítulo 2 (CRM, A21–A27) es lo más urgente para Víctor.</w:t>
-      </w:r>
-    </w:p>
-    <w:p>
-      <w:pPr>
-        <w:pStyle w:val="ListBullet"/>
-      </w:pPr>
-      <w:r>
-        <w:rPr/>
-        <w:t>La fecha de entrega (D5: 15-dic o enero) sigue sin confirmar.</w:t>
-      </w:r>
-    </w:p>
     <w:p>
       <w:pPr>
         <w:pStyle w:val="Heading2"/>
@@ -3653,19 +2629,7 @@
       <w:commentRangeStart w:id="0"/>
       <w:r>
         <w:rPr/>
-        <w:t xml:space="preserve">Bajar a mano los PDF de la lista de </w:t>
-      </w:r>
-      <w:r>
-        <w:rPr>
-          <w:rFonts w:ascii="Consolas" w:hAnsi="Consolas" w:cs="Consolas" w:eastAsia="Consolas"/>
-          <w:color w:val="0B1F3A"/>
-          <w:sz w:val="19"/>
-        </w:rPr>
-        <w:t>F1_reporte_2026-10-18.md</w:t>
-      </w:r>
-      <w:r>
-        <w:rPr/>
-        <w:t>.</w:t>
+        <w:t>Revisar en Word los caps. I, II y III y el lienzo (control de cambios activado).</w:t>
       </w:r>
       <w:commentRangeEnd w:id="0"/>
       <w:r>
@@ -3682,19 +2646,7 @@
       <w:commentRangeStart w:id="1"/>
       <w:r>
         <w:rPr/>
-        <w:t xml:space="preserve">Revisar la matriz, C1 v0.2, I1 v0.2, el resumen del problema y </w:t>
-      </w:r>
-      <w:r>
-        <w:rPr>
-          <w:rFonts w:ascii="Consolas" w:hAnsi="Consolas" w:cs="Consolas" w:eastAsia="Consolas"/>
-          <w:color w:val="0B1F3A"/>
-          <w:sz w:val="19"/>
-        </w:rPr>
-        <w:t>IA_DIEGO.md</w:t>
-      </w:r>
-      <w:r>
-        <w:rPr/>
-        <w:t>.</w:t>
+        <w:t>Bajar los PDF de la lista del reporte del 19-oct (ya no hace falta Lewis y Sauro).</w:t>
       </w:r>
       <w:commentRangeEnd w:id="1"/>
       <w:r>
@@ -3711,7 +2663,7 @@
       <w:commentRangeStart w:id="2"/>
       <w:r>
         <w:rPr/>
-        <w:t>Confirmar con la tutora la fecha de entrega (D5).</w:t>
+        <w:t>Decidir: plan de precios de la bóveda y la IA; TEAMSLASH como antecedente propio.</w:t>
       </w:r>
       <w:commentRangeEnd w:id="2"/>
       <w:r>
@@ -3719,23 +2671,6 @@
           <w:rStyle w:val="CommentReference"/>
         </w:rPr>
         <w:commentReference w:id="2"/>
-      </w:r>
-    </w:p>
-    <w:p>
-      <w:pPr>
-        <w:pStyle w:val="ListBullet"/>
-      </w:pPr>
-      <w:commentRangeStart w:id="3"/>
-      <w:r>
-        <w:rPr/>
-        <w:t>Llamada de 20 min con Diego: «explícame lo tuyo».</w:t>
-      </w:r>
-      <w:commentRangeEnd w:id="3"/>
-      <w:r>
-        <w:rPr>
-          <w:rStyle w:val="CommentReference"/>
-        </w:rPr>
-        <w:commentReference w:id="3"/>
       </w:r>
     </w:p>
     <w:p>
@@ -5032,9 +3967,87 @@
             </w:r>
             <w:r>
               <w:rPr>
-                <w:sz w:val="19"/>
-              </w:rPr>
-              <w:t>aún no existe — se crea en el sprint S2 (issue #13)</w:t>
+                <w:rFonts w:ascii="Consolas" w:hAnsi="Consolas" w:cs="Consolas" w:eastAsia="Consolas"/>
+                <w:color w:val="0B1F3A"/>
+                <w:sz w:val="19"/>
+              </w:rPr>
+              <w:t>06_Capitulos/2026-10-19_Cap1_Introduccion_p1_v0.1.docx</w:t>
+            </w:r>
+            <w:r>
+              <w:rPr>
+                <w:sz w:val="19"/>
+              </w:rPr>
+              <w:t xml:space="preserve"> (solo en tu PC) · </w:t>
+            </w:r>
+            <w:r>
+              <w:rPr>
+                <w:rFonts w:ascii="Consolas" w:hAnsi="Consolas" w:cs="Consolas" w:eastAsia="Consolas"/>
+                <w:color w:val="0B1F3A"/>
+                <w:sz w:val="19"/>
+              </w:rPr>
+              <w:t>06_Capitulos/2026-10-19_Cap1_Introduccion_p1_v0.1.md</w:t>
+            </w:r>
+            <w:r>
+              <w:rPr>
+                <w:sz w:val="19"/>
+              </w:rPr>
+              <w:t xml:space="preserve"> (solo en tu PC) · </w:t>
+            </w:r>
+            <w:r>
+              <w:rPr>
+                <w:rFonts w:ascii="Consolas" w:hAnsi="Consolas" w:cs="Consolas" w:eastAsia="Consolas"/>
+                <w:color w:val="0B1F3A"/>
+                <w:sz w:val="19"/>
+              </w:rPr>
+              <w:t>06_Capitulos/2026-10-19_Cap1_Introduccion_p2_v0.1.docx</w:t>
+            </w:r>
+            <w:r>
+              <w:rPr>
+                <w:sz w:val="19"/>
+              </w:rPr>
+              <w:t xml:space="preserve"> (solo en tu PC) · </w:t>
+            </w:r>
+            <w:r>
+              <w:rPr>
+                <w:rFonts w:ascii="Consolas" w:hAnsi="Consolas" w:cs="Consolas" w:eastAsia="Consolas"/>
+                <w:color w:val="0B1F3A"/>
+                <w:sz w:val="19"/>
+              </w:rPr>
+              <w:t>06_Capitulos/2026-10-19_Cap1_Introduccion_p2_v0.1.md</w:t>
+            </w:r>
+            <w:r>
+              <w:rPr>
+                <w:sz w:val="19"/>
+              </w:rPr>
+              <w:t xml:space="preserve"> (solo en tu PC) · </w:t>
+            </w:r>
+            <w:r>
+              <w:rPr>
+                <w:rFonts w:ascii="Consolas" w:hAnsi="Consolas" w:cs="Consolas" w:eastAsia="Consolas"/>
+                <w:color w:val="0B1F3A"/>
+                <w:sz w:val="19"/>
+              </w:rPr>
+              <w:t>06_Capitulos/2026-10-19_Resumen_Cap1.md</w:t>
+            </w:r>
+            <w:r>
+              <w:rPr>
+                <w:sz w:val="19"/>
+              </w:rPr>
+              <w:t xml:space="preserve"> (solo en tu PC) · </w:t>
+            </w:r>
+            <w:r>
+              <w:rPr>
+                <w:rFonts w:ascii="Consolas" w:hAnsi="Consolas" w:cs="Consolas" w:eastAsia="Consolas"/>
+                <w:color w:val="0B1F3A"/>
+                <w:sz w:val="19"/>
+              </w:rPr>
+              <w:t>06_Capitulos/~$26-10-19_Cap1_Introduccion_p1_v0.1.docx</w:t>
+            </w:r>
+            <w:r>
+              <w:rPr>
+                <w:sz w:val="19"/>
+              </w:rPr>
+              <w:t xml:space="preserve"> (solo en tu PC)</w:t>
             </w:r>
           </w:p>
         </w:tc>
@@ -5080,7 +4093,7 @@
               <w:rPr>
                 <w:sz w:val="19"/>
               </w:rPr>
-              <w:t xml:space="preserve">243 fichas en Problema, Contexto (11 verificadas) · </w:t>
+              <w:t xml:space="preserve">244 fichas en Problema, Contexto (13 verificadas) · </w:t>
             </w:r>
             <w:hyperlink r:id="rId16">
               <w:r>
@@ -5308,9 +4321,31 @@
             </w:r>
             <w:r>
               <w:rPr>
-                <w:sz w:val="19"/>
-              </w:rPr>
-              <w:t>aún no existe — se crea en el sprint S2 (issue #14)</w:t>
+                <w:rFonts w:ascii="Consolas" w:hAnsi="Consolas" w:cs="Consolas" w:eastAsia="Consolas"/>
+                <w:color w:val="0B1F3A"/>
+                <w:sz w:val="19"/>
+              </w:rPr>
+              <w:t>06_Capitulos/2026-10-19_Cap2_Marco_Teorico_v0.1.docx</w:t>
+            </w:r>
+            <w:r>
+              <w:rPr>
+                <w:sz w:val="19"/>
+              </w:rPr>
+              <w:t xml:space="preserve"> (solo en tu PC) · </w:t>
+            </w:r>
+            <w:r>
+              <w:rPr>
+                <w:rFonts w:ascii="Consolas" w:hAnsi="Consolas" w:cs="Consolas" w:eastAsia="Consolas"/>
+                <w:color w:val="0B1F3A"/>
+                <w:sz w:val="19"/>
+              </w:rPr>
+              <w:t>06_Capitulos/2026-10-19_Cap2_Marco_Teorico_v0.1.md</w:t>
+            </w:r>
+            <w:r>
+              <w:rPr>
+                <w:sz w:val="19"/>
+              </w:rPr>
+              <w:t xml:space="preserve"> (solo en tu PC)</w:t>
             </w:r>
           </w:p>
         </w:tc>
@@ -5356,7 +4391,7 @@
               <w:rPr>
                 <w:sz w:val="19"/>
               </w:rPr>
-              <w:t xml:space="preserve">55 fichas en Evidencia_Datos, Tecnologia_IA, Normativa (13 verificadas) · </w:t>
+              <w:t xml:space="preserve">59 fichas en Evidencia_Datos, Tecnologia_IA, Normativa (17 verificadas) · </w:t>
             </w:r>
             <w:hyperlink r:id="rId16">
               <w:r>
@@ -5584,9 +4619,31 @@
             </w:r>
             <w:r>
               <w:rPr>
-                <w:sz w:val="19"/>
-              </w:rPr>
-              <w:t>aún no existe — se crea en el sprint S2 (issue #15)</w:t>
+                <w:rFonts w:ascii="Consolas" w:hAnsi="Consolas" w:cs="Consolas" w:eastAsia="Consolas"/>
+                <w:color w:val="0B1F3A"/>
+                <w:sz w:val="19"/>
+              </w:rPr>
+              <w:t>06_Capitulos/2026-10-19_Cap3_Metodologia_v0.1.docx</w:t>
+            </w:r>
+            <w:r>
+              <w:rPr>
+                <w:sz w:val="19"/>
+              </w:rPr>
+              <w:t xml:space="preserve"> (solo en tu PC) · </w:t>
+            </w:r>
+            <w:r>
+              <w:rPr>
+                <w:rFonts w:ascii="Consolas" w:hAnsi="Consolas" w:cs="Consolas" w:eastAsia="Consolas"/>
+                <w:color w:val="0B1F3A"/>
+                <w:sz w:val="19"/>
+              </w:rPr>
+              <w:t>06_Capitulos/2026-10-19_Cap3_Metodologia_v0.1.md</w:t>
+            </w:r>
+            <w:r>
+              <w:rPr>
+                <w:sz w:val="19"/>
+              </w:rPr>
+              <w:t xml:space="preserve"> (solo en tu PC)</w:t>
             </w:r>
           </w:p>
         </w:tc>
@@ -5632,7 +4689,7 @@
               <w:rPr>
                 <w:sz w:val="19"/>
               </w:rPr>
-              <w:t xml:space="preserve">241 fichas en Metodologia (6 verificadas) · </w:t>
+              <w:t xml:space="preserve">241 fichas en Metodologia (7 verificadas) · </w:t>
             </w:r>
             <w:hyperlink r:id="rId16">
               <w:r>
@@ -5908,7 +4965,7 @@
               <w:rPr>
                 <w:sz w:val="19"/>
               </w:rPr>
-              <w:t xml:space="preserve">190 fichas en Problema (7 verificadas) · </w:t>
+              <w:t xml:space="preserve">191 fichas en Problema (9 verificadas) · </w:t>
             </w:r>
             <w:hyperlink r:id="rId16">
               <w:r>
@@ -6184,7 +5241,7 @@
               <w:rPr>
                 <w:sz w:val="19"/>
               </w:rPr>
-              <w:t xml:space="preserve">50 fichas en Tecnologia_IA, Casos_Estudio, Costos_Viabilidad, Normativa (10 verificadas) · </w:t>
+              <w:t xml:space="preserve">54 fichas en Tecnologia_IA, Casos_Estudio, Costos_Viabilidad, Normativa (14 verificadas) · </w:t>
             </w:r>
             <w:hyperlink r:id="rId16">
               <w:r>
@@ -6857,7 +5914,7 @@
               <w:rPr>
                 <w:sz w:val="19"/>
               </w:rPr>
-              <w:t>6</w:t>
+              <w:t>7</w:t>
             </w:r>
           </w:p>
         </w:tc>
@@ -6969,7 +6026,7 @@
               <w:rPr>
                 <w:sz w:val="19"/>
               </w:rPr>
-              <w:t>190</w:t>
+              <w:t>191</w:t>
             </w:r>
           </w:p>
         </w:tc>
@@ -6990,7 +6047,7 @@
               <w:rPr>
                 <w:sz w:val="19"/>
               </w:rPr>
-              <w:t>7</w:t>
+              <w:t>9</w:t>
             </w:r>
           </w:p>
         </w:tc>
@@ -7036,7 +6093,7 @@
               <w:rPr>
                 <w:sz w:val="19"/>
               </w:rPr>
-              <w:t>8</w:t>
+              <w:t>12</w:t>
             </w:r>
           </w:p>
         </w:tc>
@@ -7058,7 +6115,7 @@
               <w:rPr>
                 <w:sz w:val="19"/>
               </w:rPr>
-              <w:t>7</w:t>
+              <w:t>11</w:t>
             </w:r>
           </w:p>
         </w:tc>
@@ -8185,20 +7242,19 @@
     <w:p>
       <w:r>
         <w:rPr/>
-        <w:t xml:space="preserve">Archivos: aún no existen — la carpeta es </w:t>
+        <w:t xml:space="preserve">Archivos: </w:t>
       </w:r>
-      <w:hyperlink r:id="rId36">
-        <w:r>
-          <w:rPr>
-            <w:color w:val="B87333"/>
-            <w:u w:val="single"/>
-          </w:rPr>
-          <w:t xml:space="preserve">06_Capitulos/Modelo_Negocio</w:t>
-        </w:r>
-      </w:hyperlink>
+      <w:r>
+        <w:rPr>
+          <w:rFonts w:ascii="Consolas" w:hAnsi="Consolas" w:cs="Consolas" w:eastAsia="Consolas"/>
+          <w:color w:val="0B1F3A"/>
+          <w:sz w:val="19"/>
+        </w:rPr>
+        <w:t>06_Capitulos/Modelo_Negocio/2026-10-19_Lienzo_Modelo_Negocio_v0.1.docx</w:t>
+      </w:r>
       <w:r>
         <w:rPr/>
-        <w:t>. El modelo irá en Excel con fórmulas vivas, formato condicional y notas al lado de cada supuesto.</w:t>
+        <w:t xml:space="preserve"> (solo en tu PC)</w:t>
       </w:r>
     </w:p>
     <w:p>
@@ -8786,7 +7842,7 @@
         <w:rPr/>
         <w:t xml:space="preserve"> datos simulados, fecha 15-dic, D2, D6 y duración de la validación — </w:t>
       </w:r>
-      <w:hyperlink r:id="rId37">
+      <w:hyperlink r:id="rId36">
         <w:r>
           <w:rPr>
             <w:color w:val="B87333"/>
@@ -18644,7 +17700,7 @@
 
 <file path=word/comments.xml><?xml version="1.0" encoding="utf-8"?>
 <w:comments xmlns:a="http://schemas.openxmlformats.org/drawingml/2006/main" xmlns:pic="http://schemas.openxmlformats.org/drawingml/2006/picture" xmlns:r="http://schemas.openxmlformats.org/officeDocument/2006/relationships" xmlns:w="http://schemas.openxmlformats.org/wordprocessingml/2006/main" xmlns:wp="http://schemas.openxmlformats.org/drawingml/2006/wordprocessingDrawing" xmlns:mc="http://schemas.openxmlformats.org/markup-compatibility/2006" xmlns:a14="http://schemas.microsoft.com/office/drawing/2010/main" xmlns:w14="http://schemas.microsoft.com/office/word/2010/wordml" xmlns:wpc="http://schemas.microsoft.com/office/word/2010/wordprocessingCanvas">
-  <w:comment w:id="0" w:author="Claude" w:initials="CL" w:date="2026-10-19T02:00:28Z">
+  <w:comment w:id="0" w:author="Claude" w:initials="CL" w:date="2026-10-19T15:10:02Z">
     <w:p>
       <w:pPr>
         <w:pStyle w:val="CommentText"/>
@@ -18660,7 +17716,7 @@
       </w:r>
     </w:p>
   </w:comment>
-  <w:comment w:id="1" w:author="Claude" w:initials="CL" w:date="2026-10-19T02:00:28Z">
+  <w:comment w:id="1" w:author="Claude" w:initials="CL" w:date="2026-10-19T15:10:02Z">
     <w:p>
       <w:pPr>
         <w:pStyle w:val="CommentText"/>
@@ -18676,23 +17732,7 @@
       </w:r>
     </w:p>
   </w:comment>
-  <w:comment w:id="2" w:author="Claude" w:initials="CL" w:date="2026-10-19T02:00:28Z">
-    <w:p>
-      <w:pPr>
-        <w:pStyle w:val="CommentText"/>
-      </w:pPr>
-      <w:r>
-        <w:rPr>
-          <w:rStyle w:val="CommentReference"/>
-        </w:rPr>
-        <w:annotationRef/>
-      </w:r>
-      <w:r>
-        <w:t>Víctor: pendiente de tu decisión o acción.</w:t>
-      </w:r>
-    </w:p>
-  </w:comment>
-  <w:comment w:id="3" w:author="Claude" w:initials="CL" w:date="2026-10-19T02:00:28Z">
+  <w:comment w:id="2" w:author="Claude" w:initials="CL" w:date="2026-10-19T15:10:02Z">
     <w:p>
       <w:pPr>
         <w:pStyle w:val="CommentText"/>

</xml_diff>

<commit_message>
v0.1 aprobadas por Víctor y v0.2 de los caps. I, II y III y del lienzo (DEC-16, DEC-17); norma SHA-256 y 2 fuentes nuevas verificadas (40); búsqueda documentada de A28/A29; matriz v0.3; NotebookLM con 29 fuentes y su guía (#13 #14 #15 #58) [IA: Claude]
Co-Authored-By: Claude Opus 5.5 <noreply@anthropic.com>
</commit_message>
<xml_diff>
--- a/00_DOCUMENTO_MADRE.docx
+++ b/00_DOCUMENTO_MADRE.docx
@@ -62,7 +62,7 @@
                 <w:color w:val="CFD8E3"/>
                 <w:sz w:val="18"/>
               </w:rPr>
-              <w:t>Actualizado el 2026-10-19</w:t>
+              <w:t>Actualizado el 2026-10-20</w:t>
             </w:r>
           </w:p>
         </w:tc>
@@ -414,7 +414,7 @@
               <w:rPr>
                 <w:sz w:val="19"/>
               </w:rPr>
-              <w:t>8 de 166 tareas hechas (5 %)</w:t>
+              <w:t>15 de 166 tareas hechas (9 %)</w:t>
             </w:r>
           </w:p>
         </w:tc>
@@ -435,7 +435,7 @@
               <w:rPr>
                 <w:sz w:val="19"/>
               </w:rPr>
-              <w:t>544 (37 verificadas)</w:t>
+              <w:t>547 (40 verificadas)</w:t>
             </w:r>
           </w:p>
         </w:tc>
@@ -456,7 +456,7 @@
               <w:rPr>
                 <w:sz w:val="19"/>
               </w:rPr>
-              <w:t>2026-10-19 · Sprint 2, día 1 (lunes)</w:t>
+              <w:t>2026-10-20 · Sprint 2, día 2 (martes)</w:t>
             </w:r>
           </w:p>
         </w:tc>
@@ -743,7 +743,7 @@
               <w:rPr>
                 <w:sz w:val="19"/>
               </w:rPr>
-              <w:t>En curso</w:t>
+              <w:t>Hecho</w:t>
             </w:r>
           </w:p>
         </w:tc>
@@ -962,7 +962,7 @@
               <w:rPr>
                 <w:sz w:val="19"/>
               </w:rPr>
-              <w:t>En curso</w:t>
+              <w:t>Hecho</w:t>
             </w:r>
           </w:p>
         </w:tc>
@@ -1181,7 +1181,7 @@
               <w:rPr>
                 <w:sz w:val="19"/>
               </w:rPr>
-              <w:t>En curso</w:t>
+              <w:t>Hecho</w:t>
             </w:r>
           </w:p>
         </w:tc>
@@ -1400,7 +1400,7 @@
               <w:rPr>
                 <w:sz w:val="19"/>
               </w:rPr>
-              <w:t>En curso</w:t>
+              <w:t>Hecho</w:t>
             </w:r>
           </w:p>
         </w:tc>
@@ -1731,7 +1731,7 @@
               <w:rPr>
                 <w:sz w:val="19"/>
               </w:rPr>
-              <w:t>En curso</w:t>
+              <w:t>Hecho</w:t>
             </w:r>
           </w:p>
         </w:tc>
@@ -1950,7 +1950,7 @@
               <w:rPr>
                 <w:sz w:val="19"/>
               </w:rPr>
-              <w:t>En curso</w:t>
+              <w:t>Hecho</w:t>
             </w:r>
           </w:p>
         </w:tc>
@@ -2388,7 +2388,7 @@
               <w:rPr>
                 <w:sz w:val="19"/>
               </w:rPr>
-              <w:t>En curso</w:t>
+              <w:t>Hecho</w:t>
             </w:r>
           </w:p>
         </w:tc>
@@ -2614,65 +2614,6 @@
       </w:tr>
     </w:tbl>
     <w:p/>
-    <w:p>
-      <w:pPr>
-        <w:pStyle w:val="Heading2"/>
-      </w:pPr>
-      <w:r>
-        <w:t>Necesita tu decisión</w:t>
-      </w:r>
-    </w:p>
-    <w:p>
-      <w:pPr>
-        <w:pStyle w:val="ListBullet"/>
-      </w:pPr>
-      <w:commentRangeStart w:id="0"/>
-      <w:r>
-        <w:rPr/>
-        <w:t>Revisar en Word los caps. I, II y III y el lienzo (control de cambios activado).</w:t>
-      </w:r>
-      <w:commentRangeEnd w:id="0"/>
-      <w:r>
-        <w:rPr>
-          <w:rStyle w:val="CommentReference"/>
-        </w:rPr>
-        <w:commentReference w:id="0"/>
-      </w:r>
-    </w:p>
-    <w:p>
-      <w:pPr>
-        <w:pStyle w:val="ListBullet"/>
-      </w:pPr>
-      <w:commentRangeStart w:id="1"/>
-      <w:r>
-        <w:rPr/>
-        <w:t>Bajar los PDF de la lista del reporte del 19-oct (ya no hace falta Lewis y Sauro).</w:t>
-      </w:r>
-      <w:commentRangeEnd w:id="1"/>
-      <w:r>
-        <w:rPr>
-          <w:rStyle w:val="CommentReference"/>
-        </w:rPr>
-        <w:commentReference w:id="1"/>
-      </w:r>
-    </w:p>
-    <w:p>
-      <w:pPr>
-        <w:pStyle w:val="ListBullet"/>
-      </w:pPr>
-      <w:commentRangeStart w:id="2"/>
-      <w:r>
-        <w:rPr/>
-        <w:t>Decidir: plan de precios de la bóveda y la IA; TEAMSLASH como antecedente propio.</w:t>
-      </w:r>
-      <w:commentRangeEnd w:id="2"/>
-      <w:r>
-        <w:rPr>
-          <w:rStyle w:val="CommentReference"/>
-        </w:rPr>
-        <w:commentReference w:id="2"/>
-      </w:r>
-    </w:p>
     <w:p>
       <w:r>
         <w:br w:type="page"/>
@@ -2727,7 +2668,7 @@
                     <pic:cNvPicPr/>
                   </pic:nvPicPr>
                   <pic:blipFill>
-                    <a:blip r:embed="rId13"/>
+                    <a:blip r:embed="rId12"/>
                     <a:stretch>
                       <a:fillRect/>
                     </a:stretch>
@@ -2847,7 +2788,7 @@
                 <w:sz w:val="19"/>
               </w:rPr>
             </w:r>
-            <w:hyperlink r:id="rId14">
+            <w:hyperlink r:id="rId13">
               <w:r>
                 <w:rPr>
                   <w:color w:val="B87333"/>
@@ -2916,7 +2857,7 @@
                 <w:sz w:val="19"/>
               </w:rPr>
             </w:r>
-            <w:hyperlink r:id="rId15">
+            <w:hyperlink r:id="rId14">
               <w:r>
                 <w:rPr>
                   <w:color w:val="B87333"/>
@@ -2986,7 +2927,7 @@
                 <w:sz w:val="19"/>
               </w:rPr>
             </w:r>
-            <w:hyperlink r:id="rId16">
+            <w:hyperlink r:id="rId15">
               <w:r>
                 <w:rPr>
                   <w:color w:val="B87333"/>
@@ -3055,7 +2996,7 @@
                 <w:sz w:val="19"/>
               </w:rPr>
             </w:r>
-            <w:hyperlink r:id="rId17">
+            <w:hyperlink r:id="rId16">
               <w:r>
                 <w:rPr>
                   <w:color w:val="B87333"/>
@@ -3125,7 +3066,7 @@
                 <w:sz w:val="19"/>
               </w:rPr>
             </w:r>
-            <w:hyperlink r:id="rId18">
+            <w:hyperlink r:id="rId17">
               <w:r>
                 <w:rPr>
                   <w:color w:val="B87333"/>
@@ -3194,7 +3135,7 @@
                 <w:sz w:val="19"/>
               </w:rPr>
             </w:r>
-            <w:hyperlink r:id="rId19">
+            <w:hyperlink r:id="rId18">
               <w:r>
                 <w:rPr>
                   <w:color w:val="B87333"/>
@@ -3264,7 +3205,7 @@
                 <w:sz w:val="19"/>
               </w:rPr>
             </w:r>
-            <w:hyperlink r:id="rId20">
+            <w:hyperlink r:id="rId19">
               <w:r>
                 <w:rPr>
                   <w:color w:val="B87333"/>
@@ -3333,7 +3274,7 @@
                 <w:sz w:val="19"/>
               </w:rPr>
             </w:r>
-            <w:hyperlink r:id="rId21">
+            <w:hyperlink r:id="rId20">
               <w:r>
                 <w:rPr>
                   <w:color w:val="B87333"/>
@@ -3403,7 +3344,7 @@
                 <w:sz w:val="19"/>
               </w:rPr>
             </w:r>
-            <w:hyperlink r:id="rId22">
+            <w:hyperlink r:id="rId21">
               <w:r>
                 <w:rPr>
                   <w:color w:val="B87333"/>
@@ -3472,7 +3413,7 @@
                 <w:sz w:val="19"/>
               </w:rPr>
             </w:r>
-            <w:hyperlink r:id="rId23">
+            <w:hyperlink r:id="rId22">
               <w:r>
                 <w:rPr>
                   <w:color w:val="B87333"/>
@@ -3542,7 +3483,7 @@
                 <w:sz w:val="19"/>
               </w:rPr>
             </w:r>
-            <w:hyperlink r:id="rId24">
+            <w:hyperlink r:id="rId23">
               <w:r>
                 <w:rPr>
                   <w:color w:val="B87333"/>
@@ -3611,7 +3552,7 @@
                 <w:sz w:val="19"/>
               </w:rPr>
             </w:r>
-            <w:hyperlink r:id="rId25">
+            <w:hyperlink r:id="rId24">
               <w:r>
                 <w:rPr>
                   <w:color w:val="B87333"/>
@@ -3681,7 +3622,7 @@
                 <w:sz w:val="19"/>
               </w:rPr>
             </w:r>
-            <w:hyperlink r:id="rId26">
+            <w:hyperlink r:id="rId25">
               <w:r>
                 <w:rPr>
                   <w:color w:val="B87333"/>
@@ -3748,7 +3689,7 @@
         <w:rPr/>
         <w:t xml:space="preserve"> </w:t>
       </w:r>
-      <w:hyperlink r:id="rId27">
+      <w:hyperlink r:id="rId26">
         <w:r>
           <w:rPr>
             <w:color w:val="B87333"/>
@@ -3761,7 +3702,7 @@
         <w:rPr/>
         <w:t xml:space="preserve"> · </w:t>
       </w:r>
-      <w:hyperlink r:id="rId28">
+      <w:hyperlink r:id="rId27">
         <w:r>
           <w:rPr>
             <w:color w:val="B87333"/>
@@ -3774,7 +3715,7 @@
         <w:rPr/>
         <w:t xml:space="preserve"> · </w:t>
       </w:r>
-      <w:hyperlink r:id="rId29">
+      <w:hyperlink r:id="rId28">
         <w:r>
           <w:rPr>
             <w:color w:val="B87333"/>
@@ -3787,7 +3728,7 @@
         <w:rPr/>
         <w:t xml:space="preserve"> · </w:t>
       </w:r>
-      <w:hyperlink r:id="rId30">
+      <w:hyperlink r:id="rId29">
         <w:r>
           <w:rPr>
             <w:color w:val="B87333"/>
@@ -3800,7 +3741,7 @@
         <w:rPr/>
         <w:t xml:space="preserve"> · </w:t>
       </w:r>
-      <w:hyperlink r:id="rId31">
+      <w:hyperlink r:id="rId30">
         <w:r>
           <w:rPr>
             <w:color w:val="B87333"/>
@@ -3813,7 +3754,7 @@
         <w:rPr/>
         <w:t xml:space="preserve"> · </w:t>
       </w:r>
-      <w:hyperlink r:id="rId32">
+      <w:hyperlink r:id="rId31">
         <w:r>
           <w:rPr>
             <w:color w:val="B87333"/>
@@ -3965,13 +3906,88 @@
                 <w:sz w:val="19"/>
               </w:rPr>
             </w:r>
+            <w:hyperlink r:id="rId32">
+              <w:r>
+                <w:rPr>
+                  <w:color w:val="B87333"/>
+                  <w:u w:val="single"/>
+                </w:rPr>
+                <w:t xml:space="preserve">06_Capitulos/2026-10-19_Cap1_Introduccion_p1_v0.1.docx</w:t>
+              </w:r>
+            </w:hyperlink>
+            <w:r>
+              <w:rPr>
+                <w:sz w:val="19"/>
+              </w:rPr>
+              <w:t xml:space="preserve"> · </w:t>
+            </w:r>
+            <w:hyperlink r:id="rId33">
+              <w:r>
+                <w:rPr>
+                  <w:color w:val="B87333"/>
+                  <w:u w:val="single"/>
+                </w:rPr>
+                <w:t xml:space="preserve">06_Capitulos/2026-10-19_Cap1_Introduccion_p1_v0.1.md</w:t>
+              </w:r>
+            </w:hyperlink>
+            <w:r>
+              <w:rPr>
+                <w:sz w:val="19"/>
+              </w:rPr>
+              <w:t xml:space="preserve"> · </w:t>
+            </w:r>
+            <w:hyperlink r:id="rId34">
+              <w:r>
+                <w:rPr>
+                  <w:color w:val="B87333"/>
+                  <w:u w:val="single"/>
+                </w:rPr>
+                <w:t xml:space="preserve">06_Capitulos/2026-10-19_Cap1_Introduccion_p2_v0.1.docx</w:t>
+              </w:r>
+            </w:hyperlink>
+            <w:r>
+              <w:rPr>
+                <w:sz w:val="19"/>
+              </w:rPr>
+              <w:t xml:space="preserve"> · </w:t>
+            </w:r>
+            <w:hyperlink r:id="rId35">
+              <w:r>
+                <w:rPr>
+                  <w:color w:val="B87333"/>
+                  <w:u w:val="single"/>
+                </w:rPr>
+                <w:t xml:space="preserve">06_Capitulos/2026-10-19_Cap1_Introduccion_p2_v0.1.md</w:t>
+              </w:r>
+            </w:hyperlink>
+            <w:r>
+              <w:rPr>
+                <w:sz w:val="19"/>
+              </w:rPr>
+              <w:t xml:space="preserve"> · </w:t>
+            </w:r>
+            <w:hyperlink r:id="rId36">
+              <w:r>
+                <w:rPr>
+                  <w:color w:val="B87333"/>
+                  <w:u w:val="single"/>
+                </w:rPr>
+                <w:t xml:space="preserve">06_Capitulos/2026-10-19_Resumen_Cap1.md</w:t>
+              </w:r>
+            </w:hyperlink>
+            <w:r>
+              <w:rPr>
+                <w:sz w:val="19"/>
+              </w:rPr>
+              <w:t xml:space="preserve"> · </w:t>
+            </w:r>
             <w:r>
               <w:rPr>
                 <w:rFonts w:ascii="Consolas" w:hAnsi="Consolas" w:cs="Consolas" w:eastAsia="Consolas"/>
                 <w:color w:val="0B1F3A"/>
                 <w:sz w:val="19"/>
               </w:rPr>
-              <w:t>06_Capitulos/2026-10-19_Cap1_Introduccion_p1_v0.1.docx</w:t>
+              <w:t>06_Capitulos/2026-10-20_Cap1_Introduccion_p1_v0.2.docx</w:t>
             </w:r>
             <w:r>
               <w:rPr>
@@ -3985,7 +4001,7 @@
                 <w:color w:val="0B1F3A"/>
                 <w:sz w:val="19"/>
               </w:rPr>
-              <w:t>06_Capitulos/2026-10-19_Cap1_Introduccion_p1_v0.1.md</w:t>
+              <w:t>06_Capitulos/2026-10-20_Cap1_Introduccion_p1_v0.2.md</w:t>
             </w:r>
             <w:r>
               <w:rPr>
@@ -3999,7 +4015,7 @@
                 <w:color w:val="0B1F3A"/>
                 <w:sz w:val="19"/>
               </w:rPr>
-              <w:t>06_Capitulos/2026-10-19_Cap1_Introduccion_p2_v0.1.docx</w:t>
+              <w:t>06_Capitulos/2026-10-20_Cap1_Introduccion_p2_v0.2.docx</w:t>
             </w:r>
             <w:r>
               <w:rPr>
@@ -4013,35 +4029,7 @@
                 <w:color w:val="0B1F3A"/>
                 <w:sz w:val="19"/>
               </w:rPr>
-              <w:t>06_Capitulos/2026-10-19_Cap1_Introduccion_p2_v0.1.md</w:t>
-            </w:r>
-            <w:r>
-              <w:rPr>
-                <w:sz w:val="19"/>
-              </w:rPr>
-              <w:t xml:space="preserve"> (solo en tu PC) · </w:t>
-            </w:r>
-            <w:r>
-              <w:rPr>
-                <w:rFonts w:ascii="Consolas" w:hAnsi="Consolas" w:cs="Consolas" w:eastAsia="Consolas"/>
-                <w:color w:val="0B1F3A"/>
-                <w:sz w:val="19"/>
-              </w:rPr>
-              <w:t>06_Capitulos/2026-10-19_Resumen_Cap1.md</w:t>
-            </w:r>
-            <w:r>
-              <w:rPr>
-                <w:sz w:val="19"/>
-              </w:rPr>
-              <w:t xml:space="preserve"> (solo en tu PC) · </w:t>
-            </w:r>
-            <w:r>
-              <w:rPr>
-                <w:rFonts w:ascii="Consolas" w:hAnsi="Consolas" w:cs="Consolas" w:eastAsia="Consolas"/>
-                <w:color w:val="0B1F3A"/>
-                <w:sz w:val="19"/>
-              </w:rPr>
-              <w:t>06_Capitulos/~$26-10-19_Cap1_Introduccion_p1_v0.1.docx</w:t>
+              <w:t>06_Capitulos/2026-10-20_Cap1_Introduccion_p2_v0.2.md</w:t>
             </w:r>
             <w:r>
               <w:rPr>
@@ -4093,9 +4081,9 @@
               <w:rPr>
                 <w:sz w:val="19"/>
               </w:rPr>
-              <w:t xml:space="preserve">244 fichas en Problema, Contexto (13 verificadas) · </w:t>
-            </w:r>
-            <w:hyperlink r:id="rId16">
+              <w:t xml:space="preserve">245 fichas en Problema, Contexto (14 verificadas) · </w:t>
+            </w:r>
+            <w:hyperlink r:id="rId15">
               <w:r>
                 <w:rPr>
                   <w:color w:val="B87333"/>
@@ -4319,13 +4307,43 @@
                 <w:sz w:val="19"/>
               </w:rPr>
             </w:r>
+            <w:hyperlink r:id="rId37">
+              <w:r>
+                <w:rPr>
+                  <w:color w:val="B87333"/>
+                  <w:u w:val="single"/>
+                </w:rPr>
+                <w:t xml:space="preserve">06_Capitulos/2026-10-19_Cap2_Marco_Teorico_v0.1.docx</w:t>
+              </w:r>
+            </w:hyperlink>
+            <w:r>
+              <w:rPr>
+                <w:sz w:val="19"/>
+              </w:rPr>
+              <w:t xml:space="preserve"> · </w:t>
+            </w:r>
+            <w:hyperlink r:id="rId38">
+              <w:r>
+                <w:rPr>
+                  <w:color w:val="B87333"/>
+                  <w:u w:val="single"/>
+                </w:rPr>
+                <w:t xml:space="preserve">06_Capitulos/2026-10-19_Cap2_Marco_Teorico_v0.1.md</w:t>
+              </w:r>
+            </w:hyperlink>
+            <w:r>
+              <w:rPr>
+                <w:sz w:val="19"/>
+              </w:rPr>
+              <w:t xml:space="preserve"> · </w:t>
+            </w:r>
             <w:r>
               <w:rPr>
                 <w:rFonts w:ascii="Consolas" w:hAnsi="Consolas" w:cs="Consolas" w:eastAsia="Consolas"/>
                 <w:color w:val="0B1F3A"/>
                 <w:sz w:val="19"/>
               </w:rPr>
-              <w:t>06_Capitulos/2026-10-19_Cap2_Marco_Teorico_v0.1.docx</w:t>
+              <w:t>06_Capitulos/2026-10-20_Cap2_Marco_Teorico_v0.2.docx</w:t>
             </w:r>
             <w:r>
               <w:rPr>
@@ -4339,7 +4357,7 @@
                 <w:color w:val="0B1F3A"/>
                 <w:sz w:val="19"/>
               </w:rPr>
-              <w:t>06_Capitulos/2026-10-19_Cap2_Marco_Teorico_v0.1.md</w:t>
+              <w:t>06_Capitulos/2026-10-20_Cap2_Marco_Teorico_v0.2.md</w:t>
             </w:r>
             <w:r>
               <w:rPr>
@@ -4391,9 +4409,9 @@
               <w:rPr>
                 <w:sz w:val="19"/>
               </w:rPr>
-              <w:t xml:space="preserve">59 fichas en Evidencia_Datos, Tecnologia_IA, Normativa (17 verificadas) · </w:t>
-            </w:r>
-            <w:hyperlink r:id="rId16">
+              <w:t xml:space="preserve">61 fichas en Evidencia_Datos, Tecnologia_IA, Normativa (19 verificadas) · </w:t>
+            </w:r>
+            <w:hyperlink r:id="rId15">
               <w:r>
                 <w:rPr>
                   <w:color w:val="B87333"/>
@@ -4617,13 +4635,43 @@
                 <w:sz w:val="19"/>
               </w:rPr>
             </w:r>
+            <w:hyperlink r:id="rId39">
+              <w:r>
+                <w:rPr>
+                  <w:color w:val="B87333"/>
+                  <w:u w:val="single"/>
+                </w:rPr>
+                <w:t xml:space="preserve">06_Capitulos/2026-10-19_Cap3_Metodologia_v0.1.docx</w:t>
+              </w:r>
+            </w:hyperlink>
+            <w:r>
+              <w:rPr>
+                <w:sz w:val="19"/>
+              </w:rPr>
+              <w:t xml:space="preserve"> · </w:t>
+            </w:r>
+            <w:hyperlink r:id="rId40">
+              <w:r>
+                <w:rPr>
+                  <w:color w:val="B87333"/>
+                  <w:u w:val="single"/>
+                </w:rPr>
+                <w:t xml:space="preserve">06_Capitulos/2026-10-19_Cap3_Metodologia_v0.1.md</w:t>
+              </w:r>
+            </w:hyperlink>
+            <w:r>
+              <w:rPr>
+                <w:sz w:val="19"/>
+              </w:rPr>
+              <w:t xml:space="preserve"> · </w:t>
+            </w:r>
             <w:r>
               <w:rPr>
                 <w:rFonts w:ascii="Consolas" w:hAnsi="Consolas" w:cs="Consolas" w:eastAsia="Consolas"/>
                 <w:color w:val="0B1F3A"/>
                 <w:sz w:val="19"/>
               </w:rPr>
-              <w:t>06_Capitulos/2026-10-19_Cap3_Metodologia_v0.1.docx</w:t>
+              <w:t>06_Capitulos/2026-10-20_Cap3_Metodologia_v0.2.docx</w:t>
             </w:r>
             <w:r>
               <w:rPr>
@@ -4637,7 +4685,7 @@
                 <w:color w:val="0B1F3A"/>
                 <w:sz w:val="19"/>
               </w:rPr>
-              <w:t>06_Capitulos/2026-10-19_Cap3_Metodologia_v0.1.md</w:t>
+              <w:t>06_Capitulos/2026-10-20_Cap3_Metodologia_v0.2.md</w:t>
             </w:r>
             <w:r>
               <w:rPr>
@@ -4691,7 +4739,7 @@
               </w:rPr>
               <w:t xml:space="preserve">241 fichas en Metodologia (7 verificadas) · </w:t>
             </w:r>
-            <w:hyperlink r:id="rId16">
+            <w:hyperlink r:id="rId15">
               <w:r>
                 <w:rPr>
                   <w:color w:val="B87333"/>
@@ -4967,7 +5015,7 @@
               </w:rPr>
               <w:t xml:space="preserve">191 fichas en Problema (9 verificadas) · </w:t>
             </w:r>
-            <w:hyperlink r:id="rId16">
+            <w:hyperlink r:id="rId15">
               <w:r>
                 <w:rPr>
                   <w:color w:val="B87333"/>
@@ -5241,9 +5289,9 @@
               <w:rPr>
                 <w:sz w:val="19"/>
               </w:rPr>
-              <w:t xml:space="preserve">54 fichas en Tecnologia_IA, Casos_Estudio, Costos_Viabilidad, Normativa (14 verificadas) · </w:t>
-            </w:r>
-            <w:hyperlink r:id="rId16">
+              <w:t xml:space="preserve">56 fichas en Tecnologia_IA, Casos_Estudio, Costos_Viabilidad, Normativa (16 verificadas) · </w:t>
+            </w:r>
+            <w:hyperlink r:id="rId15">
               <w:r>
                 <w:rPr>
                   <w:color w:val="B87333"/>
@@ -5519,7 +5567,7 @@
               </w:rPr>
               <w:t xml:space="preserve">5 fichas en Evidencia_Datos (3 verificadas) · </w:t>
             </w:r>
-            <w:hyperlink r:id="rId16">
+            <w:hyperlink r:id="rId15">
               <w:r>
                 <w:rPr>
                   <w:color w:val="B87333"/>
@@ -5760,7 +5808,7 @@
               <w:rPr>
                 <w:sz w:val="19"/>
               </w:rPr>
-              <w:t>53</w:t>
+              <w:t>54</w:t>
             </w:r>
           </w:p>
         </w:tc>
@@ -5781,7 +5829,7 @@
               <w:rPr>
                 <w:sz w:val="19"/>
               </w:rPr>
-              <w:t>4</w:t>
+              <w:t>5</w:t>
             </w:r>
           </w:p>
         </w:tc>
@@ -6093,7 +6141,7 @@
               <w:rPr>
                 <w:sz w:val="19"/>
               </w:rPr>
-              <w:t>12</w:t>
+              <w:t>14</w:t>
             </w:r>
           </w:p>
         </w:tc>
@@ -6115,7 +6163,7 @@
               <w:rPr>
                 <w:sz w:val="19"/>
               </w:rPr>
-              <w:t>11</w:t>
+              <w:t>13</w:t>
             </w:r>
           </w:p>
         </w:tc>
@@ -6155,7 +6203,7 @@
         <w:rPr/>
         <w:t xml:space="preserve"> </w:t>
       </w:r>
-      <w:hyperlink r:id="rId33">
+      <w:hyperlink r:id="rId41">
         <w:r>
           <w:rPr>
             <w:color w:val="B87333"/>
@@ -6323,7 +6371,7 @@
                 <w:sz w:val="19"/>
               </w:rPr>
             </w:r>
-            <w:hyperlink r:id="rId34">
+            <w:hyperlink r:id="rId42">
               <w:r>
                 <w:rPr>
                   <w:color w:val="B87333"/>
@@ -6394,7 +6442,7 @@
                 <w:sz w:val="19"/>
               </w:rPr>
             </w:r>
-            <w:hyperlink r:id="rId34">
+            <w:hyperlink r:id="rId42">
               <w:r>
                 <w:rPr>
                   <w:color w:val="B87333"/>
@@ -6462,7 +6510,7 @@
                 <w:sz w:val="19"/>
               </w:rPr>
             </w:r>
-            <w:hyperlink r:id="rId34">
+            <w:hyperlink r:id="rId42">
               <w:r>
                 <w:rPr>
                   <w:color w:val="B87333"/>
@@ -6533,7 +6581,7 @@
                 <w:sz w:val="19"/>
               </w:rPr>
             </w:r>
-            <w:hyperlink r:id="rId34">
+            <w:hyperlink r:id="rId42">
               <w:r>
                 <w:rPr>
                   <w:color w:val="B87333"/>
@@ -6709,7 +6757,7 @@
               <w:rPr/>
               <w:t xml:space="preserve">: no se usan. </w:t>
             </w:r>
-            <w:hyperlink r:id="rId35">
+            <w:hyperlink r:id="rId43">
               <w:r>
                 <w:rPr>
                   <w:color w:val="B87333"/>
@@ -7244,13 +7292,26 @@
         <w:rPr/>
         <w:t xml:space="preserve">Archivos: </w:t>
       </w:r>
+      <w:hyperlink r:id="rId44">
+        <w:r>
+          <w:rPr>
+            <w:color w:val="B87333"/>
+            <w:u w:val="single"/>
+          </w:rPr>
+          <w:t xml:space="preserve">06_Capitulos/Modelo_Negocio/2026-10-19_Lienzo_Modelo_Negocio_v0.1.docx</w:t>
+        </w:r>
+      </w:hyperlink>
+      <w:r>
+        <w:rPr/>
+        <w:t xml:space="preserve"> · </w:t>
+      </w:r>
       <w:r>
         <w:rPr>
           <w:rFonts w:ascii="Consolas" w:hAnsi="Consolas" w:cs="Consolas" w:eastAsia="Consolas"/>
           <w:color w:val="0B1F3A"/>
           <w:sz w:val="19"/>
         </w:rPr>
-        <w:t>06_Capitulos/Modelo_Negocio/2026-10-19_Lienzo_Modelo_Negocio_v0.1.docx</w:t>
+        <w:t>06_Capitulos/Modelo_Negocio/2026-10-20_Lienzo_Modelo_Negocio_v0.2.docx</w:t>
       </w:r>
       <w:r>
         <w:rPr/>
@@ -7842,7 +7903,7 @@
         <w:rPr/>
         <w:t xml:space="preserve"> datos simulados, fecha 15-dic, D2, D6 y duración de la validación — </w:t>
       </w:r>
-      <w:hyperlink r:id="rId36">
+      <w:hyperlink r:id="rId45">
         <w:r>
           <w:rPr>
             <w:color w:val="B87333"/>
@@ -17696,59 +17757,6 @@
     </w:sectPr>
   </w:body>
 </w:document>
-</file>
-
-<file path=word/comments.xml><?xml version="1.0" encoding="utf-8"?>
-<w:comments xmlns:a="http://schemas.openxmlformats.org/drawingml/2006/main" xmlns:pic="http://schemas.openxmlformats.org/drawingml/2006/picture" xmlns:r="http://schemas.openxmlformats.org/officeDocument/2006/relationships" xmlns:w="http://schemas.openxmlformats.org/wordprocessingml/2006/main" xmlns:wp="http://schemas.openxmlformats.org/drawingml/2006/wordprocessingDrawing" xmlns:mc="http://schemas.openxmlformats.org/markup-compatibility/2006" xmlns:a14="http://schemas.microsoft.com/office/drawing/2010/main" xmlns:w14="http://schemas.microsoft.com/office/word/2010/wordml" xmlns:wpc="http://schemas.microsoft.com/office/word/2010/wordprocessingCanvas">
-  <w:comment w:id="0" w:author="Claude" w:initials="CL" w:date="2026-10-19T15:10:02Z">
-    <w:p>
-      <w:pPr>
-        <w:pStyle w:val="CommentText"/>
-      </w:pPr>
-      <w:r>
-        <w:rPr>
-          <w:rStyle w:val="CommentReference"/>
-        </w:rPr>
-        <w:annotationRef/>
-      </w:r>
-      <w:r>
-        <w:t>Víctor: pendiente de tu decisión o acción.</w:t>
-      </w:r>
-    </w:p>
-  </w:comment>
-  <w:comment w:id="1" w:author="Claude" w:initials="CL" w:date="2026-10-19T15:10:02Z">
-    <w:p>
-      <w:pPr>
-        <w:pStyle w:val="CommentText"/>
-      </w:pPr>
-      <w:r>
-        <w:rPr>
-          <w:rStyle w:val="CommentReference"/>
-        </w:rPr>
-        <w:annotationRef/>
-      </w:r>
-      <w:r>
-        <w:t>Víctor: pendiente de tu decisión o acción.</w:t>
-      </w:r>
-    </w:p>
-  </w:comment>
-  <w:comment w:id="2" w:author="Claude" w:initials="CL" w:date="2026-10-19T15:10:02Z">
-    <w:p>
-      <w:pPr>
-        <w:pStyle w:val="CommentText"/>
-      </w:pPr>
-      <w:r>
-        <w:rPr>
-          <w:rStyle w:val="CommentReference"/>
-        </w:rPr>
-        <w:annotationRef/>
-      </w:r>
-      <w:r>
-        <w:t>Víctor: pendiente de tu decisión o acción.</w:t>
-      </w:r>
-    </w:p>
-  </w:comment>
-</w:comments>
 </file>
 
 <file path=word/footer1.xml><?xml version="1.0" encoding="utf-8"?>

</xml_diff>